<commit_message>
Completed task 1 report writing
</commit_message>
<xml_diff>
--- a/Report.docx
+++ b/Report.docx
@@ -40,6 +40,1014 @@
         </w:rPr>
         <w:t xml:space="preserve"> Assessment</w:t>
       </w:r>
+    </w:p>
+    <w:p>
+      <w:pPr>
+        <w:rPr>
+          <w:rFonts w:ascii="Bahnschrift SemiLight" w:hAnsi="Bahnschrift SemiLight"/>
+        </w:rPr>
+      </w:pPr>
+    </w:p>
+    <w:p>
+      <w:pPr>
+        <w:jc w:val="center"/>
+        <w:rPr>
+          <w:rFonts w:ascii="Bahnschrift SemiLight" w:hAnsi="Bahnschrift SemiLight"/>
+          <w:i/>
+          <w:iCs/>
+          <w:sz w:val="28"/>
+          <w:szCs w:val="28"/>
+        </w:rPr>
+      </w:pPr>
+      <w:r>
+        <w:rPr>
+          <w:rFonts w:ascii="Bahnschrift SemiLight" w:hAnsi="Bahnschrift SemiLight"/>
+          <w:i/>
+          <w:iCs/>
+          <w:sz w:val="28"/>
+          <w:szCs w:val="28"/>
+        </w:rPr>
+        <w:t>TASK 1:</w:t>
+      </w:r>
+    </w:p>
+    <w:p>
+      <w:pPr>
+        <w:rPr>
+          <w:rFonts w:ascii="Bahnschrift SemiLight" w:hAnsi="Bahnschrift SemiLight"/>
+        </w:rPr>
+      </w:pPr>
+      <w:r>
+        <w:rPr>
+          <w:rFonts w:ascii="Bahnschrift SemiLight" w:hAnsi="Bahnschrift SemiLight"/>
+        </w:rPr>
+        <w:t xml:space="preserve">This problem is a case of image recognition and classification. The idea is to construct, evaluate, and optimize a machine learning pipeline that when given a bunch of images the machine will be able to classify each image into their likely respective classes/types of the 8 named; </w:t>
+      </w:r>
+      <w:r>
+        <w:rPr>
+          <w:rFonts w:ascii="Bahnschrift SemiLight" w:hAnsi="Bahnschrift SemiLight"/>
+        </w:rPr>
+        <w:t>CatEye, DogEye, CatFace, DogFace, CatMouth, DogMouth, CatNose, or DogNose</w:t>
+      </w:r>
+      <w:r>
+        <w:rPr>
+          <w:rFonts w:ascii="Bahnschrift SemiLight" w:hAnsi="Bahnschrift SemiLight"/>
+        </w:rPr>
+        <w:t>.</w:t>
+      </w:r>
+      <w:r>
+        <w:rPr>
+          <w:rFonts w:ascii="Bahnschrift SemiLight" w:hAnsi="Bahnschrift SemiLight"/>
+        </w:rPr>
+        <w:t xml:space="preserve"> </w:t>
+      </w:r>
+      <w:r>
+        <w:rPr>
+          <w:rFonts w:ascii="Bahnschrift SemiLight" w:hAnsi="Bahnschrift SemiLight"/>
+        </w:rPr>
+        <w:t>For example, give the machine ten images of a cat’s eye. The optimal result would be the machine correctly classifying all ten of those images as ‘CatEye’.</w:t>
+      </w:r>
+    </w:p>
+    <w:p>
+      <w:pPr>
+        <w:rPr>
+          <w:rFonts w:ascii="Bahnschrift SemiLight" w:hAnsi="Bahnschrift SemiLight"/>
+        </w:rPr>
+      </w:pPr>
+      <w:r>
+        <w:rPr>
+          <w:rFonts w:ascii="Bahnschrift SemiLight" w:hAnsi="Bahnschrift SemiLight"/>
+        </w:rPr>
+        <w:t>I start off by inspecting the structure of the training and test data through Python and Microsoft Excel.</w:t>
+      </w:r>
+      <w:r>
+        <w:rPr>
+          <w:rFonts w:ascii="Bahnschrift SemiLight" w:hAnsi="Bahnschrift SemiLight"/>
+        </w:rPr>
+        <w:t xml:space="preserve"> There are </w:t>
+      </w:r>
+      <w:r>
+        <w:rPr>
+          <w:rFonts w:ascii="Bahnschrift SemiLight" w:hAnsi="Bahnschrift SemiLight"/>
+        </w:rPr>
+        <w:t>63,660 jpg files present inside the training folder and 29,443 jpg files inside the test folder. Simple observation shows nearly all images are of cats and dogs and their various parts like their eyes, nose, and mouth.</w:t>
+      </w:r>
+      <w:r>
+        <w:rPr>
+          <w:rFonts w:ascii="Bahnschrift SemiLight" w:hAnsi="Bahnschrift SemiLight"/>
+        </w:rPr>
+        <w:t xml:space="preserve"> </w:t>
+      </w:r>
+      <w:r>
+        <w:rPr>
+          <w:rFonts w:ascii="Bahnschrift SemiLight" w:hAnsi="Bahnschrift SemiLight"/>
+        </w:rPr>
+        <w:t>The given excel file has just two features, ‘image_id’ and ‘class’, containing the image index ID associated with the training folder’s images and class as the correct class that each image should be of.</w:t>
+      </w:r>
+      <w:r>
+        <w:rPr>
+          <w:rFonts w:ascii="Bahnschrift SemiLight" w:hAnsi="Bahnschrift SemiLight"/>
+        </w:rPr>
+        <w:t xml:space="preserve"> ‘</w:t>
+      </w:r>
+      <w:proofErr w:type="gramStart"/>
+      <w:r>
+        <w:rPr>
+          <w:rFonts w:ascii="Bahnschrift SemiLight" w:hAnsi="Bahnschrift SemiLight"/>
+        </w:rPr>
+        <w:t>image</w:t>
+      </w:r>
+      <w:proofErr w:type="gramEnd"/>
+      <w:r>
+        <w:rPr>
+          <w:rFonts w:ascii="Bahnschrift SemiLight" w:hAnsi="Bahnschrift SemiLight"/>
+        </w:rPr>
+        <w:t>_id’ is a 64-bit integer variable while ‘class’ is a string. This means I will need to encode the class feature into a numerical variable in order for the machine to feasibly use it.</w:t>
+      </w:r>
+    </w:p>
+    <w:p>
+      <w:pPr>
+        <w:rPr>
+          <w:rFonts w:ascii="Bahnschrift SemiLight" w:hAnsi="Bahnschrift SemiLight"/>
+        </w:rPr>
+      </w:pPr>
+      <w:r>
+        <w:rPr>
+          <w:rFonts w:ascii="Bahnschrift SemiLight" w:hAnsi="Bahnschrift SemiLight"/>
+        </w:rPr>
+        <w:t xml:space="preserve">With a simple python </w:t>
+      </w:r>
+      <w:r>
+        <w:rPr>
+          <w:rFonts w:ascii="Bahnschrift SemiLight" w:hAnsi="Bahnschrift SemiLight"/>
+        </w:rPr>
+        <w:t>cell,</w:t>
+      </w:r>
+      <w:r>
+        <w:rPr>
+          <w:rFonts w:ascii="Bahnschrift SemiLight" w:hAnsi="Bahnschrift SemiLight"/>
+        </w:rPr>
+        <w:t xml:space="preserve"> I find the number of images in each class, they are;</w:t>
+      </w:r>
+    </w:p>
+    <w:tbl>
+      <w:tblPr>
+        <w:tblStyle w:val="TableGrid"/>
+        <w:tblW w:w="0" w:type="auto"/>
+        <w:tblLook w:val="04A0" w:firstRow="1" w:lastRow="0" w:firstColumn="1" w:lastColumn="0" w:noHBand="0" w:noVBand="1"/>
+      </w:tblPr>
+      <w:tblGrid>
+        <w:gridCol w:w="3005"/>
+        <w:gridCol w:w="3005"/>
+        <w:gridCol w:w="3006"/>
+      </w:tblGrid>
+      <w:tr>
+        <w:tc>
+          <w:tcPr>
+            <w:tcW w:w="3005" w:type="dxa"/>
+          </w:tcPr>
+          <w:p>
+            <w:pPr>
+              <w:jc w:val="center"/>
+              <w:rPr>
+                <w:rFonts w:ascii="Bahnschrift SemiLight" w:hAnsi="Bahnschrift SemiLight"/>
+                <w:i/>
+                <w:iCs/>
+              </w:rPr>
+            </w:pPr>
+            <w:r>
+              <w:rPr>
+                <w:rFonts w:ascii="Bahnschrift SemiLight" w:hAnsi="Bahnschrift SemiLight"/>
+                <w:i/>
+                <w:iCs/>
+              </w:rPr>
+              <w:t>Class</w:t>
+            </w:r>
+          </w:p>
+        </w:tc>
+        <w:tc>
+          <w:tcPr>
+            <w:tcW w:w="3005" w:type="dxa"/>
+          </w:tcPr>
+          <w:p>
+            <w:pPr>
+              <w:jc w:val="center"/>
+              <w:rPr>
+                <w:rFonts w:ascii="Bahnschrift SemiLight" w:hAnsi="Bahnschrift SemiLight"/>
+                <w:i/>
+                <w:iCs/>
+              </w:rPr>
+            </w:pPr>
+            <w:r>
+              <w:rPr>
+                <w:rFonts w:ascii="Bahnschrift SemiLight" w:hAnsi="Bahnschrift SemiLight"/>
+                <w:i/>
+                <w:iCs/>
+              </w:rPr>
+              <w:t>Image count</w:t>
+            </w:r>
+          </w:p>
+        </w:tc>
+        <w:tc>
+          <w:tcPr>
+            <w:tcW w:w="3006" w:type="dxa"/>
+          </w:tcPr>
+          <w:p>
+            <w:pPr>
+              <w:jc w:val="center"/>
+              <w:rPr>
+                <w:rFonts w:ascii="Bahnschrift SemiLight" w:hAnsi="Bahnschrift SemiLight"/>
+                <w:i/>
+                <w:iCs/>
+              </w:rPr>
+            </w:pPr>
+            <w:r>
+              <w:rPr>
+                <w:rFonts w:ascii="Bahnschrift SemiLight" w:hAnsi="Bahnschrift SemiLight"/>
+                <w:i/>
+                <w:iCs/>
+              </w:rPr>
+              <w:t>Percentage</w:t>
+            </w:r>
+            <w:r>
+              <w:rPr>
+                <w:rFonts w:ascii="Bahnschrift SemiLight" w:hAnsi="Bahnschrift SemiLight"/>
+                <w:i/>
+                <w:iCs/>
+              </w:rPr>
+              <w:t xml:space="preserve"> (%)</w:t>
+            </w:r>
+          </w:p>
+        </w:tc>
+      </w:tr>
+      <w:tr>
+        <w:tc>
+          <w:tcPr>
+            <w:tcW w:w="3005" w:type="dxa"/>
+          </w:tcPr>
+          <w:p>
+            <w:pPr>
+              <w:rPr>
+                <w:rFonts w:ascii="Bahnschrift SemiLight" w:hAnsi="Bahnschrift SemiLight"/>
+              </w:rPr>
+            </w:pPr>
+            <w:r>
+              <w:rPr>
+                <w:rFonts w:ascii="Bahnschrift SemiLight" w:hAnsi="Bahnschrift SemiLight"/>
+              </w:rPr>
+              <w:t>CatEye</w:t>
+            </w:r>
+          </w:p>
+        </w:tc>
+        <w:tc>
+          <w:tcPr>
+            <w:tcW w:w="3005" w:type="dxa"/>
+          </w:tcPr>
+          <w:p>
+            <w:pPr>
+              <w:jc w:val="center"/>
+              <w:rPr>
+                <w:rFonts w:ascii="Bahnschrift SemiLight" w:hAnsi="Bahnschrift SemiLight"/>
+              </w:rPr>
+            </w:pPr>
+            <w:r>
+              <w:rPr>
+                <w:rFonts w:ascii="Bahnschrift SemiLight" w:hAnsi="Bahnschrift SemiLight"/>
+              </w:rPr>
+              <w:t>13,884</w:t>
+            </w:r>
+          </w:p>
+        </w:tc>
+        <w:tc>
+          <w:tcPr>
+            <w:tcW w:w="3006" w:type="dxa"/>
+          </w:tcPr>
+          <w:p>
+            <w:pPr>
+              <w:jc w:val="center"/>
+              <w:rPr>
+                <w:rFonts w:ascii="Bahnschrift SemiLight" w:hAnsi="Bahnschrift SemiLight"/>
+              </w:rPr>
+            </w:pPr>
+            <w:r>
+              <w:rPr>
+                <w:rFonts w:ascii="Bahnschrift SemiLight" w:hAnsi="Bahnschrift SemiLight"/>
+              </w:rPr>
+              <w:t>21.8</w:t>
+            </w:r>
+            <w:r>
+              <w:rPr>
+                <w:rFonts w:ascii="Bahnschrift SemiLight" w:hAnsi="Bahnschrift SemiLight"/>
+              </w:rPr>
+              <w:t>1</w:t>
+            </w:r>
+          </w:p>
+        </w:tc>
+      </w:tr>
+      <w:tr>
+        <w:tc>
+          <w:tcPr>
+            <w:tcW w:w="3005" w:type="dxa"/>
+          </w:tcPr>
+          <w:p>
+            <w:pPr>
+              <w:rPr>
+                <w:rFonts w:ascii="Bahnschrift SemiLight" w:hAnsi="Bahnschrift SemiLight"/>
+              </w:rPr>
+            </w:pPr>
+            <w:r>
+              <w:rPr>
+                <w:rFonts w:ascii="Bahnschrift SemiLight" w:hAnsi="Bahnschrift SemiLight"/>
+              </w:rPr>
+              <w:t>CatFace</w:t>
+            </w:r>
+          </w:p>
+        </w:tc>
+        <w:tc>
+          <w:tcPr>
+            <w:tcW w:w="3005" w:type="dxa"/>
+          </w:tcPr>
+          <w:p>
+            <w:pPr>
+              <w:jc w:val="center"/>
+              <w:rPr>
+                <w:rFonts w:ascii="Bahnschrift SemiLight" w:hAnsi="Bahnschrift SemiLight"/>
+              </w:rPr>
+            </w:pPr>
+            <w:r>
+              <w:rPr>
+                <w:rFonts w:ascii="Bahnschrift SemiLight" w:hAnsi="Bahnschrift SemiLight"/>
+              </w:rPr>
+              <w:t>6,942</w:t>
+            </w:r>
+          </w:p>
+        </w:tc>
+        <w:tc>
+          <w:tcPr>
+            <w:tcW w:w="3006" w:type="dxa"/>
+          </w:tcPr>
+          <w:p>
+            <w:pPr>
+              <w:jc w:val="center"/>
+              <w:rPr>
+                <w:rFonts w:ascii="Bahnschrift SemiLight" w:hAnsi="Bahnschrift SemiLight"/>
+              </w:rPr>
+            </w:pPr>
+            <w:r>
+              <w:rPr>
+                <w:rFonts w:ascii="Bahnschrift SemiLight" w:hAnsi="Bahnschrift SemiLight"/>
+              </w:rPr>
+              <w:t>10.90</w:t>
+            </w:r>
+          </w:p>
+        </w:tc>
+      </w:tr>
+      <w:tr>
+        <w:tc>
+          <w:tcPr>
+            <w:tcW w:w="3005" w:type="dxa"/>
+          </w:tcPr>
+          <w:p>
+            <w:pPr>
+              <w:rPr>
+                <w:rFonts w:ascii="Bahnschrift SemiLight" w:hAnsi="Bahnschrift SemiLight"/>
+              </w:rPr>
+            </w:pPr>
+            <w:r>
+              <w:rPr>
+                <w:rFonts w:ascii="Bahnschrift SemiLight" w:hAnsi="Bahnschrift SemiLight"/>
+              </w:rPr>
+              <w:t>CatMouth</w:t>
+            </w:r>
+          </w:p>
+        </w:tc>
+        <w:tc>
+          <w:tcPr>
+            <w:tcW w:w="3005" w:type="dxa"/>
+          </w:tcPr>
+          <w:p>
+            <w:pPr>
+              <w:jc w:val="center"/>
+              <w:rPr>
+                <w:rFonts w:ascii="Bahnschrift SemiLight" w:hAnsi="Bahnschrift SemiLight"/>
+              </w:rPr>
+            </w:pPr>
+            <w:r>
+              <w:rPr>
+                <w:rFonts w:ascii="Bahnschrift SemiLight" w:hAnsi="Bahnschrift SemiLight"/>
+              </w:rPr>
+              <w:t>6,942</w:t>
+            </w:r>
+          </w:p>
+        </w:tc>
+        <w:tc>
+          <w:tcPr>
+            <w:tcW w:w="3006" w:type="dxa"/>
+          </w:tcPr>
+          <w:p>
+            <w:pPr>
+              <w:jc w:val="center"/>
+              <w:rPr>
+                <w:rFonts w:ascii="Bahnschrift SemiLight" w:hAnsi="Bahnschrift SemiLight"/>
+              </w:rPr>
+            </w:pPr>
+            <w:r>
+              <w:rPr>
+                <w:rFonts w:ascii="Bahnschrift SemiLight" w:hAnsi="Bahnschrift SemiLight"/>
+              </w:rPr>
+              <w:t>10.90</w:t>
+            </w:r>
+          </w:p>
+        </w:tc>
+      </w:tr>
+      <w:tr>
+        <w:tc>
+          <w:tcPr>
+            <w:tcW w:w="3005" w:type="dxa"/>
+          </w:tcPr>
+          <w:p>
+            <w:pPr>
+              <w:rPr>
+                <w:rFonts w:ascii="Bahnschrift SemiLight" w:hAnsi="Bahnschrift SemiLight"/>
+              </w:rPr>
+            </w:pPr>
+            <w:r>
+              <w:rPr>
+                <w:rFonts w:ascii="Bahnschrift SemiLight" w:hAnsi="Bahnschrift SemiLight"/>
+              </w:rPr>
+              <w:t>CatNose</w:t>
+            </w:r>
+          </w:p>
+        </w:tc>
+        <w:tc>
+          <w:tcPr>
+            <w:tcW w:w="3005" w:type="dxa"/>
+          </w:tcPr>
+          <w:p>
+            <w:pPr>
+              <w:jc w:val="center"/>
+              <w:rPr>
+                <w:rFonts w:ascii="Bahnschrift SemiLight" w:hAnsi="Bahnschrift SemiLight"/>
+              </w:rPr>
+            </w:pPr>
+            <w:r>
+              <w:rPr>
+                <w:rFonts w:ascii="Bahnschrift SemiLight" w:hAnsi="Bahnschrift SemiLight"/>
+              </w:rPr>
+              <w:t>6,942</w:t>
+            </w:r>
+          </w:p>
+        </w:tc>
+        <w:tc>
+          <w:tcPr>
+            <w:tcW w:w="3006" w:type="dxa"/>
+          </w:tcPr>
+          <w:p>
+            <w:pPr>
+              <w:jc w:val="center"/>
+              <w:rPr>
+                <w:rFonts w:ascii="Bahnschrift SemiLight" w:hAnsi="Bahnschrift SemiLight"/>
+              </w:rPr>
+            </w:pPr>
+            <w:r>
+              <w:rPr>
+                <w:rFonts w:ascii="Bahnschrift SemiLight" w:hAnsi="Bahnschrift SemiLight"/>
+              </w:rPr>
+              <w:t>10.90</w:t>
+            </w:r>
+          </w:p>
+        </w:tc>
+      </w:tr>
+      <w:tr>
+        <w:tc>
+          <w:tcPr>
+            <w:tcW w:w="3005" w:type="dxa"/>
+          </w:tcPr>
+          <w:p>
+            <w:pPr>
+              <w:rPr>
+                <w:rFonts w:ascii="Bahnschrift SemiLight" w:hAnsi="Bahnschrift SemiLight"/>
+              </w:rPr>
+            </w:pPr>
+            <w:r>
+              <w:rPr>
+                <w:rFonts w:ascii="Bahnschrift SemiLight" w:hAnsi="Bahnschrift SemiLight"/>
+              </w:rPr>
+              <w:t>DogEye</w:t>
+            </w:r>
+          </w:p>
+        </w:tc>
+        <w:tc>
+          <w:tcPr>
+            <w:tcW w:w="3005" w:type="dxa"/>
+          </w:tcPr>
+          <w:p>
+            <w:pPr>
+              <w:jc w:val="center"/>
+              <w:rPr>
+                <w:rFonts w:ascii="Bahnschrift SemiLight" w:hAnsi="Bahnschrift SemiLight"/>
+              </w:rPr>
+            </w:pPr>
+            <w:r>
+              <w:rPr>
+                <w:rFonts w:ascii="Bahnschrift SemiLight" w:hAnsi="Bahnschrift SemiLight"/>
+              </w:rPr>
+              <w:t>11,580</w:t>
+            </w:r>
+          </w:p>
+        </w:tc>
+        <w:tc>
+          <w:tcPr>
+            <w:tcW w:w="3006" w:type="dxa"/>
+          </w:tcPr>
+          <w:p>
+            <w:pPr>
+              <w:jc w:val="center"/>
+              <w:rPr>
+                <w:rFonts w:ascii="Bahnschrift SemiLight" w:hAnsi="Bahnschrift SemiLight"/>
+              </w:rPr>
+            </w:pPr>
+            <w:r>
+              <w:rPr>
+                <w:rFonts w:ascii="Bahnschrift SemiLight" w:hAnsi="Bahnschrift SemiLight"/>
+              </w:rPr>
+              <w:t>18.19</w:t>
+            </w:r>
+          </w:p>
+        </w:tc>
+      </w:tr>
+      <w:tr>
+        <w:tc>
+          <w:tcPr>
+            <w:tcW w:w="3005" w:type="dxa"/>
+          </w:tcPr>
+          <w:p>
+            <w:pPr>
+              <w:rPr>
+                <w:rFonts w:ascii="Bahnschrift SemiLight" w:hAnsi="Bahnschrift SemiLight"/>
+              </w:rPr>
+            </w:pPr>
+            <w:r>
+              <w:rPr>
+                <w:rFonts w:ascii="Bahnschrift SemiLight" w:hAnsi="Bahnschrift SemiLight"/>
+              </w:rPr>
+              <w:t>DogFace</w:t>
+            </w:r>
+          </w:p>
+        </w:tc>
+        <w:tc>
+          <w:tcPr>
+            <w:tcW w:w="3005" w:type="dxa"/>
+          </w:tcPr>
+          <w:p>
+            <w:pPr>
+              <w:jc w:val="center"/>
+              <w:rPr>
+                <w:rFonts w:ascii="Bahnschrift SemiLight" w:hAnsi="Bahnschrift SemiLight"/>
+              </w:rPr>
+            </w:pPr>
+            <w:r>
+              <w:rPr>
+                <w:rFonts w:ascii="Bahnschrift SemiLight" w:hAnsi="Bahnschrift SemiLight"/>
+              </w:rPr>
+              <w:t>5,790</w:t>
+            </w:r>
+          </w:p>
+        </w:tc>
+        <w:tc>
+          <w:tcPr>
+            <w:tcW w:w="3006" w:type="dxa"/>
+          </w:tcPr>
+          <w:p>
+            <w:pPr>
+              <w:jc w:val="center"/>
+              <w:rPr>
+                <w:rFonts w:ascii="Bahnschrift SemiLight" w:hAnsi="Bahnschrift SemiLight"/>
+              </w:rPr>
+            </w:pPr>
+            <w:r>
+              <w:rPr>
+                <w:rFonts w:ascii="Bahnschrift SemiLight" w:hAnsi="Bahnschrift SemiLight"/>
+              </w:rPr>
+              <w:t>9.10</w:t>
+            </w:r>
+          </w:p>
+        </w:tc>
+      </w:tr>
+      <w:tr>
+        <w:tc>
+          <w:tcPr>
+            <w:tcW w:w="3005" w:type="dxa"/>
+          </w:tcPr>
+          <w:p>
+            <w:pPr>
+              <w:rPr>
+                <w:rFonts w:ascii="Bahnschrift SemiLight" w:hAnsi="Bahnschrift SemiLight"/>
+              </w:rPr>
+            </w:pPr>
+            <w:r>
+              <w:rPr>
+                <w:rFonts w:ascii="Bahnschrift SemiLight" w:hAnsi="Bahnschrift SemiLight"/>
+              </w:rPr>
+              <w:t>DogMouth</w:t>
+            </w:r>
+          </w:p>
+        </w:tc>
+        <w:tc>
+          <w:tcPr>
+            <w:tcW w:w="3005" w:type="dxa"/>
+          </w:tcPr>
+          <w:p>
+            <w:pPr>
+              <w:jc w:val="center"/>
+              <w:rPr>
+                <w:rFonts w:ascii="Bahnschrift SemiLight" w:hAnsi="Bahnschrift SemiLight"/>
+              </w:rPr>
+            </w:pPr>
+            <w:r>
+              <w:rPr>
+                <w:rFonts w:ascii="Bahnschrift SemiLight" w:hAnsi="Bahnschrift SemiLight"/>
+              </w:rPr>
+              <w:t>5,790</w:t>
+            </w:r>
+          </w:p>
+        </w:tc>
+        <w:tc>
+          <w:tcPr>
+            <w:tcW w:w="3006" w:type="dxa"/>
+          </w:tcPr>
+          <w:p>
+            <w:pPr>
+              <w:jc w:val="center"/>
+              <w:rPr>
+                <w:rFonts w:ascii="Bahnschrift SemiLight" w:hAnsi="Bahnschrift SemiLight"/>
+              </w:rPr>
+            </w:pPr>
+            <w:r>
+              <w:rPr>
+                <w:rFonts w:ascii="Bahnschrift SemiLight" w:hAnsi="Bahnschrift SemiLight"/>
+              </w:rPr>
+              <w:t>9.10</w:t>
+            </w:r>
+          </w:p>
+        </w:tc>
+      </w:tr>
+      <w:tr>
+        <w:tc>
+          <w:tcPr>
+            <w:tcW w:w="3005" w:type="dxa"/>
+          </w:tcPr>
+          <w:p>
+            <w:pPr>
+              <w:rPr>
+                <w:rFonts w:ascii="Bahnschrift SemiLight" w:hAnsi="Bahnschrift SemiLight"/>
+              </w:rPr>
+            </w:pPr>
+            <w:r>
+              <w:rPr>
+                <w:rFonts w:ascii="Bahnschrift SemiLight" w:hAnsi="Bahnschrift SemiLight"/>
+              </w:rPr>
+              <w:t>DogNose</w:t>
+            </w:r>
+          </w:p>
+        </w:tc>
+        <w:tc>
+          <w:tcPr>
+            <w:tcW w:w="3005" w:type="dxa"/>
+          </w:tcPr>
+          <w:p>
+            <w:pPr>
+              <w:jc w:val="center"/>
+              <w:rPr>
+                <w:rFonts w:ascii="Bahnschrift SemiLight" w:hAnsi="Bahnschrift SemiLight"/>
+              </w:rPr>
+            </w:pPr>
+            <w:r>
+              <w:rPr>
+                <w:rFonts w:ascii="Bahnschrift SemiLight" w:hAnsi="Bahnschrift SemiLight"/>
+              </w:rPr>
+              <w:t>5,790</w:t>
+            </w:r>
+          </w:p>
+        </w:tc>
+        <w:tc>
+          <w:tcPr>
+            <w:tcW w:w="3006" w:type="dxa"/>
+          </w:tcPr>
+          <w:p>
+            <w:pPr>
+              <w:jc w:val="center"/>
+              <w:rPr>
+                <w:rFonts w:ascii="Bahnschrift SemiLight" w:hAnsi="Bahnschrift SemiLight"/>
+              </w:rPr>
+            </w:pPr>
+            <w:r>
+              <w:rPr>
+                <w:rFonts w:ascii="Bahnschrift SemiLight" w:hAnsi="Bahnschrift SemiLight"/>
+              </w:rPr>
+              <w:t>9.10</w:t>
+            </w:r>
+          </w:p>
+        </w:tc>
+      </w:tr>
+    </w:tbl>
+    <w:p>
+      <w:pPr>
+        <w:rPr>
+          <w:rFonts w:ascii="Bahnschrift SemiLight" w:hAnsi="Bahnschrift SemiLight"/>
+        </w:rPr>
+      </w:pPr>
+      <w:r>
+        <w:rPr>
+          <w:rFonts w:ascii="Bahnschrift SemiLight" w:hAnsi="Bahnschrift SemiLight"/>
+        </w:rPr>
+        <w:t>So, it seems we have a class representation imbalance</w:t>
+      </w:r>
+      <w:r>
+        <w:rPr>
+          <w:rFonts w:ascii="Bahnschrift SemiLight" w:hAnsi="Bahnschrift SemiLight"/>
+        </w:rPr>
+        <w:t xml:space="preserve">. </w:t>
+      </w:r>
+      <w:r>
+        <w:rPr>
+          <w:rFonts w:ascii="Bahnschrift SemiLight" w:hAnsi="Bahnschrift SemiLight"/>
+        </w:rPr>
+        <w:t>CatEye and DogEye are easily the most represented class out of all classes, skewing representation in their favour when compared to smaller classes like DogNose and such.</w:t>
+      </w:r>
+      <w:r>
+        <w:rPr>
+          <w:rFonts w:ascii="Bahnschrift SemiLight" w:hAnsi="Bahnschrift SemiLight"/>
+        </w:rPr>
+        <w:t xml:space="preserve"> This will need to be address.</w:t>
+      </w:r>
+    </w:p>
+    <w:p>
+      <w:pPr>
+        <w:rPr>
+          <w:rFonts w:ascii="Bahnschrift SemiLight" w:hAnsi="Bahnschrift SemiLight"/>
+        </w:rPr>
+      </w:pPr>
+      <w:r>
+        <w:rPr>
+          <w:rFonts w:ascii="Bahnschrift SemiLight" w:hAnsi="Bahnschrift SemiLight"/>
+        </w:rPr>
+        <w:br w:type="page"/>
+      </w:r>
+    </w:p>
+    <w:p>
+      <w:pPr>
+        <w:rPr>
+          <w:rFonts w:ascii="Bahnschrift SemiLight" w:hAnsi="Bahnschrift SemiLight"/>
+        </w:rPr>
+      </w:pPr>
+      <w:r>
+        <w:rPr>
+          <w:rFonts w:ascii="Bahnschrift SemiLight" w:hAnsi="Bahnschrift SemiLight"/>
+        </w:rPr>
+        <w:lastRenderedPageBreak/>
+        <w:t>Next, representative sample images were generated with Python of each class and their corresponding image. For simplicity I decided to use the very first image of each class be their representative.</w:t>
+      </w:r>
+      <w:r>
+        <w:rPr>
+          <w:rFonts w:ascii="Bahnschrift SemiLight" w:hAnsi="Bahnschrift SemiLight"/>
+        </w:rPr>
+        <w:t xml:space="preserve"> Please see the image below:</w:t>
+      </w:r>
+    </w:p>
+    <w:p>
+      <w:pPr>
+        <w:rPr>
+          <w:rFonts w:ascii="Bahnschrift SemiLight" w:hAnsi="Bahnschrift SemiLight"/>
+        </w:rPr>
+      </w:pPr>
+      <w:r>
+        <w:rPr>
+          <w:rFonts w:ascii="Bahnschrift SemiLight" w:hAnsi="Bahnschrift SemiLight"/>
+        </w:rPr>
+        <w:drawing>
+          <wp:inline distT="0" distB="0" distL="0" distR="0" wp14:anchorId="2ED2E8A3" wp14:editId="30747B7F">
+            <wp:extent cx="6031358" cy="3116580"/>
+            <wp:effectExtent l="0" t="0" r="7620" b="7620"/>
+            <wp:docPr id="241436635" name="Picture 1"/>
+            <wp:cNvGraphicFramePr>
+              <a:graphicFrameLocks xmlns:a="http://schemas.openxmlformats.org/drawingml/2006/main" noChangeAspect="1"/>
+            </wp:cNvGraphicFramePr>
+            <a:graphic xmlns:a="http://schemas.openxmlformats.org/drawingml/2006/main">
+              <a:graphicData uri="http://schemas.openxmlformats.org/drawingml/2006/picture">
+                <pic:pic xmlns:pic="http://schemas.openxmlformats.org/drawingml/2006/picture">
+                  <pic:nvPicPr>
+                    <pic:cNvPr id="241436635" name=""/>
+                    <pic:cNvPicPr/>
+                  </pic:nvPicPr>
+                  <pic:blipFill>
+                    <a:blip r:embed="rId4"/>
+                    <a:stretch>
+                      <a:fillRect/>
+                    </a:stretch>
+                  </pic:blipFill>
+                  <pic:spPr>
+                    <a:xfrm>
+                      <a:off x="0" y="0"/>
+                      <a:ext cx="6046794" cy="3124556"/>
+                    </a:xfrm>
+                    <a:prstGeom prst="rect">
+                      <a:avLst/>
+                    </a:prstGeom>
+                  </pic:spPr>
+                </pic:pic>
+              </a:graphicData>
+            </a:graphic>
+          </wp:inline>
+        </w:drawing>
+      </w:r>
+    </w:p>
+    <w:p>
+      <w:pPr>
+        <w:rPr>
+          <w:rFonts w:ascii="Bahnschrift SemiLight" w:hAnsi="Bahnschrift SemiLight"/>
+        </w:rPr>
+      </w:pPr>
+    </w:p>
+    <w:p>
+      <w:pPr>
+        <w:rPr>
+          <w:rFonts w:ascii="Bahnschrift SemiLight" w:hAnsi="Bahnschrift SemiLight"/>
+        </w:rPr>
+      </w:pPr>
+      <w:r>
+        <w:rPr>
+          <w:rFonts w:ascii="Bahnschrift SemiLight" w:hAnsi="Bahnschrift SemiLight"/>
+        </w:rPr>
+        <w:t xml:space="preserve">I performed both manual and code checks to inspect the images and their properties. Manual review reveals significant differences throughout image resolutions; this will be address later. With code it was also revealed that </w:t>
+      </w:r>
+      <w:r>
+        <w:rPr>
+          <w:rFonts w:ascii="Bahnschrift SemiLight" w:hAnsi="Bahnschrift SemiLight"/>
+        </w:rPr>
+        <w:t>there were no corrupted images as far as I am aware (Python checked and could read every image fine), there were unfortunately duplicate</w:t>
+      </w:r>
+      <w:r>
+        <w:rPr>
+          <w:rFonts w:ascii="Bahnschrift SemiLight" w:hAnsi="Bahnschrift SemiLight"/>
+        </w:rPr>
+        <w:t xml:space="preserve"> images present (for example, training images 00356.jpg and 06903.jpg are exactly identical).</w:t>
+      </w:r>
+      <w:r>
+        <w:rPr>
+          <w:rFonts w:ascii="Bahnschrift SemiLight" w:hAnsi="Bahnschrift SemiLight"/>
+        </w:rPr>
+        <w:t xml:space="preserve"> To preserve the complete database and training files I decided it would be best to only remove the duplicates and their associated labels in the database in only local memory in each Kernel, thus I will do so by code, there are only 15 duplicates so the training integrity should remain okay.</w:t>
+      </w:r>
+      <w:r>
+        <w:rPr>
+          <w:rFonts w:ascii="Bahnschrift SemiLight" w:hAnsi="Bahnschrift SemiLight"/>
+        </w:rPr>
+        <w:t xml:space="preserve"> Checking blurriness in an image is a bit of a pain so I opted for a surface level manual check, I generally found most images to be not blurry but did find one image 07413.jpg to be a bit blurry, we can conclude blurriness is present but roughly not a majority nor a significant portion of the population</w:t>
+      </w:r>
+      <w:r>
+        <w:rPr>
+          <w:rFonts w:ascii="Bahnschrift SemiLight" w:hAnsi="Bahnschrift SemiLight"/>
+        </w:rPr>
+        <w:t xml:space="preserve"> (Please see the image below for image 07413.jpg).</w:t>
+      </w:r>
+      <w:r>
+        <w:rPr>
+          <w:rFonts w:ascii="Bahnschrift SemiLight" w:hAnsi="Bahnschrift SemiLight"/>
+        </w:rPr>
+        <w:t xml:space="preserve"> As for unclear class boundaries a surface level manual check was done, images looked good did not find an unclear one</w:t>
+      </w:r>
+      <w:r>
+        <w:rPr>
+          <w:rFonts w:ascii="Bahnschrift SemiLight" w:hAnsi="Bahnschrift SemiLight"/>
+        </w:rPr>
+        <w:t>, cannot conclude all images are okay but automatic tests in Python is tricky.</w:t>
+      </w:r>
+    </w:p>
+    <w:p>
+      <w:pPr>
+        <w:rPr>
+          <w:rFonts w:ascii="Bahnschrift SemiLight" w:hAnsi="Bahnschrift SemiLight"/>
+        </w:rPr>
+      </w:pPr>
+      <w:r>
+        <w:rPr>
+          <w:noProof/>
+        </w:rPr>
+        <w:drawing>
+          <wp:inline distT="0" distB="0" distL="0" distR="0" wp14:anchorId="7AEE28F0" wp14:editId="49712C56">
+            <wp:extent cx="1318260" cy="937260"/>
+            <wp:effectExtent l="0" t="0" r="0" b="0"/>
+            <wp:docPr id="1052438663" name="Picture 1"/>
+            <wp:cNvGraphicFramePr>
+              <a:graphicFrameLocks xmlns:a="http://schemas.openxmlformats.org/drawingml/2006/main" noChangeAspect="1"/>
+            </wp:cNvGraphicFramePr>
+            <a:graphic xmlns:a="http://schemas.openxmlformats.org/drawingml/2006/main">
+              <a:graphicData uri="http://schemas.openxmlformats.org/drawingml/2006/picture">
+                <pic:pic xmlns:pic="http://schemas.openxmlformats.org/drawingml/2006/picture">
+                  <pic:nvPicPr>
+                    <pic:cNvPr id="0" name="Picture 1"/>
+                    <pic:cNvPicPr>
+                      <a:picLocks noChangeAspect="1" noChangeArrowheads="1"/>
+                    </pic:cNvPicPr>
+                  </pic:nvPicPr>
+                  <pic:blipFill>
+                    <a:blip r:embed="rId5">
+                      <a:extLst>
+                        <a:ext uri="{28A0092B-C50C-407E-A947-70E740481C1C}">
+                          <a14:useLocalDpi xmlns:a14="http://schemas.microsoft.com/office/drawing/2010/main" val="0"/>
+                        </a:ext>
+                      </a:extLst>
+                    </a:blip>
+                    <a:srcRect/>
+                    <a:stretch>
+                      <a:fillRect/>
+                    </a:stretch>
+                  </pic:blipFill>
+                  <pic:spPr bwMode="auto">
+                    <a:xfrm>
+                      <a:off x="0" y="0"/>
+                      <a:ext cx="1318260" cy="937260"/>
+                    </a:xfrm>
+                    <a:prstGeom prst="rect">
+                      <a:avLst/>
+                    </a:prstGeom>
+                    <a:noFill/>
+                    <a:ln>
+                      <a:noFill/>
+                    </a:ln>
+                  </pic:spPr>
+                </pic:pic>
+              </a:graphicData>
+            </a:graphic>
+          </wp:inline>
+        </w:drawing>
+      </w:r>
+    </w:p>
+    <w:p>
+      <w:pPr>
+        <w:rPr>
+          <w:rFonts w:ascii="Bahnschrift SemiLight" w:hAnsi="Bahnschrift SemiLight"/>
+        </w:rPr>
+      </w:pPr>
+      <w:r>
+        <w:rPr>
+          <w:rFonts w:ascii="Bahnschrift SemiLight" w:hAnsi="Bahnschrift SemiLight"/>
+        </w:rPr>
+        <w:lastRenderedPageBreak/>
+        <w:t>My plan is to split the training images into 80/20, 80% of the images and labels to train and 20% to test to evaluate the performance</w:t>
+      </w:r>
+      <w:r>
+        <w:rPr>
+          <w:rFonts w:ascii="Bahnschrift SemiLight" w:hAnsi="Bahnschrift SemiLight"/>
+        </w:rPr>
+        <w:t xml:space="preserve"> on how well it did. I may then optimize the model for accuracy as that the is Kaggle competition’s measured metric, then I will use the model on the test image set to generate a corresponding submission database to submit.</w:t>
+      </w:r>
+    </w:p>
+    <w:p>
+      <w:pPr>
+        <w:rPr>
+          <w:rFonts w:ascii="Bahnschrift SemiLight" w:hAnsi="Bahnschrift SemiLight"/>
+        </w:rPr>
+      </w:pPr>
+    </w:p>
+    <w:p>
+      <w:pPr>
+        <w:jc w:val="center"/>
+        <w:rPr>
+          <w:rFonts w:ascii="Bahnschrift SemiLight" w:hAnsi="Bahnschrift SemiLight"/>
+          <w:sz w:val="28"/>
+          <w:szCs w:val="28"/>
+        </w:rPr>
+      </w:pPr>
+      <w:r>
+        <w:rPr>
+          <w:rFonts w:ascii="Bahnschrift SemiLight" w:hAnsi="Bahnschrift SemiLight"/>
+          <w:sz w:val="28"/>
+          <w:szCs w:val="28"/>
+        </w:rPr>
+        <w:t>TASK 2:</w:t>
+      </w:r>
+    </w:p>
+    <w:p>
+      <w:pPr>
+        <w:rPr>
+          <w:rFonts w:ascii="Bahnschrift SemiLight" w:hAnsi="Bahnschrift SemiLight"/>
+        </w:rPr>
+      </w:pPr>
+    </w:p>
+    <w:p>
+      <w:pPr>
+        <w:rPr>
+          <w:rFonts w:ascii="Bahnschrift SemiLight" w:hAnsi="Bahnschrift SemiLight"/>
+        </w:rPr>
+      </w:pPr>
+    </w:p>
+    <w:p>
+      <w:pPr>
+        <w:rPr>
+          <w:rFonts w:ascii="Bahnschrift SemiLight" w:hAnsi="Bahnschrift SemiLight"/>
+        </w:rPr>
+      </w:pPr>
     </w:p>
     <w:p>
       <w:pPr>
@@ -1044,6 +2052,25 @@
       <w:spacing w:val="5"/>
     </w:rPr>
   </w:style>
+  <w:style w:type="table" w:styleId="TableGrid">
+    <w:name w:val="Table Grid"/>
+    <w:basedOn w:val="TableNormal"/>
+    <w:uiPriority w:val="39"/>
+    <w:rsid w:val="006E0787"/>
+    <w:pPr>
+      <w:spacing w:after="0" w:line="240" w:lineRule="auto"/>
+    </w:pPr>
+    <w:tblPr>
+      <w:tblBorders>
+        <w:top w:val="single" w:sz="4" w:space="0" w:color="auto"/>
+        <w:left w:val="single" w:sz="4" w:space="0" w:color="auto"/>
+        <w:bottom w:val="single" w:sz="4" w:space="0" w:color="auto"/>
+        <w:right w:val="single" w:sz="4" w:space="0" w:color="auto"/>
+        <w:insideH w:val="single" w:sz="4" w:space="0" w:color="auto"/>
+        <w:insideV w:val="single" w:sz="4" w:space="0" w:color="auto"/>
+      </w:tblBorders>
+    </w:tblPr>
+  </w:style>
 </w:styles>
 </file>
 

</xml_diff>

<commit_message>
Completed task 2 + 3, working on 4, added features to notebook
Notebook additions: image duplication detection + local memory removal + graph generation for fitting and paste
</commit_message>
<xml_diff>
--- a/Report.docx
+++ b/Report.docx
@@ -47,6 +47,43 @@
           <w:rFonts w:ascii="Bahnschrift SemiLight" w:hAnsi="Bahnschrift SemiLight"/>
         </w:rPr>
       </w:pPr>
+      <w:r>
+        <w:rPr>
+          <w:rFonts w:ascii="Bahnschrift SemiLight" w:hAnsi="Bahnschrift SemiLight"/>
+        </w:rPr>
+        <w:t xml:space="preserve">Kaggle username: </w:t>
+      </w:r>
+      <w:r>
+        <w:rPr>
+          <w:rFonts w:ascii="Bahnschrift SemiLight" w:hAnsi="Bahnschrift SemiLight"/>
+        </w:rPr>
+        <w:t>huyinsong</w:t>
+      </w:r>
+      <w:r>
+        <w:rPr>
+          <w:rFonts w:ascii="Bahnschrift SemiLight" w:hAnsi="Bahnschrift SemiLight"/>
+        </w:rPr>
+        <w:t xml:space="preserve"> (</w:t>
+      </w:r>
+      <w:r>
+        <w:rPr>
+          <w:rFonts w:ascii="Bahnschrift SemiLight" w:hAnsi="Bahnschrift SemiLight"/>
+        </w:rPr>
+        <w:t>Huyin Song</w:t>
+      </w:r>
+      <w:r>
+        <w:rPr>
+          <w:rFonts w:ascii="Bahnschrift SemiLight" w:hAnsi="Bahnschrift SemiLight"/>
+        </w:rPr>
+        <w:t>)</w:t>
+      </w:r>
+    </w:p>
+    <w:p>
+      <w:pPr>
+        <w:rPr>
+          <w:rFonts w:ascii="Bahnschrift SemiLight" w:hAnsi="Bahnschrift SemiLight"/>
+        </w:rPr>
+      </w:pPr>
     </w:p>
     <w:p>
       <w:pPr>
@@ -147,21 +184,7 @@
         <w:rPr>
           <w:rFonts w:ascii="Bahnschrift SemiLight" w:hAnsi="Bahnschrift SemiLight"/>
         </w:rPr>
-        <w:t xml:space="preserve"> ‘</w:t>
-      </w:r>
-      <w:proofErr w:type="gramStart"/>
-      <w:r>
-        <w:rPr>
-          <w:rFonts w:ascii="Bahnschrift SemiLight" w:hAnsi="Bahnschrift SemiLight"/>
-        </w:rPr>
-        <w:t>image</w:t>
-      </w:r>
-      <w:proofErr w:type="gramEnd"/>
-      <w:r>
-        <w:rPr>
-          <w:rFonts w:ascii="Bahnschrift SemiLight" w:hAnsi="Bahnschrift SemiLight"/>
-        </w:rPr>
-        <w:t>_id’ is a 64-bit integer variable while ‘class’ is a string. This means I will need to encode the class feature into a numerical variable in order for the machine to feasibly use it.</w:t>
+        <w:t xml:space="preserve"> ‘image_id’ is a 64-bit integer variable while ‘class’ is a string. This means I will need to encode the class feature into a numerical variable in order for the machine to feasibly use it.</w:t>
       </w:r>
     </w:p>
     <w:p>
@@ -823,6 +846,7 @@
       <w:r>
         <w:rPr>
           <w:rFonts w:ascii="Bahnschrift SemiLight" w:hAnsi="Bahnschrift SemiLight"/>
+          <w:noProof/>
         </w:rPr>
         <w:drawing>
           <wp:inline distT="0" distB="0" distL="0" distR="0" wp14:anchorId="2ED2E8A3" wp14:editId="30747B7F">
@@ -1015,6 +1039,8 @@
         <w:jc w:val="center"/>
         <w:rPr>
           <w:rFonts w:ascii="Bahnschrift SemiLight" w:hAnsi="Bahnschrift SemiLight"/>
+          <w:i/>
+          <w:iCs/>
           <w:sz w:val="28"/>
           <w:szCs w:val="28"/>
         </w:rPr>
@@ -1022,6 +1048,8 @@
       <w:r>
         <w:rPr>
           <w:rFonts w:ascii="Bahnschrift SemiLight" w:hAnsi="Bahnschrift SemiLight"/>
+          <w:i/>
+          <w:iCs/>
           <w:sz w:val="28"/>
           <w:szCs w:val="28"/>
         </w:rPr>
@@ -1034,48 +1062,760 @@
           <w:rFonts w:ascii="Bahnschrift SemiLight" w:hAnsi="Bahnschrift SemiLight"/>
         </w:rPr>
       </w:pPr>
-    </w:p>
-    <w:p>
-      <w:pPr>
-        <w:rPr>
-          <w:rFonts w:ascii="Bahnschrift SemiLight" w:hAnsi="Bahnschrift SemiLight"/>
-        </w:rPr>
-      </w:pPr>
-    </w:p>
-    <w:p>
-      <w:pPr>
-        <w:rPr>
-          <w:rFonts w:ascii="Bahnschrift SemiLight" w:hAnsi="Bahnschrift SemiLight"/>
-        </w:rPr>
-      </w:pPr>
-    </w:p>
-    <w:p>
-      <w:pPr>
-        <w:rPr>
-          <w:rFonts w:ascii="Bahnschrift SemiLight" w:hAnsi="Bahnschrift SemiLight"/>
-        </w:rPr>
-      </w:pPr>
-    </w:p>
-    <w:p>
-      <w:pPr>
-        <w:rPr>
-          <w:rFonts w:ascii="Bahnschrift SemiLight" w:hAnsi="Bahnschrift SemiLight"/>
-        </w:rPr>
-      </w:pPr>
-    </w:p>
-    <w:p>
-      <w:pPr>
-        <w:rPr>
-          <w:rFonts w:ascii="Bahnschrift SemiLight" w:hAnsi="Bahnschrift SemiLight"/>
-        </w:rPr>
-      </w:pPr>
-    </w:p>
-    <w:p>
-      <w:pPr>
-        <w:rPr>
-          <w:rFonts w:ascii="Bahnschrift SemiLight" w:hAnsi="Bahnschrift SemiLight"/>
-        </w:rPr>
-      </w:pPr>
+      <w:r>
+        <w:rPr>
+          <w:rFonts w:ascii="Bahnschrift SemiLight" w:hAnsi="Bahnschrift SemiLight"/>
+        </w:rPr>
+        <w:t>To address the variance in image sizes and resolutions, I have decided to shrink or scale larger or smaller images to 128 x 128 pixels. I handled this with the transforms Resize and ToTensor functions</w:t>
+      </w:r>
+      <w:r>
+        <w:rPr>
+          <w:rFonts w:ascii="Bahnschrift SemiLight" w:hAnsi="Bahnschrift SemiLight"/>
+        </w:rPr>
+        <w:t xml:space="preserve"> which </w:t>
+      </w:r>
+      <w:r>
+        <w:rPr>
+          <w:rFonts w:ascii="Bahnschrift SemiLight" w:hAnsi="Bahnschrift SemiLight"/>
+        </w:rPr>
+        <w:t xml:space="preserve">should be hopefully </w:t>
+      </w:r>
+      <w:r>
+        <w:rPr>
+          <w:rFonts w:ascii="Bahnschrift SemiLight" w:hAnsi="Bahnschrift SemiLight"/>
+        </w:rPr>
+        <w:t>sufficient.</w:t>
+      </w:r>
+      <w:r>
+        <w:rPr>
+          <w:rFonts w:ascii="Bahnschrift SemiLight" w:hAnsi="Bahnschrift SemiLight"/>
+        </w:rPr>
+        <w:t xml:space="preserve"> </w:t>
+      </w:r>
+      <w:r>
+        <w:rPr>
+          <w:rFonts w:ascii="Bahnschrift SemiLight" w:hAnsi="Bahnschrift SemiLight"/>
+        </w:rPr>
+        <w:t>Furthermore, Transforms also gave me the ability to implement a RandomHorizontalFlip and RandomRotation to which I set to 10 degrees and p=0.5, which should sometimes introduce more variance into the training data to better generalize the model.</w:t>
+      </w:r>
+      <w:r>
+        <w:rPr>
+          <w:rFonts w:ascii="Bahnschrift SemiLight" w:hAnsi="Bahnschrift SemiLight"/>
+        </w:rPr>
+        <w:t xml:space="preserve"> I specifically did this in the local </w:t>
+      </w:r>
+      <w:r>
+        <w:rPr>
+          <w:rFonts w:ascii="Bahnschrift SemiLight" w:hAnsi="Bahnschrift SemiLight"/>
+        </w:rPr>
+        <w:t>memory;</w:t>
+      </w:r>
+      <w:r>
+        <w:rPr>
+          <w:rFonts w:ascii="Bahnschrift SemiLight" w:hAnsi="Bahnschrift SemiLight"/>
+        </w:rPr>
+        <w:t xml:space="preserve"> the original image set is untouched and is only temporary in each Kernel run.</w:t>
+      </w:r>
+    </w:p>
+    <w:p>
+      <w:pPr>
+        <w:rPr>
+          <w:rFonts w:ascii="Bahnschrift SemiLight" w:hAnsi="Bahnschrift SemiLight"/>
+        </w:rPr>
+      </w:pPr>
+      <w:r>
+        <w:rPr>
+          <w:rFonts w:ascii="Bahnschrift SemiLight" w:hAnsi="Bahnschrift SemiLight"/>
+        </w:rPr>
+        <w:t>Next,</w:t>
+      </w:r>
+      <w:r>
+        <w:rPr>
+          <w:rFonts w:ascii="Bahnschrift SemiLight" w:hAnsi="Bahnschrift SemiLight"/>
+        </w:rPr>
+        <w:t xml:space="preserve"> I mapped the either different string labels to integer values from 0 to 7 whi</w:t>
+      </w:r>
+      <w:r>
+        <w:rPr>
+          <w:rFonts w:ascii="Bahnschrift SemiLight" w:hAnsi="Bahnschrift SemiLight"/>
+        </w:rPr>
+        <w:t xml:space="preserve">ch logically is sufficient and would not cause errors. </w:t>
+      </w:r>
+      <w:r>
+        <w:rPr>
+          <w:rFonts w:ascii="Bahnschrift SemiLight" w:hAnsi="Bahnschrift SemiLight"/>
+        </w:rPr>
+        <w:t>They are clear and distinct.</w:t>
+      </w:r>
+    </w:p>
+    <w:p>
+      <w:pPr>
+        <w:rPr>
+          <w:rFonts w:ascii="Bahnschrift SemiLight" w:hAnsi="Bahnschrift SemiLight"/>
+        </w:rPr>
+      </w:pPr>
+      <w:r>
+        <w:rPr>
+          <w:rFonts w:ascii="Bahnschrift SemiLight" w:hAnsi="Bahnschrift SemiLight"/>
+        </w:rPr>
+        <w:t xml:space="preserve">To ensure efficient data loading as we have quite a number of records and </w:t>
+      </w:r>
+      <w:r>
+        <w:rPr>
+          <w:rFonts w:ascii="Bahnschrift SemiLight" w:hAnsi="Bahnschrift SemiLight"/>
+        </w:rPr>
+        <w:t>images,</w:t>
+      </w:r>
+      <w:r>
+        <w:rPr>
+          <w:rFonts w:ascii="Bahnschrift SemiLight" w:hAnsi="Bahnschrift SemiLight"/>
+        </w:rPr>
+        <w:t xml:space="preserve"> I used a dataloader objects with a batch size of 64</w:t>
+      </w:r>
+      <w:r>
+        <w:rPr>
+          <w:rFonts w:ascii="Bahnschrift SemiLight" w:hAnsi="Bahnschrift SemiLight"/>
+        </w:rPr>
+        <w:t xml:space="preserve"> giving me 796 training batches as well as 199 validation batches after the 80/20 training split</w:t>
+      </w:r>
+      <w:r>
+        <w:rPr>
+          <w:rFonts w:ascii="Bahnschrift SemiLight" w:hAnsi="Bahnschrift SemiLight"/>
+        </w:rPr>
+        <w:t xml:space="preserve"> (seed of 42 to maintain reproducibility).</w:t>
+      </w:r>
+      <w:r>
+        <w:rPr>
+          <w:rFonts w:ascii="Bahnschrift SemiLight" w:hAnsi="Bahnschrift SemiLight"/>
+        </w:rPr>
+        <w:t xml:space="preserve"> This should keep the data loading controllable and efficient.</w:t>
+      </w:r>
+    </w:p>
+    <w:p>
+      <w:pPr>
+        <w:rPr>
+          <w:rFonts w:ascii="Bahnschrift SemiLight" w:hAnsi="Bahnschrift SemiLight"/>
+        </w:rPr>
+      </w:pPr>
+      <w:r>
+        <w:rPr>
+          <w:rFonts w:ascii="Bahnschrift SemiLight" w:hAnsi="Bahnschrift SemiLight"/>
+        </w:rPr>
+        <w:t>As for avoiding data leakage, I have tried to keep it contained and are unaware of any leakages, I will update this report if I find any.</w:t>
+      </w:r>
+    </w:p>
+    <w:p>
+      <w:pPr>
+        <w:rPr>
+          <w:rFonts w:ascii="Bahnschrift SemiLight" w:hAnsi="Bahnschrift SemiLight"/>
+        </w:rPr>
+      </w:pPr>
+    </w:p>
+    <w:p>
+      <w:pPr>
+        <w:jc w:val="center"/>
+        <w:rPr>
+          <w:rFonts w:ascii="Bahnschrift SemiLight" w:hAnsi="Bahnschrift SemiLight"/>
+          <w:i/>
+          <w:iCs/>
+          <w:sz w:val="28"/>
+          <w:szCs w:val="28"/>
+        </w:rPr>
+      </w:pPr>
+      <w:r>
+        <w:rPr>
+          <w:rFonts w:ascii="Bahnschrift SemiLight" w:hAnsi="Bahnschrift SemiLight"/>
+          <w:i/>
+          <w:iCs/>
+          <w:sz w:val="28"/>
+          <w:szCs w:val="28"/>
+        </w:rPr>
+        <w:t>TASK 3:</w:t>
+      </w:r>
+    </w:p>
+    <w:p>
+      <w:pPr>
+        <w:rPr>
+          <w:rFonts w:ascii="Bahnschrift SemiLight" w:hAnsi="Bahnschrift SemiLight"/>
+        </w:rPr>
+      </w:pPr>
+      <w:r>
+        <w:rPr>
+          <w:rFonts w:ascii="Bahnschrift SemiLight" w:hAnsi="Bahnschrift SemiLight"/>
+        </w:rPr>
+        <w:t>I chose to use a custom CNN architecture model for this application. I reasoned it was suitable because CNNs were designed to handle digital images in image classification which is exactly what I need. Furthermore, it handles computational resource efficiently and can be shaped to match whatever custom needs I need (cat and dog classification for example).</w:t>
+      </w:r>
+    </w:p>
+    <w:p>
+      <w:pPr>
+        <w:rPr>
+          <w:rFonts w:ascii="Bahnschrift SemiLight" w:hAnsi="Bahnschrift SemiLight"/>
+        </w:rPr>
+      </w:pPr>
+      <w:r>
+        <w:rPr>
+          <w:rFonts w:ascii="Bahnschrift SemiLight" w:hAnsi="Bahnschrift SemiLight"/>
+        </w:rPr>
+        <w:t xml:space="preserve">To briefly describe the architecture and components; I pass it the 128 x 128 </w:t>
+      </w:r>
+      <w:r>
+        <w:rPr>
+          <w:rFonts w:ascii="Bahnschrift SemiLight" w:hAnsi="Bahnschrift SemiLight"/>
+        </w:rPr>
+        <w:t xml:space="preserve">pixel </w:t>
+      </w:r>
+      <w:r>
+        <w:rPr>
+          <w:rFonts w:ascii="Bahnschrift SemiLight" w:hAnsi="Bahnschrift SemiLight"/>
+        </w:rPr>
+        <w:t>RGB image of what I need classified</w:t>
+      </w:r>
+      <w:r>
+        <w:rPr>
+          <w:rFonts w:ascii="Bahnschrift SemiLight" w:hAnsi="Bahnschrift SemiLight"/>
+        </w:rPr>
+        <w:t xml:space="preserve"> in the Input layer</w:t>
+      </w:r>
+      <w:r>
+        <w:rPr>
+          <w:rFonts w:ascii="Bahnschrift SemiLight" w:hAnsi="Bahnschrift SemiLight"/>
+        </w:rPr>
+        <w:t xml:space="preserve">, the convolutional layer is </w:t>
+      </w:r>
+      <w:r>
+        <w:rPr>
+          <w:rFonts w:ascii="Bahnschrift SemiLight" w:hAnsi="Bahnschrift SemiLight"/>
+        </w:rPr>
+        <w:t>next</w:t>
+      </w:r>
+      <w:r>
+        <w:rPr>
+          <w:rFonts w:ascii="Bahnschrift SemiLight" w:hAnsi="Bahnschrift SemiLight"/>
+        </w:rPr>
+        <w:t xml:space="preserve"> up and detects basic patterns in the image such as the colours, edges, and textures.</w:t>
+      </w:r>
+      <w:r>
+        <w:rPr>
+          <w:rFonts w:ascii="Bahnschrift SemiLight" w:hAnsi="Bahnschrift SemiLight"/>
+        </w:rPr>
+        <w:t xml:space="preserve"> Next it goes to the Activation ReLU function where CNN learns complex patterns of the image that couldn’t be captured with just the Convolutional layer.</w:t>
+      </w:r>
+      <w:r>
+        <w:rPr>
+          <w:rFonts w:ascii="Bahnschrift SemiLight" w:hAnsi="Bahnschrift SemiLight"/>
+        </w:rPr>
+        <w:t xml:space="preserve"> Next is the Pooling layer where we apply Max Pooling, basically reducing the special </w:t>
+      </w:r>
+      <w:r>
+        <w:rPr>
+          <w:rFonts w:ascii="Bahnschrift SemiLight" w:hAnsi="Bahnschrift SemiLight"/>
+        </w:rPr>
+        <w:lastRenderedPageBreak/>
+        <w:t>dimensions while keeping the important responses. Next the data is passed onto the flatten layer where it is compressed into a single value where it then goes into the Fully Connected layer where it uses the value and extracted features to make a prediction.</w:t>
+      </w:r>
+      <w:r>
+        <w:rPr>
+          <w:rFonts w:ascii="Bahnschrift SemiLight" w:hAnsi="Bahnschrift SemiLight"/>
+        </w:rPr>
+        <w:t xml:space="preserve"> Lastly, out comes the prediction value which we can use as the machine’s most likely guess at what exactly classification the image provided is of.</w:t>
+      </w:r>
+      <w:r>
+        <w:rPr>
+          <w:rFonts w:ascii="Bahnschrift SemiLight" w:hAnsi="Bahnschrift SemiLight"/>
+        </w:rPr>
+        <w:t xml:space="preserve"> The architecture is quite linear and has few components.</w:t>
+      </w:r>
+    </w:p>
+    <w:p>
+      <w:pPr>
+        <w:rPr>
+          <w:rFonts w:ascii="Bahnschrift SemiLight" w:hAnsi="Bahnschrift SemiLight"/>
+        </w:rPr>
+      </w:pPr>
+      <w:r>
+        <w:rPr>
+          <w:rFonts w:ascii="Bahnschrift SemiLight" w:hAnsi="Bahnschrift SemiLight"/>
+        </w:rPr>
+        <w:t xml:space="preserve">The output image; 8 output units on </w:t>
+      </w:r>
+      <w:r>
+        <w:rPr>
+          <w:rFonts w:ascii="Bahnschrift SemiLight" w:hAnsi="Bahnschrift SemiLight"/>
+        </w:rPr>
+        <w:t>the 8</w:t>
+      </w:r>
+      <w:r>
+        <w:rPr>
+          <w:rFonts w:ascii="Bahnschrift SemiLight" w:hAnsi="Bahnschrift SemiLight"/>
+        </w:rPr>
+        <w:t xml:space="preserve"> target classes as I’ve described in task 1, with ReLU as the activation and prioritizes the index with the highest output score.</w:t>
+      </w:r>
+    </w:p>
+    <w:p>
+      <w:pPr>
+        <w:rPr>
+          <w:rFonts w:ascii="Bahnschrift SemiLight" w:hAnsi="Bahnschrift SemiLight"/>
+        </w:rPr>
+      </w:pPr>
+      <w:r>
+        <w:rPr>
+          <w:rFonts w:ascii="Bahnschrift SemiLight" w:hAnsi="Bahnschrift SemiLight"/>
+        </w:rPr>
+        <w:t>As for the various settings, I chose to use a loss function that penalises the model for incorrect class predictions and to apply heavier weights to underrepresented classes as we have a class imbalance present</w:t>
+      </w:r>
+      <w:r>
+        <w:rPr>
+          <w:rFonts w:ascii="Bahnschrift SemiLight" w:hAnsi="Bahnschrift SemiLight"/>
+        </w:rPr>
+        <w:t xml:space="preserve"> (the weights of which I calculated and now am applying)</w:t>
+      </w:r>
+      <w:r>
+        <w:rPr>
+          <w:rFonts w:ascii="Bahnschrift SemiLight" w:hAnsi="Bahnschrift SemiLight"/>
+        </w:rPr>
+        <w:t>. This should encourage the model to try to improve its accuracy</w:t>
+      </w:r>
+      <w:r>
+        <w:rPr>
+          <w:rFonts w:ascii="Bahnschrift SemiLight" w:hAnsi="Bahnschrift SemiLight"/>
+        </w:rPr>
+        <w:t xml:space="preserve"> while addressing the class imbalance.</w:t>
+      </w:r>
+      <w:r>
+        <w:rPr>
+          <w:rFonts w:ascii="Bahnschrift SemiLight" w:hAnsi="Bahnschrift SemiLight"/>
+        </w:rPr>
+        <w:t xml:space="preserve"> </w:t>
+      </w:r>
+      <w:r>
+        <w:rPr>
+          <w:rFonts w:ascii="Bahnschrift SemiLight" w:hAnsi="Bahnschrift SemiLight"/>
+        </w:rPr>
+        <w:t>I used an ‘Adam’ optimiser with a 0.001 learning rate, I reasoned Adam being the popular widely used starting option should be a decent pick for my application, then choose 0.001 learning rate to be a starter baseline. These choices may not be optimal and are simply my arbitrary choice.</w:t>
+      </w:r>
+    </w:p>
+    <w:p>
+      <w:pPr>
+        <w:rPr>
+          <w:rFonts w:ascii="Bahnschrift SemiLight" w:hAnsi="Bahnschrift SemiLight"/>
+        </w:rPr>
+      </w:pPr>
+      <w:r>
+        <w:rPr>
+          <w:rFonts w:ascii="Bahnschrift SemiLight" w:hAnsi="Bahnschrift SemiLight"/>
+        </w:rPr>
+        <w:t xml:space="preserve">To run the first </w:t>
+      </w:r>
+      <w:r>
+        <w:rPr>
+          <w:rFonts w:ascii="Bahnschrift SemiLight" w:hAnsi="Bahnschrift SemiLight"/>
+        </w:rPr>
+        <w:t>training,</w:t>
+      </w:r>
+      <w:r>
+        <w:rPr>
+          <w:rFonts w:ascii="Bahnschrift SemiLight" w:hAnsi="Bahnschrift SemiLight"/>
+        </w:rPr>
+        <w:t xml:space="preserve"> I again used the 64 batch size which shouldn’t be too large nor small paired with a 10 epoch count. Again, not too little not too much I reason.</w:t>
+      </w:r>
+      <w:r>
+        <w:rPr>
+          <w:rFonts w:ascii="Bahnschrift SemiLight" w:hAnsi="Bahnschrift SemiLight"/>
+        </w:rPr>
+        <w:t xml:space="preserve"> </w:t>
+      </w:r>
+      <w:r>
+        <w:rPr>
+          <w:rFonts w:ascii="Bahnschrift SemiLight" w:hAnsi="Bahnschrift SemiLight"/>
+        </w:rPr>
+        <w:t xml:space="preserve">Training took roughly 10 minutes on my RTX 3070 with CUDA, epoch </w:t>
+      </w:r>
+      <w:r>
+        <w:rPr>
+          <w:rFonts w:ascii="Bahnschrift SemiLight" w:hAnsi="Bahnschrift SemiLight"/>
+        </w:rPr>
+        <w:t>7</w:t>
+      </w:r>
+      <w:r>
+        <w:rPr>
+          <w:rFonts w:ascii="Bahnschrift SemiLight" w:hAnsi="Bahnschrift SemiLight"/>
+        </w:rPr>
+        <w:t xml:space="preserve"> had the highest accuracy metric at 7</w:t>
+      </w:r>
+      <w:r>
+        <w:rPr>
+          <w:rFonts w:ascii="Bahnschrift SemiLight" w:hAnsi="Bahnschrift SemiLight"/>
+        </w:rPr>
+        <w:t>4</w:t>
+      </w:r>
+      <w:r>
+        <w:rPr>
+          <w:rFonts w:ascii="Bahnschrift SemiLight" w:hAnsi="Bahnschrift SemiLight"/>
+        </w:rPr>
+        <w:t>.</w:t>
+      </w:r>
+      <w:r>
+        <w:rPr>
+          <w:rFonts w:ascii="Bahnschrift SemiLight" w:hAnsi="Bahnschrift SemiLight"/>
+        </w:rPr>
+        <w:t>29</w:t>
+      </w:r>
+      <w:r>
+        <w:rPr>
+          <w:rFonts w:ascii="Bahnschrift SemiLight" w:hAnsi="Bahnschrift SemiLight"/>
+        </w:rPr>
+        <w:t>% validation accuracy, to which I restored the checkpoint and will use.</w:t>
+      </w:r>
+      <w:r>
+        <w:rPr>
+          <w:rFonts w:ascii="Bahnschrift SemiLight" w:hAnsi="Bahnschrift SemiLight"/>
+        </w:rPr>
+        <w:t xml:space="preserve"> </w:t>
+      </w:r>
+      <w:r>
+        <w:rPr>
+          <w:rFonts w:ascii="Bahnschrift SemiLight" w:hAnsi="Bahnschrift SemiLight"/>
+        </w:rPr>
+        <w:t xml:space="preserve">In theory, </w:t>
+      </w:r>
+      <w:r>
+        <w:rPr>
+          <w:rFonts w:ascii="Bahnschrift SemiLight" w:hAnsi="Bahnschrift SemiLight"/>
+        </w:rPr>
+        <w:t xml:space="preserve">this pipeline </w:t>
+      </w:r>
+      <w:r>
+        <w:rPr>
+          <w:rFonts w:ascii="Bahnschrift SemiLight" w:hAnsi="Bahnschrift SemiLight"/>
+        </w:rPr>
+        <w:t>should be capable of generating the Kaggle predictions I need for submission.</w:t>
+      </w:r>
+    </w:p>
+    <w:p>
+      <w:pPr>
+        <w:rPr>
+          <w:rFonts w:ascii="Bahnschrift SemiLight" w:hAnsi="Bahnschrift SemiLight"/>
+        </w:rPr>
+      </w:pPr>
+    </w:p>
+    <w:p>
+      <w:pPr>
+        <w:jc w:val="center"/>
+        <w:rPr>
+          <w:rFonts w:ascii="Bahnschrift SemiLight" w:hAnsi="Bahnschrift SemiLight"/>
+          <w:i/>
+          <w:iCs/>
+          <w:sz w:val="28"/>
+          <w:szCs w:val="28"/>
+        </w:rPr>
+      </w:pPr>
+      <w:r>
+        <w:rPr>
+          <w:rFonts w:ascii="Bahnschrift SemiLight" w:hAnsi="Bahnschrift SemiLight"/>
+          <w:i/>
+          <w:iCs/>
+          <w:sz w:val="28"/>
+          <w:szCs w:val="28"/>
+        </w:rPr>
+        <w:t xml:space="preserve">Task </w:t>
+      </w:r>
+      <w:r>
+        <w:rPr>
+          <w:rFonts w:ascii="Bahnschrift SemiLight" w:hAnsi="Bahnschrift SemiLight"/>
+          <w:i/>
+          <w:iCs/>
+          <w:sz w:val="28"/>
+          <w:szCs w:val="28"/>
+        </w:rPr>
+        <w:t>4</w:t>
+      </w:r>
+      <w:r>
+        <w:rPr>
+          <w:rFonts w:ascii="Bahnschrift SemiLight" w:hAnsi="Bahnschrift SemiLight"/>
+          <w:i/>
+          <w:iCs/>
+          <w:sz w:val="28"/>
+          <w:szCs w:val="28"/>
+        </w:rPr>
+        <w:t>:</w:t>
+      </w:r>
+    </w:p>
+    <w:p>
+      <w:pPr>
+        <w:rPr>
+          <w:rFonts w:ascii="Bahnschrift SemiLight" w:hAnsi="Bahnschrift SemiLight"/>
+        </w:rPr>
+      </w:pPr>
+      <w:r>
+        <w:rPr>
+          <w:rFonts w:ascii="Bahnschrift SemiLight" w:hAnsi="Bahnschrift SemiLight"/>
+          <w:highlight w:val="yellow"/>
+        </w:rPr>
+        <w:t>Add in previous tasks later, like fittings and numbers.</w:t>
+      </w:r>
+    </w:p>
+    <w:p>
+      <w:pPr>
+        <w:rPr>
+          <w:rFonts w:ascii="Bahnschrift SemiLight" w:hAnsi="Bahnschrift SemiLight"/>
+        </w:rPr>
+      </w:pPr>
+      <w:r>
+        <w:rPr>
+          <w:rFonts w:ascii="Bahnschrift SemiLight" w:hAnsi="Bahnschrift SemiLight"/>
+        </w:rPr>
+        <w:t>Several strategies have already been applied to help improve the generalisation of the model during training. For example, I applied data augmentation when I applied the Transforms function giving some images a slight rotation or a random horizontal flip, this helps the model train on images that aren’t ‘well-oriented’.</w:t>
+      </w:r>
+      <w:r>
+        <w:rPr>
+          <w:rFonts w:ascii="Bahnschrift SemiLight" w:hAnsi="Bahnschrift SemiLight"/>
+        </w:rPr>
+        <w:t xml:space="preserve"> I used a dropout of p=0.3, as well as something like best-checkpoint selection where I reloaded epoch 7 which had the best measured accuracy of all 10 epoches.</w:t>
+      </w:r>
+      <w:r>
+        <w:rPr>
+          <w:rFonts w:ascii="Bahnschrift SemiLight" w:hAnsi="Bahnschrift SemiLight"/>
+        </w:rPr>
+        <w:t xml:space="preserve"> These techniques should boost the generalisation of the model and help it perform more accurately when benchmarked on the test cases.</w:t>
+      </w:r>
+    </w:p>
+    <w:p>
+      <w:pPr>
+        <w:rPr>
+          <w:rFonts w:ascii="Bahnschrift SemiLight" w:hAnsi="Bahnschrift SemiLight"/>
+        </w:rPr>
+      </w:pPr>
+      <w:r>
+        <w:rPr>
+          <w:rFonts w:ascii="Bahnschrift SemiLight" w:hAnsi="Bahnschrift SemiLight"/>
+        </w:rPr>
+        <w:t xml:space="preserve">Given that the metric being measured in the Kaggle competition is accuracy, I believe I should refine my training strategy a little towards aiming for the highest </w:t>
+      </w:r>
+      <w:r>
+        <w:rPr>
+          <w:rFonts w:ascii="Bahnschrift SemiLight" w:hAnsi="Bahnschrift SemiLight"/>
+        </w:rPr>
+        <w:lastRenderedPageBreak/>
+        <w:t>accuracy I could possibly get even at the cost of the other performance metrics and measures.</w:t>
+      </w:r>
+    </w:p>
+    <w:p>
+      <w:pPr>
+        <w:rPr>
+          <w:rFonts w:ascii="Bahnschrift SemiLight" w:hAnsi="Bahnschrift SemiLight"/>
+        </w:rPr>
+      </w:pPr>
+    </w:p>
+    <w:p>
+      <w:pPr>
+        <w:rPr>
+          <w:rFonts w:ascii="Bahnschrift SemiLight" w:hAnsi="Bahnschrift SemiLight"/>
+        </w:rPr>
+      </w:pPr>
+    </w:p>
+    <w:p>
+      <w:pPr>
+        <w:rPr>
+          <w:rFonts w:ascii="Bahnschrift SemiLight" w:hAnsi="Bahnschrift SemiLight"/>
+        </w:rPr>
+      </w:pPr>
+    </w:p>
+    <w:p>
+      <w:pPr>
+        <w:rPr>
+          <w:rFonts w:ascii="Bahnschrift SemiLight" w:hAnsi="Bahnschrift SemiLight"/>
+        </w:rPr>
+      </w:pPr>
+    </w:p>
+    <w:p>
+      <w:pPr>
+        <w:jc w:val="center"/>
+        <w:rPr>
+          <w:rFonts w:ascii="Bahnschrift SemiLight" w:hAnsi="Bahnschrift SemiLight"/>
+          <w:i/>
+          <w:iCs/>
+          <w:sz w:val="28"/>
+          <w:szCs w:val="28"/>
+        </w:rPr>
+      </w:pPr>
+      <w:r>
+        <w:rPr>
+          <w:rFonts w:ascii="Bahnschrift SemiLight" w:hAnsi="Bahnschrift SemiLight"/>
+          <w:i/>
+          <w:iCs/>
+          <w:sz w:val="28"/>
+          <w:szCs w:val="28"/>
+        </w:rPr>
+        <w:t>Task 5:</w:t>
+      </w:r>
+    </w:p>
+    <w:p>
+      <w:pPr>
+        <w:rPr>
+          <w:rFonts w:ascii="Bahnschrift SemiLight" w:hAnsi="Bahnschrift SemiLight"/>
+        </w:rPr>
+      </w:pPr>
+    </w:p>
+    <w:p>
+      <w:pPr>
+        <w:rPr>
+          <w:rFonts w:ascii="Bahnschrift SemiLight" w:hAnsi="Bahnschrift SemiLight"/>
+        </w:rPr>
+      </w:pPr>
+    </w:p>
+    <w:p>
+      <w:pPr>
+        <w:rPr>
+          <w:rFonts w:ascii="Bahnschrift SemiLight" w:hAnsi="Bahnschrift SemiLight"/>
+        </w:rPr>
+      </w:pPr>
+    </w:p>
+    <w:p>
+      <w:pPr>
+        <w:rPr>
+          <w:rFonts w:ascii="Bahnschrift SemiLight" w:hAnsi="Bahnschrift SemiLight"/>
+        </w:rPr>
+      </w:pPr>
+    </w:p>
+    <w:p>
+      <w:pPr>
+        <w:rPr>
+          <w:rFonts w:ascii="Bahnschrift SemiLight" w:hAnsi="Bahnschrift SemiLight"/>
+        </w:rPr>
+      </w:pPr>
+    </w:p>
+    <w:p>
+      <w:pPr>
+        <w:jc w:val="center"/>
+        <w:rPr>
+          <w:rFonts w:ascii="Bahnschrift SemiLight" w:hAnsi="Bahnschrift SemiLight"/>
+          <w:i/>
+          <w:iCs/>
+          <w:sz w:val="28"/>
+          <w:szCs w:val="28"/>
+        </w:rPr>
+      </w:pPr>
+      <w:r>
+        <w:rPr>
+          <w:rFonts w:ascii="Bahnschrift SemiLight" w:hAnsi="Bahnschrift SemiLight"/>
+          <w:i/>
+          <w:iCs/>
+          <w:sz w:val="28"/>
+          <w:szCs w:val="28"/>
+        </w:rPr>
+        <w:t xml:space="preserve">Task </w:t>
+      </w:r>
+      <w:r>
+        <w:rPr>
+          <w:rFonts w:ascii="Bahnschrift SemiLight" w:hAnsi="Bahnschrift SemiLight"/>
+          <w:i/>
+          <w:iCs/>
+          <w:sz w:val="28"/>
+          <w:szCs w:val="28"/>
+        </w:rPr>
+        <w:t>6</w:t>
+      </w:r>
+      <w:r>
+        <w:rPr>
+          <w:rFonts w:ascii="Bahnschrift SemiLight" w:hAnsi="Bahnschrift SemiLight"/>
+          <w:i/>
+          <w:iCs/>
+          <w:sz w:val="28"/>
+          <w:szCs w:val="28"/>
+        </w:rPr>
+        <w:t>:</w:t>
+      </w:r>
+    </w:p>
+    <w:p>
+      <w:pPr>
+        <w:rPr>
+          <w:rFonts w:ascii="Bahnschrift SemiLight" w:hAnsi="Bahnschrift SemiLight"/>
+        </w:rPr>
+      </w:pPr>
+    </w:p>
+    <w:p>
+      <w:pPr>
+        <w:rPr>
+          <w:rFonts w:ascii="Bahnschrift SemiLight" w:hAnsi="Bahnschrift SemiLight"/>
+        </w:rPr>
+      </w:pPr>
+    </w:p>
+    <w:p>
+      <w:pPr>
+        <w:rPr>
+          <w:rFonts w:ascii="Bahnschrift SemiLight" w:hAnsi="Bahnschrift SemiLight"/>
+        </w:rPr>
+      </w:pPr>
+    </w:p>
+    <w:p>
+      <w:pPr>
+        <w:rPr>
+          <w:rFonts w:ascii="Bahnschrift SemiLight" w:hAnsi="Bahnschrift SemiLight"/>
+        </w:rPr>
+      </w:pPr>
+    </w:p>
+    <w:p>
+      <w:pPr>
+        <w:rPr>
+          <w:rFonts w:ascii="Bahnschrift SemiLight" w:hAnsi="Bahnschrift SemiLight"/>
+        </w:rPr>
+      </w:pPr>
+    </w:p>
+    <w:p>
+      <w:pPr>
+        <w:rPr>
+          <w:rFonts w:ascii="Bahnschrift SemiLight" w:hAnsi="Bahnschrift SemiLight"/>
+        </w:rPr>
+      </w:pPr>
+    </w:p>
+    <w:p>
+      <w:pPr>
+        <w:rPr>
+          <w:rFonts w:ascii="Bahnschrift SemiLight" w:hAnsi="Bahnschrift SemiLight"/>
+        </w:rPr>
+      </w:pPr>
+    </w:p>
+    <w:p>
+      <w:pPr>
+        <w:jc w:val="center"/>
+        <w:rPr>
+          <w:rFonts w:ascii="Bahnschrift SemiLight" w:hAnsi="Bahnschrift SemiLight"/>
+          <w:i/>
+          <w:iCs/>
+          <w:sz w:val="28"/>
+          <w:szCs w:val="28"/>
+        </w:rPr>
+      </w:pPr>
+      <w:r>
+        <w:rPr>
+          <w:rFonts w:ascii="Bahnschrift SemiLight" w:hAnsi="Bahnschrift SemiLight"/>
+          <w:i/>
+          <w:iCs/>
+          <w:sz w:val="28"/>
+          <w:szCs w:val="28"/>
+        </w:rPr>
+        <w:t xml:space="preserve">Task </w:t>
+      </w:r>
+      <w:r>
+        <w:rPr>
+          <w:rFonts w:ascii="Bahnschrift SemiLight" w:hAnsi="Bahnschrift SemiLight"/>
+          <w:i/>
+          <w:iCs/>
+          <w:sz w:val="28"/>
+          <w:szCs w:val="28"/>
+        </w:rPr>
+        <w:t>7</w:t>
+      </w:r>
+      <w:r>
+        <w:rPr>
+          <w:rFonts w:ascii="Bahnschrift SemiLight" w:hAnsi="Bahnschrift SemiLight"/>
+          <w:i/>
+          <w:iCs/>
+          <w:sz w:val="28"/>
+          <w:szCs w:val="28"/>
+        </w:rPr>
+        <w:t>:</w:t>
+      </w:r>
     </w:p>
     <w:p>
       <w:pPr>
@@ -1738,7 +2478,6 @@
   <w:style w:type="character" w:default="1" w:styleId="DefaultParagraphFont">
     <w:name w:val="Default Paragraph Font"/>
     <w:uiPriority w:val="1"/>
-    <w:semiHidden/>
     <w:unhideWhenUsed/>
   </w:style>
   <w:style w:type="table" w:default="1" w:styleId="TableNormal">

</xml_diff>

<commit_message>
Completed task 4 report, generated submission file
</commit_message>
<xml_diff>
--- a/Report.docx
+++ b/Report.docx
@@ -1446,19 +1446,7 @@
         <w:rPr>
           <w:rFonts w:ascii="Bahnschrift SemiLight" w:hAnsi="Bahnschrift SemiLight"/>
         </w:rPr>
-        <w:t>4</w:t>
-      </w:r>
-      <w:r>
-        <w:rPr>
-          <w:rFonts w:ascii="Bahnschrift SemiLight" w:hAnsi="Bahnschrift SemiLight"/>
-        </w:rPr>
-        <w:t>.</w:t>
-      </w:r>
-      <w:r>
-        <w:rPr>
-          <w:rFonts w:ascii="Bahnschrift SemiLight" w:hAnsi="Bahnschrift SemiLight"/>
-        </w:rPr>
-        <w:t>29</w:t>
+        <w:t>1.42</w:t>
       </w:r>
       <w:r>
         <w:rPr>
@@ -1549,20 +1537,6 @@
       <w:r>
         <w:rPr>
           <w:rFonts w:ascii="Bahnschrift SemiLight" w:hAnsi="Bahnschrift SemiLight"/>
-          <w:highlight w:val="yellow"/>
-        </w:rPr>
-        <w:t>Add in previous tasks later, like fittings and numbers.</w:t>
-      </w:r>
-    </w:p>
-    <w:p>
-      <w:pPr>
-        <w:rPr>
-          <w:rFonts w:ascii="Bahnschrift SemiLight" w:hAnsi="Bahnschrift SemiLight"/>
-        </w:rPr>
-      </w:pPr>
-      <w:r>
-        <w:rPr>
-          <w:rFonts w:ascii="Bahnschrift SemiLight" w:hAnsi="Bahnschrift SemiLight"/>
         </w:rPr>
         <w:t>Several strategies have already been applied to help improve the generalisation of the model during training. For example, I applied data augmentation when I applied the Transforms function giving some images a slight rotation or a random horizontal flip, this helps the model train on images that aren’t ‘well-oriented’.</w:t>
       </w:r>
@@ -1589,36 +1563,271 @@
         <w:rPr>
           <w:rFonts w:ascii="Bahnschrift SemiLight" w:hAnsi="Bahnschrift SemiLight"/>
         </w:rPr>
-        <w:t xml:space="preserve">Given that the metric being measured in the Kaggle competition is accuracy, I believe I should refine my training strategy a little towards aiming for the highest </w:t>
-      </w:r>
-      <w:r>
-        <w:rPr>
-          <w:rFonts w:ascii="Bahnschrift SemiLight" w:hAnsi="Bahnschrift SemiLight"/>
-        </w:rPr>
-        <w:lastRenderedPageBreak/>
-        <w:t>accuracy I could possibly get even at the cost of the other performance metrics and measures.</w:t>
-      </w:r>
-    </w:p>
-    <w:p>
-      <w:pPr>
-        <w:rPr>
-          <w:rFonts w:ascii="Bahnschrift SemiLight" w:hAnsi="Bahnschrift SemiLight"/>
-        </w:rPr>
-      </w:pPr>
-    </w:p>
-    <w:p>
-      <w:pPr>
-        <w:rPr>
-          <w:rFonts w:ascii="Bahnschrift SemiLight" w:hAnsi="Bahnschrift SemiLight"/>
-        </w:rPr>
-      </w:pPr>
-    </w:p>
-    <w:p>
-      <w:pPr>
-        <w:rPr>
-          <w:rFonts w:ascii="Bahnschrift SemiLight" w:hAnsi="Bahnschrift SemiLight"/>
-        </w:rPr>
-      </w:pPr>
+        <w:t>Given that the metric being measured in the Kaggle competition is accuracy, I believe I should refine my training strategy a little towards aiming for the highest accuracy I could possibly get even at the cost of the other performance metrics and measures.</w:t>
+      </w:r>
+    </w:p>
+    <w:p>
+      <w:pPr>
+        <w:rPr>
+          <w:rFonts w:ascii="Bahnschrift SemiLight" w:hAnsi="Bahnschrift SemiLight"/>
+        </w:rPr>
+      </w:pPr>
+    </w:p>
+    <w:p>
+      <w:pPr>
+        <w:rPr>
+          <w:rFonts w:ascii="Bahnschrift SemiLight" w:hAnsi="Bahnschrift SemiLight"/>
+        </w:rPr>
+      </w:pPr>
+      <w:r>
+        <w:rPr>
+          <w:rFonts w:ascii="Bahnschrift SemiLight" w:hAnsi="Bahnschrift SemiLight"/>
+        </w:rPr>
+        <w:t>I generated some graphs on training vs validation</w:t>
+      </w:r>
+      <w:r>
+        <w:rPr>
+          <w:rFonts w:ascii="Bahnschrift SemiLight" w:hAnsi="Bahnschrift SemiLight"/>
+        </w:rPr>
+        <w:t xml:space="preserve"> both loss and accuracy</w:t>
+      </w:r>
+      <w:r>
+        <w:rPr>
+          <w:rFonts w:ascii="Bahnschrift SemiLight" w:hAnsi="Bahnschrift SemiLight"/>
+        </w:rPr>
+        <w:t>, please see below.</w:t>
+      </w:r>
+    </w:p>
+    <w:p>
+      <w:pPr>
+        <w:rPr>
+          <w:rFonts w:ascii="Bahnschrift SemiLight" w:hAnsi="Bahnschrift SemiLight"/>
+        </w:rPr>
+      </w:pPr>
+      <w:r>
+        <w:rPr>
+          <w:rFonts w:ascii="Bahnschrift SemiLight" w:hAnsi="Bahnschrift SemiLight"/>
+        </w:rPr>
+        <w:drawing>
+          <wp:inline distT="0" distB="0" distL="0" distR="0" wp14:anchorId="663C594B" wp14:editId="192BB86B">
+            <wp:extent cx="5731510" cy="2020570"/>
+            <wp:effectExtent l="0" t="0" r="2540" b="0"/>
+            <wp:docPr id="1928565280" name="Picture 1"/>
+            <wp:cNvGraphicFramePr>
+              <a:graphicFrameLocks xmlns:a="http://schemas.openxmlformats.org/drawingml/2006/main" noChangeAspect="1"/>
+            </wp:cNvGraphicFramePr>
+            <a:graphic xmlns:a="http://schemas.openxmlformats.org/drawingml/2006/main">
+              <a:graphicData uri="http://schemas.openxmlformats.org/drawingml/2006/picture">
+                <pic:pic xmlns:pic="http://schemas.openxmlformats.org/drawingml/2006/picture">
+                  <pic:nvPicPr>
+                    <pic:cNvPr id="1928565280" name=""/>
+                    <pic:cNvPicPr/>
+                  </pic:nvPicPr>
+                  <pic:blipFill>
+                    <a:blip r:embed="rId6"/>
+                    <a:stretch>
+                      <a:fillRect/>
+                    </a:stretch>
+                  </pic:blipFill>
+                  <pic:spPr>
+                    <a:xfrm>
+                      <a:off x="0" y="0"/>
+                      <a:ext cx="5731510" cy="2020570"/>
+                    </a:xfrm>
+                    <a:prstGeom prst="rect">
+                      <a:avLst/>
+                    </a:prstGeom>
+                  </pic:spPr>
+                </pic:pic>
+              </a:graphicData>
+            </a:graphic>
+          </wp:inline>
+        </w:drawing>
+      </w:r>
+    </w:p>
+    <w:p>
+      <w:pPr>
+        <w:rPr>
+          <w:rFonts w:ascii="Bahnschrift SemiLight" w:hAnsi="Bahnschrift SemiLight"/>
+        </w:rPr>
+      </w:pPr>
+      <w:r>
+        <w:rPr>
+          <w:rFonts w:ascii="Bahnschrift SemiLight" w:hAnsi="Bahnschrift SemiLight"/>
+        </w:rPr>
+        <w:t xml:space="preserve">The graph shows a generally good fit, no significant evidence of </w:t>
+      </w:r>
+      <w:r>
+        <w:rPr>
+          <w:rFonts w:ascii="Bahnschrift SemiLight" w:hAnsi="Bahnschrift SemiLight"/>
+        </w:rPr>
+        <w:t xml:space="preserve">persistent </w:t>
+      </w:r>
+      <w:r>
+        <w:rPr>
+          <w:rFonts w:ascii="Bahnschrift SemiLight" w:hAnsi="Bahnschrift SemiLight"/>
+        </w:rPr>
+        <w:t xml:space="preserve">underfitting </w:t>
+      </w:r>
+      <w:r>
+        <w:rPr>
+          <w:rFonts w:ascii="Bahnschrift SemiLight" w:hAnsi="Bahnschrift SemiLight"/>
+        </w:rPr>
+        <w:t>or</w:t>
+      </w:r>
+      <w:r>
+        <w:rPr>
+          <w:rFonts w:ascii="Bahnschrift SemiLight" w:hAnsi="Bahnschrift SemiLight"/>
+        </w:rPr>
+        <w:t xml:space="preserve"> overfitting.</w:t>
+      </w:r>
+    </w:p>
+    <w:p>
+      <w:pPr>
+        <w:rPr>
+          <w:rFonts w:ascii="Bahnschrift SemiLight" w:hAnsi="Bahnschrift SemiLight"/>
+        </w:rPr>
+      </w:pPr>
+      <w:r>
+        <w:rPr>
+          <w:rFonts w:ascii="Bahnschrift SemiLight" w:hAnsi="Bahnschrift SemiLight"/>
+        </w:rPr>
+        <w:t>Epochs</w:t>
+      </w:r>
+      <w:r>
+        <w:rPr>
+          <w:rFonts w:ascii="Bahnschrift SemiLight" w:hAnsi="Bahnschrift SemiLight"/>
+        </w:rPr>
+        <w:t xml:space="preserve"> 1 to </w:t>
+      </w:r>
+      <w:r>
+        <w:rPr>
+          <w:rFonts w:ascii="Bahnschrift SemiLight" w:hAnsi="Bahnschrift SemiLight"/>
+        </w:rPr>
+        <w:t>5</w:t>
+      </w:r>
+      <w:r>
+        <w:rPr>
+          <w:rFonts w:ascii="Bahnschrift SemiLight" w:hAnsi="Bahnschrift SemiLight"/>
+        </w:rPr>
+        <w:t xml:space="preserve"> in validation loss shows the model learning quite substantially in the useful features of the images and does show large improvements in its predictions.</w:t>
+      </w:r>
+      <w:r>
+        <w:rPr>
+          <w:rFonts w:ascii="Bahnschrift SemiLight" w:hAnsi="Bahnschrift SemiLight"/>
+        </w:rPr>
+        <w:t xml:space="preserve"> </w:t>
+      </w:r>
+      <w:r>
+        <w:rPr>
+          <w:rFonts w:ascii="Bahnschrift SemiLight" w:hAnsi="Bahnschrift SemiLight"/>
+        </w:rPr>
+        <w:t>Validation loss epoch 6 hits a large dip in loss but jumps up at epoch 8 before dropping down at epoch 9 and 10.</w:t>
+      </w:r>
+      <w:r>
+        <w:rPr>
+          <w:rFonts w:ascii="Bahnschrift SemiLight" w:hAnsi="Bahnschrift SemiLight"/>
+        </w:rPr>
+        <w:t xml:space="preserve"> The signs points towards a temporary disturbance in validation loss as opposed to a sustained and persistent pattern, I </w:t>
+      </w:r>
+      <w:r>
+        <w:rPr>
+          <w:rFonts w:ascii="Bahnschrift SemiLight" w:hAnsi="Bahnschrift SemiLight"/>
+        </w:rPr>
+        <w:t>believe this is okay as is.</w:t>
+      </w:r>
+    </w:p>
+    <w:p>
+      <w:pPr>
+        <w:rPr>
+          <w:rFonts w:ascii="Bahnschrift SemiLight" w:hAnsi="Bahnschrift SemiLight"/>
+        </w:rPr>
+      </w:pPr>
+      <w:r>
+        <w:rPr>
+          <w:rFonts w:ascii="Bahnschrift SemiLight" w:hAnsi="Bahnschrift SemiLight"/>
+        </w:rPr>
+        <w:t xml:space="preserve">As for validation accuracy, it sharply rises between epochs 1 to 3 then slows down between epochs 4 to 7 with a slow but steady increase. Epoch 8 drops validation accuracy down from a score of roughly </w:t>
+      </w:r>
+      <w:r>
+        <w:rPr>
+          <w:rFonts w:ascii="Bahnschrift SemiLight" w:hAnsi="Bahnschrift SemiLight"/>
+        </w:rPr>
+        <w:t>70%</w:t>
+      </w:r>
+      <w:r>
+        <w:rPr>
+          <w:rFonts w:ascii="Bahnschrift SemiLight" w:hAnsi="Bahnschrift SemiLight"/>
+        </w:rPr>
+        <w:t xml:space="preserve"> to </w:t>
+      </w:r>
+      <w:r>
+        <w:rPr>
+          <w:rFonts w:ascii="Bahnschrift SemiLight" w:hAnsi="Bahnschrift SemiLight"/>
+        </w:rPr>
+        <w:t>60%</w:t>
+      </w:r>
+      <w:r>
+        <w:rPr>
+          <w:rFonts w:ascii="Bahnschrift SemiLight" w:hAnsi="Bahnschrift SemiLight"/>
+        </w:rPr>
+        <w:t xml:space="preserve">, before quacking rising back to </w:t>
+      </w:r>
+      <w:r>
+        <w:rPr>
+          <w:rFonts w:ascii="Bahnschrift SemiLight" w:hAnsi="Bahnschrift SemiLight"/>
+        </w:rPr>
+        <w:t>70%</w:t>
+      </w:r>
+      <w:r>
+        <w:rPr>
+          <w:rFonts w:ascii="Bahnschrift SemiLight" w:hAnsi="Bahnschrift SemiLight"/>
+        </w:rPr>
+        <w:t xml:space="preserve"> for epochs 9</w:t>
+      </w:r>
+      <w:r>
+        <w:rPr>
+          <w:rFonts w:ascii="Bahnschrift SemiLight" w:hAnsi="Bahnschrift SemiLight"/>
+        </w:rPr>
+        <w:t xml:space="preserve"> and falls slightly to epoch 10.</w:t>
+      </w:r>
+      <w:r>
+        <w:rPr>
+          <w:rFonts w:ascii="Bahnschrift SemiLight" w:hAnsi="Bahnschrift SemiLight"/>
+        </w:rPr>
+        <w:t xml:space="preserve"> </w:t>
+      </w:r>
+      <w:r>
+        <w:rPr>
+          <w:rFonts w:ascii="Bahnschrift SemiLight" w:hAnsi="Bahnschrift SemiLight"/>
+        </w:rPr>
+        <w:t xml:space="preserve">The sudden change does suggest some level of instability in </w:t>
+      </w:r>
+      <w:r>
+        <w:rPr>
+          <w:rFonts w:ascii="Bahnschrift SemiLight" w:hAnsi="Bahnschrift SemiLight"/>
+        </w:rPr>
+        <w:t>generalisation,</w:t>
+      </w:r>
+      <w:r>
+        <w:rPr>
+          <w:rFonts w:ascii="Bahnschrift SemiLight" w:hAnsi="Bahnschrift SemiLight"/>
+        </w:rPr>
+        <w:t xml:space="preserve"> but the overall level of stabilisation is encouraging in my opinion.</w:t>
+      </w:r>
+    </w:p>
+    <w:p>
+      <w:pPr>
+        <w:rPr>
+          <w:rFonts w:ascii="Bahnschrift SemiLight" w:hAnsi="Bahnschrift SemiLight"/>
+        </w:rPr>
+      </w:pPr>
+      <w:r>
+        <w:rPr>
+          <w:rFonts w:ascii="Bahnschrift SemiLight" w:hAnsi="Bahnschrift SemiLight"/>
+        </w:rPr>
+        <w:t>One pattern to note is the variances in both validation loss and validation accuracy are both generally occurring towards the later epochs.</w:t>
+      </w:r>
     </w:p>
     <w:p>
       <w:pPr>
@@ -1703,9 +1912,61 @@
           <w:sz w:val="28"/>
           <w:szCs w:val="28"/>
         </w:rPr>
-        <w:t xml:space="preserve">Task </w:t>
-      </w:r>
-      <w:r>
+        <w:t>Task 6:</w:t>
+      </w:r>
+    </w:p>
+    <w:p>
+      <w:pPr>
+        <w:rPr>
+          <w:rFonts w:ascii="Bahnschrift SemiLight" w:hAnsi="Bahnschrift SemiLight"/>
+        </w:rPr>
+      </w:pPr>
+    </w:p>
+    <w:p>
+      <w:pPr>
+        <w:rPr>
+          <w:rFonts w:ascii="Bahnschrift SemiLight" w:hAnsi="Bahnschrift SemiLight"/>
+        </w:rPr>
+      </w:pPr>
+    </w:p>
+    <w:p>
+      <w:pPr>
+        <w:rPr>
+          <w:rFonts w:ascii="Bahnschrift SemiLight" w:hAnsi="Bahnschrift SemiLight"/>
+        </w:rPr>
+      </w:pPr>
+    </w:p>
+    <w:p>
+      <w:pPr>
+        <w:rPr>
+          <w:rFonts w:ascii="Bahnschrift SemiLight" w:hAnsi="Bahnschrift SemiLight"/>
+        </w:rPr>
+      </w:pPr>
+    </w:p>
+    <w:p>
+      <w:pPr>
+        <w:rPr>
+          <w:rFonts w:ascii="Bahnschrift SemiLight" w:hAnsi="Bahnschrift SemiLight"/>
+        </w:rPr>
+      </w:pPr>
+    </w:p>
+    <w:p>
+      <w:pPr>
+        <w:rPr>
+          <w:rFonts w:ascii="Bahnschrift SemiLight" w:hAnsi="Bahnschrift SemiLight"/>
+        </w:rPr>
+      </w:pPr>
+    </w:p>
+    <w:p>
+      <w:pPr>
+        <w:rPr>
+          <w:rFonts w:ascii="Bahnschrift SemiLight" w:hAnsi="Bahnschrift SemiLight"/>
+        </w:rPr>
+      </w:pPr>
+    </w:p>
+    <w:p>
+      <w:pPr>
+        <w:jc w:val="center"/>
         <w:rPr>
           <w:rFonts w:ascii="Bahnschrift SemiLight" w:hAnsi="Bahnschrift SemiLight"/>
           <w:i/>
@@ -1713,8 +1974,7 @@
           <w:sz w:val="28"/>
           <w:szCs w:val="28"/>
         </w:rPr>
-        <w:t>6</w:t>
-      </w:r>
+      </w:pPr>
       <w:r>
         <w:rPr>
           <w:rFonts w:ascii="Bahnschrift SemiLight" w:hAnsi="Bahnschrift SemiLight"/>
@@ -1723,98 +1983,7 @@
           <w:sz w:val="28"/>
           <w:szCs w:val="28"/>
         </w:rPr>
-        <w:t>:</w:t>
-      </w:r>
-    </w:p>
-    <w:p>
-      <w:pPr>
-        <w:rPr>
-          <w:rFonts w:ascii="Bahnschrift SemiLight" w:hAnsi="Bahnschrift SemiLight"/>
-        </w:rPr>
-      </w:pPr>
-    </w:p>
-    <w:p>
-      <w:pPr>
-        <w:rPr>
-          <w:rFonts w:ascii="Bahnschrift SemiLight" w:hAnsi="Bahnschrift SemiLight"/>
-        </w:rPr>
-      </w:pPr>
-    </w:p>
-    <w:p>
-      <w:pPr>
-        <w:rPr>
-          <w:rFonts w:ascii="Bahnschrift SemiLight" w:hAnsi="Bahnschrift SemiLight"/>
-        </w:rPr>
-      </w:pPr>
-    </w:p>
-    <w:p>
-      <w:pPr>
-        <w:rPr>
-          <w:rFonts w:ascii="Bahnschrift SemiLight" w:hAnsi="Bahnschrift SemiLight"/>
-        </w:rPr>
-      </w:pPr>
-    </w:p>
-    <w:p>
-      <w:pPr>
-        <w:rPr>
-          <w:rFonts w:ascii="Bahnschrift SemiLight" w:hAnsi="Bahnschrift SemiLight"/>
-        </w:rPr>
-      </w:pPr>
-    </w:p>
-    <w:p>
-      <w:pPr>
-        <w:rPr>
-          <w:rFonts w:ascii="Bahnschrift SemiLight" w:hAnsi="Bahnschrift SemiLight"/>
-        </w:rPr>
-      </w:pPr>
-    </w:p>
-    <w:p>
-      <w:pPr>
-        <w:rPr>
-          <w:rFonts w:ascii="Bahnschrift SemiLight" w:hAnsi="Bahnschrift SemiLight"/>
-        </w:rPr>
-      </w:pPr>
-    </w:p>
-    <w:p>
-      <w:pPr>
-        <w:jc w:val="center"/>
-        <w:rPr>
-          <w:rFonts w:ascii="Bahnschrift SemiLight" w:hAnsi="Bahnschrift SemiLight"/>
-          <w:i/>
-          <w:iCs/>
-          <w:sz w:val="28"/>
-          <w:szCs w:val="28"/>
-        </w:rPr>
-      </w:pPr>
-      <w:r>
-        <w:rPr>
-          <w:rFonts w:ascii="Bahnschrift SemiLight" w:hAnsi="Bahnschrift SemiLight"/>
-          <w:i/>
-          <w:iCs/>
-          <w:sz w:val="28"/>
-          <w:szCs w:val="28"/>
-        </w:rPr>
-        <w:t xml:space="preserve">Task </w:t>
-      </w:r>
-      <w:r>
-        <w:rPr>
-          <w:rFonts w:ascii="Bahnschrift SemiLight" w:hAnsi="Bahnschrift SemiLight"/>
-          <w:i/>
-          <w:iCs/>
-          <w:sz w:val="28"/>
-          <w:szCs w:val="28"/>
-        </w:rPr>
-        <w:t>7</w:t>
-      </w:r>
-      <w:r>
-        <w:rPr>
-          <w:rFonts w:ascii="Bahnschrift SemiLight" w:hAnsi="Bahnschrift SemiLight"/>
-          <w:i/>
-          <w:iCs/>
-          <w:sz w:val="28"/>
-          <w:szCs w:val="28"/>
-        </w:rPr>
-        <w:t>:</w:t>
+        <w:t>Task 7:</w:t>
       </w:r>
     </w:p>
     <w:p>
@@ -2478,6 +2647,7 @@
   <w:style w:type="character" w:default="1" w:styleId="DefaultParagraphFont">
     <w:name w:val="Default Paragraph Font"/>
     <w:uiPriority w:val="1"/>
+    <w:semiHidden/>
     <w:unhideWhenUsed/>
   </w:style>
   <w:style w:type="table" w:default="1" w:styleId="TableNormal">

</xml_diff>

<commit_message>
Added confusion matrix and metrics, finished task 5 report
</commit_message>
<xml_diff>
--- a/Report.docx
+++ b/Report.docx
@@ -53,12 +53,14 @@
         </w:rPr>
         <w:t xml:space="preserve">Kaggle username: </w:t>
       </w:r>
+      <w:proofErr w:type="spellStart"/>
       <w:r>
         <w:rPr>
           <w:rFonts w:ascii="Bahnschrift SemiLight" w:hAnsi="Bahnschrift SemiLight"/>
         </w:rPr>
         <w:t>huyinsong</w:t>
       </w:r>
+      <w:proofErr w:type="spellEnd"/>
       <w:r>
         <w:rPr>
           <w:rFonts w:ascii="Bahnschrift SemiLight" w:hAnsi="Bahnschrift SemiLight"/>
@@ -184,7 +186,21 @@
         <w:rPr>
           <w:rFonts w:ascii="Bahnschrift SemiLight" w:hAnsi="Bahnschrift SemiLight"/>
         </w:rPr>
-        <w:t xml:space="preserve"> ‘image_id’ is a 64-bit integer variable while ‘class’ is a string. This means I will need to encode the class feature into a numerical variable in order for the machine to feasibly use it.</w:t>
+        <w:t xml:space="preserve"> ‘</w:t>
+      </w:r>
+      <w:proofErr w:type="gramStart"/>
+      <w:r>
+        <w:rPr>
+          <w:rFonts w:ascii="Bahnschrift SemiLight" w:hAnsi="Bahnschrift SemiLight"/>
+        </w:rPr>
+        <w:t>image</w:t>
+      </w:r>
+      <w:proofErr w:type="gramEnd"/>
+      <w:r>
+        <w:rPr>
+          <w:rFonts w:ascii="Bahnschrift SemiLight" w:hAnsi="Bahnschrift SemiLight"/>
+        </w:rPr>
+        <w:t>_id’ is a 64-bit integer variable while ‘class’ is a string. This means I will need to encode the class feature into a numerical variable in order for the machine to feasibly use it.</w:t>
       </w:r>
     </w:p>
     <w:p>
@@ -1116,6 +1132,12 @@
         </w:rPr>
         <w:t xml:space="preserve"> the original image set is untouched and is only temporary in each Kernel run.</w:t>
       </w:r>
+      <w:r>
+        <w:rPr>
+          <w:rFonts w:ascii="Bahnschrift SemiLight" w:hAnsi="Bahnschrift SemiLight"/>
+        </w:rPr>
+        <w:t xml:space="preserve"> The idea is for the model to get better acquainted with images that aren’t perfectly straight, the more training exposure the model gets with slightly rotated images the better it generalises.</w:t>
+      </w:r>
     </w:p>
     <w:p>
       <w:pPr>
@@ -1298,20 +1320,34 @@
         <w:rPr>
           <w:rFonts w:ascii="Bahnschrift SemiLight" w:hAnsi="Bahnschrift SemiLight"/>
         </w:rPr>
-        <w:t xml:space="preserve"> Next it goes to the Activation ReLU function where CNN learns complex patterns of the image that couldn’t be captured with just the Convolutional layer.</w:t>
-      </w:r>
-      <w:r>
-        <w:rPr>
-          <w:rFonts w:ascii="Bahnschrift SemiLight" w:hAnsi="Bahnschrift SemiLight"/>
-        </w:rPr>
-        <w:t xml:space="preserve"> Next is the Pooling layer where we apply Max Pooling, basically reducing the special </w:t>
+        <w:t xml:space="preserve"> Next it goes to the Activation </w:t>
+      </w:r>
+      <w:proofErr w:type="spellStart"/>
+      <w:r>
+        <w:rPr>
+          <w:rFonts w:ascii="Bahnschrift SemiLight" w:hAnsi="Bahnschrift SemiLight"/>
+        </w:rPr>
+        <w:t>ReLU</w:t>
+      </w:r>
+      <w:proofErr w:type="spellEnd"/>
+      <w:r>
+        <w:rPr>
+          <w:rFonts w:ascii="Bahnschrift SemiLight" w:hAnsi="Bahnschrift SemiLight"/>
+        </w:rPr>
+        <w:t xml:space="preserve"> function where CNN learns complex </w:t>
       </w:r>
       <w:r>
         <w:rPr>
           <w:rFonts w:ascii="Bahnschrift SemiLight" w:hAnsi="Bahnschrift SemiLight"/>
         </w:rPr>
         <w:lastRenderedPageBreak/>
-        <w:t>dimensions while keeping the important responses. Next the data is passed onto the flatten layer where it is compressed into a single value where it then goes into the Fully Connected layer where it uses the value and extracted features to make a prediction.</w:t>
+        <w:t>patterns of the image that couldn’t be captured with just the Convolutional layer.</w:t>
+      </w:r>
+      <w:r>
+        <w:rPr>
+          <w:rFonts w:ascii="Bahnschrift SemiLight" w:hAnsi="Bahnschrift SemiLight"/>
+        </w:rPr>
+        <w:t xml:space="preserve"> Next is the Pooling layer where we apply Max Pooling, basically reducing the special dimensions while keeping the important responses. Next the data is passed onto the flatten layer where it is compressed into a single value where it then goes into the Fully Connected layer where it uses the value and extracted features to make a prediction.</w:t>
       </w:r>
       <w:r>
         <w:rPr>
@@ -1348,7 +1384,21 @@
         <w:rPr>
           <w:rFonts w:ascii="Bahnschrift SemiLight" w:hAnsi="Bahnschrift SemiLight"/>
         </w:rPr>
-        <w:t xml:space="preserve"> target classes as I’ve described in task 1, with ReLU as the activation and prioritizes the index with the highest output score.</w:t>
+        <w:t xml:space="preserve"> target classes as I’ve described in task 1, with </w:t>
+      </w:r>
+      <w:proofErr w:type="spellStart"/>
+      <w:r>
+        <w:rPr>
+          <w:rFonts w:ascii="Bahnschrift SemiLight" w:hAnsi="Bahnschrift SemiLight"/>
+        </w:rPr>
+        <w:t>ReLU</w:t>
+      </w:r>
+      <w:proofErr w:type="spellEnd"/>
+      <w:r>
+        <w:rPr>
+          <w:rFonts w:ascii="Bahnschrift SemiLight" w:hAnsi="Bahnschrift SemiLight"/>
+        </w:rPr>
+        <w:t xml:space="preserve"> as the activation and prioritizes the index with the highest output score.</w:t>
       </w:r>
     </w:p>
     <w:p>
@@ -1434,7 +1484,7 @@
         <w:rPr>
           <w:rFonts w:ascii="Bahnschrift SemiLight" w:hAnsi="Bahnschrift SemiLight"/>
         </w:rPr>
-        <w:t>7</w:t>
+        <w:t>9</w:t>
       </w:r>
       <w:r>
         <w:rPr>
@@ -1446,7 +1496,19 @@
         <w:rPr>
           <w:rFonts w:ascii="Bahnschrift SemiLight" w:hAnsi="Bahnschrift SemiLight"/>
         </w:rPr>
-        <w:t>1.42</w:t>
+        <w:t>4</w:t>
+      </w:r>
+      <w:r>
+        <w:rPr>
+          <w:rFonts w:ascii="Bahnschrift SemiLight" w:hAnsi="Bahnschrift SemiLight"/>
+        </w:rPr>
+        <w:t>.</w:t>
+      </w:r>
+      <w:r>
+        <w:rPr>
+          <w:rFonts w:ascii="Bahnschrift SemiLight" w:hAnsi="Bahnschrift SemiLight"/>
+        </w:rPr>
+        <w:t>91</w:t>
       </w:r>
       <w:r>
         <w:rPr>
@@ -1544,7 +1606,19 @@
         <w:rPr>
           <w:rFonts w:ascii="Bahnschrift SemiLight" w:hAnsi="Bahnschrift SemiLight"/>
         </w:rPr>
-        <w:t xml:space="preserve"> I used a dropout of p=0.3, as well as something like best-checkpoint selection where I reloaded epoch 7 which had the best measured accuracy of all 10 epoches.</w:t>
+        <w:t xml:space="preserve"> I used a dropout of p=0.3, as well as something like best-checkpoint selection where I reloaded epoch </w:t>
+      </w:r>
+      <w:r>
+        <w:rPr>
+          <w:rFonts w:ascii="Bahnschrift SemiLight" w:hAnsi="Bahnschrift SemiLight"/>
+        </w:rPr>
+        <w:t>9</w:t>
+      </w:r>
+      <w:r>
+        <w:rPr>
+          <w:rFonts w:ascii="Bahnschrift SemiLight" w:hAnsi="Bahnschrift SemiLight"/>
+        </w:rPr>
+        <w:t xml:space="preserve"> which had the best measured accuracy of all 10 epochs.</w:t>
       </w:r>
       <w:r>
         <w:rPr>
@@ -1563,7 +1637,14 @@
         <w:rPr>
           <w:rFonts w:ascii="Bahnschrift SemiLight" w:hAnsi="Bahnschrift SemiLight"/>
         </w:rPr>
-        <w:t>Given that the metric being measured in the Kaggle competition is accuracy, I believe I should refine my training strategy a little towards aiming for the highest accuracy I could possibly get even at the cost of the other performance metrics and measures.</w:t>
+        <w:t xml:space="preserve">Given that the metric being measured in the Kaggle competition is accuracy, I believe I should refine my training strategy a little towards aiming for the highest </w:t>
+      </w:r>
+      <w:r>
+        <w:rPr>
+          <w:rFonts w:ascii="Bahnschrift SemiLight" w:hAnsi="Bahnschrift SemiLight"/>
+        </w:rPr>
+        <w:lastRenderedPageBreak/>
+        <w:t>accuracy I could possibly get even at the cost of the other performance metrics and measures.</w:t>
       </w:r>
     </w:p>
     <w:p>
@@ -1607,6 +1688,7 @@
       <w:r>
         <w:rPr>
           <w:rFonts w:ascii="Bahnschrift SemiLight" w:hAnsi="Bahnschrift SemiLight"/>
+          <w:noProof/>
         </w:rPr>
         <w:drawing>
           <wp:inline distT="0" distB="0" distL="0" distR="0" wp14:anchorId="663C594B" wp14:editId="192BB86B">
@@ -1864,34 +1946,814 @@
           <w:rFonts w:ascii="Bahnschrift SemiLight" w:hAnsi="Bahnschrift SemiLight"/>
         </w:rPr>
       </w:pPr>
-    </w:p>
-    <w:p>
-      <w:pPr>
-        <w:rPr>
-          <w:rFonts w:ascii="Bahnschrift SemiLight" w:hAnsi="Bahnschrift SemiLight"/>
-        </w:rPr>
-      </w:pPr>
-    </w:p>
-    <w:p>
-      <w:pPr>
-        <w:rPr>
-          <w:rFonts w:ascii="Bahnschrift SemiLight" w:hAnsi="Bahnschrift SemiLight"/>
-        </w:rPr>
-      </w:pPr>
-    </w:p>
-    <w:p>
-      <w:pPr>
-        <w:rPr>
-          <w:rFonts w:ascii="Bahnschrift SemiLight" w:hAnsi="Bahnschrift SemiLight"/>
-        </w:rPr>
-      </w:pPr>
-    </w:p>
-    <w:p>
-      <w:pPr>
-        <w:rPr>
-          <w:rFonts w:ascii="Bahnschrift SemiLight" w:hAnsi="Bahnschrift SemiLight"/>
-        </w:rPr>
-      </w:pPr>
+      <w:r>
+        <w:rPr>
+          <w:rFonts w:ascii="Bahnschrift SemiLight" w:hAnsi="Bahnschrift SemiLight"/>
+        </w:rPr>
+        <w:t xml:space="preserve">I have generated a </w:t>
+      </w:r>
+      <w:r>
+        <w:rPr>
+          <w:rFonts w:ascii="Bahnschrift SemiLight" w:hAnsi="Bahnschrift SemiLight"/>
+        </w:rPr>
+        <w:t>‘</w:t>
+      </w:r>
+      <w:r>
+        <w:rPr>
+          <w:rFonts w:ascii="Bahnschrift SemiLight" w:hAnsi="Bahnschrift SemiLight"/>
+        </w:rPr>
+        <w:t>submission.csv</w:t>
+      </w:r>
+      <w:r>
+        <w:rPr>
+          <w:rFonts w:ascii="Bahnschrift SemiLight" w:hAnsi="Bahnschrift SemiLight"/>
+        </w:rPr>
+        <w:t>’</w:t>
+      </w:r>
+      <w:r>
+        <w:rPr>
+          <w:rFonts w:ascii="Bahnschrift SemiLight" w:hAnsi="Bahnschrift SemiLight"/>
+        </w:rPr>
+        <w:t xml:space="preserve"> file to upload and benchmark on Kaggle</w:t>
+      </w:r>
+      <w:r>
+        <w:rPr>
+          <w:rFonts w:ascii="Bahnschrift SemiLight" w:hAnsi="Bahnschrift SemiLight"/>
+        </w:rPr>
+        <w:t>.</w:t>
+      </w:r>
+    </w:p>
+    <w:p>
+      <w:pPr>
+        <w:rPr>
+          <w:rFonts w:ascii="Bahnschrift SemiLight" w:hAnsi="Bahnschrift SemiLight"/>
+        </w:rPr>
+      </w:pPr>
+      <w:r>
+        <w:rPr>
+          <w:rFonts w:ascii="Bahnschrift SemiLight" w:hAnsi="Bahnschrift SemiLight"/>
+        </w:rPr>
+        <w:t xml:space="preserve">It is composed of 29,443 records with two columns/features. Feature 1 is ‘image_id’ that pairs the corresponding image in the image test folder to feature 2. Feature is </w:t>
+      </w:r>
+      <w:r>
+        <w:rPr>
+          <w:rFonts w:ascii="Bahnschrift SemiLight" w:hAnsi="Bahnschrift SemiLight"/>
+        </w:rPr>
+        <w:lastRenderedPageBreak/>
+        <w:t xml:space="preserve">‘class’ where it stores my model’s best guess at which class of the </w:t>
+      </w:r>
+      <w:r>
+        <w:rPr>
+          <w:rFonts w:ascii="Bahnschrift SemiLight" w:hAnsi="Bahnschrift SemiLight"/>
+        </w:rPr>
+        <w:t>target</w:t>
+      </w:r>
+      <w:r>
+        <w:rPr>
+          <w:rFonts w:ascii="Bahnschrift SemiLight" w:hAnsi="Bahnschrift SemiLight"/>
+        </w:rPr>
+        <w:t xml:space="preserve"> classes that the corresponding image is. </w:t>
+      </w:r>
+    </w:p>
+    <w:p>
+      <w:pPr>
+        <w:rPr>
+          <w:rFonts w:ascii="Bahnschrift SemiLight" w:hAnsi="Bahnschrift SemiLight"/>
+        </w:rPr>
+      </w:pPr>
+      <w:r>
+        <w:rPr>
+          <w:rFonts w:ascii="Bahnschrift SemiLight" w:hAnsi="Bahnschrift SemiLight"/>
+        </w:rPr>
+        <w:t>T</w:t>
+      </w:r>
+      <w:r>
+        <w:rPr>
+          <w:rFonts w:ascii="Bahnschrift SemiLight" w:hAnsi="Bahnschrift SemiLight"/>
+        </w:rPr>
+        <w:t>he result came back with a 68.42% score which at the time of writing places me at 70</w:t>
+      </w:r>
+      <w:r>
+        <w:rPr>
+          <w:rFonts w:ascii="Bahnschrift SemiLight" w:hAnsi="Bahnschrift SemiLight"/>
+          <w:vertAlign w:val="superscript"/>
+        </w:rPr>
+        <w:t>th</w:t>
+      </w:r>
+      <w:r>
+        <w:rPr>
+          <w:rFonts w:ascii="Bahnschrift SemiLight" w:hAnsi="Bahnschrift SemiLight"/>
+        </w:rPr>
+        <w:t xml:space="preserve"> place. I need to optimize for accuracy which I have not yet done.</w:t>
+      </w:r>
+    </w:p>
+    <w:p>
+      <w:pPr>
+        <w:rPr>
+          <w:rFonts w:ascii="Bahnschrift SemiLight" w:hAnsi="Bahnschrift SemiLight"/>
+        </w:rPr>
+      </w:pPr>
+      <w:r>
+        <w:rPr>
+          <w:noProof/>
+        </w:rPr>
+        <w:drawing>
+          <wp:inline distT="0" distB="0" distL="0" distR="0" wp14:anchorId="4F8DC93A" wp14:editId="1450A96F">
+            <wp:extent cx="5731510" cy="2593975"/>
+            <wp:effectExtent l="0" t="0" r="2540" b="0"/>
+            <wp:docPr id="1915329049" name="Picture 1"/>
+            <wp:cNvGraphicFramePr>
+              <a:graphicFrameLocks xmlns:a="http://schemas.openxmlformats.org/drawingml/2006/main" noChangeAspect="1"/>
+            </wp:cNvGraphicFramePr>
+            <a:graphic xmlns:a="http://schemas.openxmlformats.org/drawingml/2006/main">
+              <a:graphicData uri="http://schemas.openxmlformats.org/drawingml/2006/picture">
+                <pic:pic xmlns:pic="http://schemas.openxmlformats.org/drawingml/2006/picture">
+                  <pic:nvPicPr>
+                    <pic:cNvPr id="1915329049" name=""/>
+                    <pic:cNvPicPr/>
+                  </pic:nvPicPr>
+                  <pic:blipFill>
+                    <a:blip r:embed="rId7"/>
+                    <a:stretch>
+                      <a:fillRect/>
+                    </a:stretch>
+                  </pic:blipFill>
+                  <pic:spPr>
+                    <a:xfrm>
+                      <a:off x="0" y="0"/>
+                      <a:ext cx="5731510" cy="2593975"/>
+                    </a:xfrm>
+                    <a:prstGeom prst="rect">
+                      <a:avLst/>
+                    </a:prstGeom>
+                  </pic:spPr>
+                </pic:pic>
+              </a:graphicData>
+            </a:graphic>
+          </wp:inline>
+        </w:drawing>
+      </w:r>
+    </w:p>
+    <w:p>
+      <w:pPr>
+        <w:rPr>
+          <w:rFonts w:ascii="Bahnschrift SemiLight" w:hAnsi="Bahnschrift SemiLight"/>
+        </w:rPr>
+      </w:pPr>
+      <w:r>
+        <w:rPr>
+          <w:noProof/>
+        </w:rPr>
+        <w:drawing>
+          <wp:inline distT="0" distB="0" distL="0" distR="0" wp14:anchorId="0970C8DC" wp14:editId="6C9075F4">
+            <wp:extent cx="5731510" cy="351155"/>
+            <wp:effectExtent l="0" t="0" r="2540" b="0"/>
+            <wp:docPr id="1662937982" name="Picture 1"/>
+            <wp:cNvGraphicFramePr>
+              <a:graphicFrameLocks xmlns:a="http://schemas.openxmlformats.org/drawingml/2006/main" noChangeAspect="1"/>
+            </wp:cNvGraphicFramePr>
+            <a:graphic xmlns:a="http://schemas.openxmlformats.org/drawingml/2006/main">
+              <a:graphicData uri="http://schemas.openxmlformats.org/drawingml/2006/picture">
+                <pic:pic xmlns:pic="http://schemas.openxmlformats.org/drawingml/2006/picture">
+                  <pic:nvPicPr>
+                    <pic:cNvPr id="1662937982" name=""/>
+                    <pic:cNvPicPr/>
+                  </pic:nvPicPr>
+                  <pic:blipFill>
+                    <a:blip r:embed="rId8"/>
+                    <a:stretch>
+                      <a:fillRect/>
+                    </a:stretch>
+                  </pic:blipFill>
+                  <pic:spPr>
+                    <a:xfrm>
+                      <a:off x="0" y="0"/>
+                      <a:ext cx="5731510" cy="351155"/>
+                    </a:xfrm>
+                    <a:prstGeom prst="rect">
+                      <a:avLst/>
+                    </a:prstGeom>
+                  </pic:spPr>
+                </pic:pic>
+              </a:graphicData>
+            </a:graphic>
+          </wp:inline>
+        </w:drawing>
+      </w:r>
+    </w:p>
+    <w:p>
+      <w:pPr>
+        <w:rPr>
+          <w:rFonts w:ascii="Bahnschrift SemiLight" w:hAnsi="Bahnschrift SemiLight"/>
+        </w:rPr>
+      </w:pPr>
+      <w:r>
+        <w:rPr>
+          <w:rFonts w:ascii="Bahnschrift SemiLight" w:hAnsi="Bahnschrift SemiLight"/>
+        </w:rPr>
+        <w:t>Top 10 scores show a plateau in accuracy metric around 98% never reaching 99%, I should aim for at least 95% or higher to achieve a ‘good result’.</w:t>
+      </w:r>
+    </w:p>
+    <w:p>
+      <w:pPr>
+        <w:rPr>
+          <w:rFonts w:ascii="Bahnschrift SemiLight" w:hAnsi="Bahnschrift SemiLight"/>
+        </w:rPr>
+      </w:pPr>
+      <w:r>
+        <w:rPr>
+          <w:rFonts w:ascii="Bahnschrift SemiLight" w:hAnsi="Bahnschrift SemiLight"/>
+        </w:rPr>
+        <w:t>At the moment, it is far from a decent result and holds last place position. I plan to sacrifice all other metrics to optimize purely on accuracy</w:t>
+      </w:r>
+      <w:r>
+        <w:rPr>
+          <w:rFonts w:ascii="Bahnschrift SemiLight" w:hAnsi="Bahnschrift SemiLight"/>
+        </w:rPr>
+        <w:t xml:space="preserve"> as it is the only metric that is measured and matters in this exact context.</w:t>
+      </w:r>
+    </w:p>
+    <w:p>
+      <w:pPr>
+        <w:rPr>
+          <w:rFonts w:ascii="Bahnschrift SemiLight" w:hAnsi="Bahnschrift SemiLight"/>
+        </w:rPr>
+      </w:pPr>
+    </w:p>
+    <w:p>
+      <w:pPr>
+        <w:rPr>
+          <w:rFonts w:ascii="Bahnschrift SemiLight" w:hAnsi="Bahnschrift SemiLight"/>
+        </w:rPr>
+      </w:pPr>
+      <w:r>
+        <w:rPr>
+          <w:rFonts w:ascii="Bahnschrift SemiLight" w:hAnsi="Bahnschrift SemiLight"/>
+        </w:rPr>
+        <w:t>I evaluated the performance of this model as it is currently with the various metrics.</w:t>
+      </w:r>
+      <w:r>
+        <w:rPr>
+          <w:rFonts w:ascii="Bahnschrift SemiLight" w:hAnsi="Bahnschrift SemiLight"/>
+        </w:rPr>
+        <w:t xml:space="preserve"> </w:t>
+      </w:r>
+      <w:r>
+        <w:rPr>
+          <w:rFonts w:ascii="Bahnschrift SemiLight" w:hAnsi="Bahnschrift SemiLight"/>
+        </w:rPr>
+        <w:t>I ran evaluation on 12,732 images within the training 80/20 split.</w:t>
+      </w:r>
+    </w:p>
+    <w:p>
+      <w:pPr>
+        <w:rPr>
+          <w:rFonts w:ascii="Bahnschrift SemiLight" w:hAnsi="Bahnschrift SemiLight"/>
+        </w:rPr>
+      </w:pPr>
+      <w:r>
+        <w:rPr>
+          <w:noProof/>
+        </w:rPr>
+        <w:drawing>
+          <wp:inline distT="0" distB="0" distL="0" distR="0" wp14:anchorId="1F01067F" wp14:editId="2973AA0A">
+            <wp:extent cx="2932629" cy="2232660"/>
+            <wp:effectExtent l="0" t="0" r="1270" b="0"/>
+            <wp:docPr id="112284545" name="Picture 1"/>
+            <wp:cNvGraphicFramePr>
+              <a:graphicFrameLocks xmlns:a="http://schemas.openxmlformats.org/drawingml/2006/main" noChangeAspect="1"/>
+            </wp:cNvGraphicFramePr>
+            <a:graphic xmlns:a="http://schemas.openxmlformats.org/drawingml/2006/main">
+              <a:graphicData uri="http://schemas.openxmlformats.org/drawingml/2006/picture">
+                <pic:pic xmlns:pic="http://schemas.openxmlformats.org/drawingml/2006/picture">
+                  <pic:nvPicPr>
+                    <pic:cNvPr id="112284545" name=""/>
+                    <pic:cNvPicPr/>
+                  </pic:nvPicPr>
+                  <pic:blipFill>
+                    <a:blip r:embed="rId9"/>
+                    <a:stretch>
+                      <a:fillRect/>
+                    </a:stretch>
+                  </pic:blipFill>
+                  <pic:spPr>
+                    <a:xfrm>
+                      <a:off x="0" y="0"/>
+                      <a:ext cx="2938635" cy="2237232"/>
+                    </a:xfrm>
+                    <a:prstGeom prst="rect">
+                      <a:avLst/>
+                    </a:prstGeom>
+                  </pic:spPr>
+                </pic:pic>
+              </a:graphicData>
+            </a:graphic>
+          </wp:inline>
+        </w:drawing>
+      </w:r>
+      <w:r>
+        <w:rPr>
+          <w:noProof/>
+        </w:rPr>
+        <w:t xml:space="preserve"> </w:t>
+      </w:r>
+    </w:p>
+    <w:p>
+      <w:pPr>
+        <w:rPr>
+          <w:rFonts w:ascii="Bahnschrift SemiLight" w:hAnsi="Bahnschrift SemiLight"/>
+        </w:rPr>
+      </w:pPr>
+      <w:r>
+        <w:rPr>
+          <w:rFonts w:ascii="Bahnschrift SemiLight" w:hAnsi="Bahnschrift SemiLight"/>
+        </w:rPr>
+        <w:lastRenderedPageBreak/>
+        <w:t xml:space="preserve">The model managed to score a validation loss score of 0.7318, this value represents the measurement of the model’s prediction error using the loss function. </w:t>
+      </w:r>
+      <w:r>
+        <w:rPr>
+          <w:rFonts w:ascii="Bahnschrift SemiLight" w:hAnsi="Bahnschrift SemiLight"/>
+        </w:rPr>
+        <w:t>It is preferred to have this value as low as possible.</w:t>
+      </w:r>
+    </w:p>
+    <w:p>
+      <w:pPr>
+        <w:rPr>
+          <w:rFonts w:ascii="Bahnschrift SemiLight" w:hAnsi="Bahnschrift SemiLight"/>
+        </w:rPr>
+      </w:pPr>
+      <w:r>
+        <w:rPr>
+          <w:rFonts w:ascii="Bahnschrift SemiLight" w:hAnsi="Bahnschrift SemiLight"/>
+        </w:rPr>
+        <w:t xml:space="preserve">The measured accuracy comes out to </w:t>
+      </w:r>
+      <w:r>
+        <w:rPr>
+          <w:rFonts w:ascii="Bahnschrift SemiLight" w:hAnsi="Bahnschrift SemiLight"/>
+        </w:rPr>
+        <w:t>~</w:t>
+      </w:r>
+      <w:r>
+        <w:rPr>
+          <w:rFonts w:ascii="Bahnschrift SemiLight" w:hAnsi="Bahnschrift SemiLight"/>
+        </w:rPr>
+        <w:t>74.</w:t>
+      </w:r>
+      <w:r>
+        <w:rPr>
+          <w:rFonts w:ascii="Bahnschrift SemiLight" w:hAnsi="Bahnschrift SemiLight"/>
+        </w:rPr>
+        <w:t>82</w:t>
+      </w:r>
+      <w:r>
+        <w:rPr>
+          <w:rFonts w:ascii="Bahnschrift SemiLight" w:hAnsi="Bahnschrift SemiLight"/>
+        </w:rPr>
+        <w:t>% which is mediocre at best. The scores on the Kaggle leaderboards shows figures nearing 90% to 98% accuracy so my model is still far from scoring a good score.</w:t>
+      </w:r>
+      <w:r>
+        <w:rPr>
+          <w:rFonts w:ascii="Bahnschrift SemiLight" w:hAnsi="Bahnschrift SemiLight"/>
+        </w:rPr>
+        <w:t xml:space="preserve"> This metric measures the total portion of images correctly classified.</w:t>
+      </w:r>
+    </w:p>
+    <w:p>
+      <w:pPr>
+        <w:rPr>
+          <w:rFonts w:ascii="Bahnschrift SemiLight" w:hAnsi="Bahnschrift SemiLight"/>
+        </w:rPr>
+      </w:pPr>
+      <w:r>
+        <w:rPr>
+          <w:rFonts w:ascii="Bahnschrift SemiLight" w:hAnsi="Bahnschrift SemiLight"/>
+        </w:rPr>
+        <w:t>Precision came out to be 7</w:t>
+      </w:r>
+      <w:r>
+        <w:rPr>
+          <w:rFonts w:ascii="Bahnschrift SemiLight" w:hAnsi="Bahnschrift SemiLight"/>
+        </w:rPr>
+        <w:t>8.12</w:t>
+      </w:r>
+      <w:r>
+        <w:rPr>
+          <w:rFonts w:ascii="Bahnschrift SemiLight" w:hAnsi="Bahnschrift SemiLight"/>
+        </w:rPr>
+        <w:t xml:space="preserve">% which is again decent but is not what is the most relevant to the purpose of this project. </w:t>
+      </w:r>
+      <w:r>
+        <w:rPr>
+          <w:rFonts w:ascii="Bahnschrift SemiLight" w:hAnsi="Bahnschrift SemiLight"/>
+        </w:rPr>
+        <w:t xml:space="preserve">I believe it would be most beneficial if I could sacrifice this score for a much higher accuracy score. </w:t>
+      </w:r>
+      <w:r>
+        <w:rPr>
+          <w:rFonts w:ascii="Bahnschrift SemiLight" w:hAnsi="Bahnschrift SemiLight"/>
+        </w:rPr>
+        <w:t>To recap, the precision metric measures</w:t>
+      </w:r>
+      <w:r>
+        <w:rPr>
+          <w:rFonts w:ascii="Bahnschrift SemiLight" w:hAnsi="Bahnschrift SemiLight"/>
+        </w:rPr>
+        <w:t xml:space="preserve"> the proportion of correct predictions in a class, that actually were of that class.</w:t>
+      </w:r>
+    </w:p>
+    <w:p>
+      <w:pPr>
+        <w:rPr>
+          <w:rFonts w:ascii="Bahnschrift SemiLight" w:hAnsi="Bahnschrift SemiLight"/>
+        </w:rPr>
+      </w:pPr>
+      <w:r>
+        <w:rPr>
+          <w:rFonts w:ascii="Bahnschrift SemiLight" w:hAnsi="Bahnschrift SemiLight"/>
+        </w:rPr>
+        <w:t xml:space="preserve">Recall scored again a relatively good score at </w:t>
+      </w:r>
+      <w:r>
+        <w:rPr>
+          <w:rFonts w:ascii="Bahnschrift SemiLight" w:hAnsi="Bahnschrift SemiLight"/>
+        </w:rPr>
+        <w:t>74.</w:t>
+      </w:r>
+      <w:r>
+        <w:rPr>
+          <w:rFonts w:ascii="Bahnschrift SemiLight" w:hAnsi="Bahnschrift SemiLight"/>
+        </w:rPr>
+        <w:t>91</w:t>
+      </w:r>
+      <w:r>
+        <w:rPr>
+          <w:rFonts w:ascii="Bahnschrift SemiLight" w:hAnsi="Bahnschrift SemiLight"/>
+        </w:rPr>
+        <w:t>%;</w:t>
+      </w:r>
+      <w:r>
+        <w:rPr>
+          <w:rFonts w:ascii="Bahnschrift SemiLight" w:hAnsi="Bahnschrift SemiLight"/>
+        </w:rPr>
+        <w:t xml:space="preserve"> it measures the total portion of a class that was correctly identified.</w:t>
+      </w:r>
+      <w:r>
+        <w:rPr>
+          <w:rFonts w:ascii="Bahnschrift SemiLight" w:hAnsi="Bahnschrift SemiLight"/>
+        </w:rPr>
+        <w:t xml:space="preserve"> Again, this metric while scoring relatively well is not the goal of the </w:t>
+      </w:r>
+      <w:r>
+        <w:rPr>
+          <w:rFonts w:ascii="Bahnschrift SemiLight" w:hAnsi="Bahnschrift SemiLight"/>
+        </w:rPr>
+        <w:t>model and</w:t>
+      </w:r>
+      <w:r>
+        <w:rPr>
+          <w:rFonts w:ascii="Bahnschrift SemiLight" w:hAnsi="Bahnschrift SemiLight"/>
+        </w:rPr>
+        <w:t xml:space="preserve"> should be sacrificed for a higher accuracy metric if possible.</w:t>
+      </w:r>
+    </w:p>
+    <w:p>
+      <w:pPr>
+        <w:rPr>
+          <w:rFonts w:ascii="Bahnschrift SemiLight" w:hAnsi="Bahnschrift SemiLight"/>
+        </w:rPr>
+      </w:pPr>
+      <w:r>
+        <w:rPr>
+          <w:rFonts w:ascii="Bahnschrift SemiLight" w:hAnsi="Bahnschrift SemiLight"/>
+        </w:rPr>
+        <w:t>F1 scored 7</w:t>
+      </w:r>
+      <w:r>
+        <w:rPr>
+          <w:rFonts w:ascii="Bahnschrift SemiLight" w:hAnsi="Bahnschrift SemiLight"/>
+        </w:rPr>
+        <w:t>4.82</w:t>
+      </w:r>
+      <w:r>
+        <w:rPr>
+          <w:rFonts w:ascii="Bahnschrift SemiLight" w:hAnsi="Bahnschrift SemiLight"/>
+        </w:rPr>
+        <w:t>% which is again relatively good but not the goal, it combines recall and precision into a single metric which are both metrics useless for this project.</w:t>
+      </w:r>
+    </w:p>
+    <w:p>
+      <w:pPr>
+        <w:rPr>
+          <w:rFonts w:ascii="Bahnschrift SemiLight" w:hAnsi="Bahnschrift SemiLight"/>
+        </w:rPr>
+      </w:pPr>
+      <w:r>
+        <w:rPr>
+          <w:rFonts w:ascii="Bahnschrift SemiLight" w:hAnsi="Bahnschrift SemiLight"/>
+        </w:rPr>
+        <w:t xml:space="preserve">These metrics I took primarily of the weighted average as this variant of the metrics averages the class metrics while also accounting for the number of validation image cases in each class. This generates a slightly </w:t>
+      </w:r>
+      <w:proofErr w:type="gramStart"/>
+      <w:r>
+        <w:rPr>
+          <w:rFonts w:ascii="Bahnschrift SemiLight" w:hAnsi="Bahnschrift SemiLight"/>
+        </w:rPr>
+        <w:t>more fair</w:t>
+      </w:r>
+      <w:proofErr w:type="gramEnd"/>
+      <w:r>
+        <w:rPr>
+          <w:rFonts w:ascii="Bahnschrift SemiLight" w:hAnsi="Bahnschrift SemiLight"/>
+        </w:rPr>
+        <w:t xml:space="preserve"> metric when classes are imbalanced in representation (which applies to the classes present in this project).</w:t>
+      </w:r>
+    </w:p>
+    <w:p>
+      <w:pPr>
+        <w:rPr>
+          <w:rFonts w:ascii="Bahnschrift SemiLight" w:hAnsi="Bahnschrift SemiLight"/>
+        </w:rPr>
+      </w:pPr>
+      <w:r>
+        <w:rPr>
+          <w:rFonts w:ascii="Bahnschrift SemiLight" w:hAnsi="Bahnschrift SemiLight"/>
+        </w:rPr>
+        <w:drawing>
+          <wp:inline distT="0" distB="0" distL="0" distR="0" wp14:anchorId="7EB10FF9" wp14:editId="58E80877">
+            <wp:extent cx="3636844" cy="3185160"/>
+            <wp:effectExtent l="0" t="0" r="1905" b="0"/>
+            <wp:docPr id="144774107" name="Picture 1"/>
+            <wp:cNvGraphicFramePr>
+              <a:graphicFrameLocks xmlns:a="http://schemas.openxmlformats.org/drawingml/2006/main" noChangeAspect="1"/>
+            </wp:cNvGraphicFramePr>
+            <a:graphic xmlns:a="http://schemas.openxmlformats.org/drawingml/2006/main">
+              <a:graphicData uri="http://schemas.openxmlformats.org/drawingml/2006/picture">
+                <pic:pic xmlns:pic="http://schemas.openxmlformats.org/drawingml/2006/picture">
+                  <pic:nvPicPr>
+                    <pic:cNvPr id="144774107" name=""/>
+                    <pic:cNvPicPr/>
+                  </pic:nvPicPr>
+                  <pic:blipFill>
+                    <a:blip r:embed="rId10"/>
+                    <a:stretch>
+                      <a:fillRect/>
+                    </a:stretch>
+                  </pic:blipFill>
+                  <pic:spPr>
+                    <a:xfrm>
+                      <a:off x="0" y="0"/>
+                      <a:ext cx="3645205" cy="3192483"/>
+                    </a:xfrm>
+                    <a:prstGeom prst="rect">
+                      <a:avLst/>
+                    </a:prstGeom>
+                  </pic:spPr>
+                </pic:pic>
+              </a:graphicData>
+            </a:graphic>
+          </wp:inline>
+        </w:drawing>
+      </w:r>
+    </w:p>
+    <w:p>
+      <w:pPr>
+        <w:rPr>
+          <w:rFonts w:ascii="Bahnschrift SemiLight" w:hAnsi="Bahnschrift SemiLight"/>
+        </w:rPr>
+      </w:pPr>
+      <w:r>
+        <w:rPr>
+          <w:rFonts w:ascii="Bahnschrift SemiLight" w:hAnsi="Bahnschrift SemiLight"/>
+        </w:rPr>
+        <w:lastRenderedPageBreak/>
+        <w:t>This confusion matrix was also generated by the code for the mode.</w:t>
+      </w:r>
+    </w:p>
+    <w:p>
+      <w:pPr>
+        <w:rPr>
+          <w:rFonts w:ascii="Bahnschrift SemiLight" w:hAnsi="Bahnschrift SemiLight"/>
+        </w:rPr>
+      </w:pPr>
+      <w:r>
+        <w:rPr>
+          <w:rFonts w:ascii="Bahnschrift SemiLight" w:hAnsi="Bahnschrift SemiLight"/>
+        </w:rPr>
+        <w:t>A confusion matrix is useful because it can tell us the performance of each class individually portrayed in an easy to consume way.</w:t>
+      </w:r>
+    </w:p>
+    <w:p>
+      <w:pPr>
+        <w:rPr>
+          <w:rFonts w:ascii="Bahnschrift SemiLight" w:hAnsi="Bahnschrift SemiLight"/>
+        </w:rPr>
+      </w:pPr>
+      <w:r>
+        <w:rPr>
+          <w:rFonts w:ascii="Bahnschrift SemiLight" w:hAnsi="Bahnschrift SemiLight"/>
+        </w:rPr>
+        <w:t xml:space="preserve">The class with the </w:t>
+      </w:r>
+      <w:r>
+        <w:rPr>
+          <w:rFonts w:ascii="Bahnschrift SemiLight" w:hAnsi="Bahnschrift SemiLight"/>
+        </w:rPr>
+        <w:t>‘</w:t>
+      </w:r>
+      <w:r>
+        <w:rPr>
+          <w:rFonts w:ascii="Bahnschrift SemiLight" w:hAnsi="Bahnschrift SemiLight"/>
+        </w:rPr>
+        <w:t>best</w:t>
+      </w:r>
+      <w:r>
+        <w:rPr>
+          <w:rFonts w:ascii="Bahnschrift SemiLight" w:hAnsi="Bahnschrift SemiLight"/>
+        </w:rPr>
+        <w:t>’</w:t>
+      </w:r>
+      <w:r>
+        <w:rPr>
+          <w:rFonts w:ascii="Bahnschrift SemiLight" w:hAnsi="Bahnschrift SemiLight"/>
+        </w:rPr>
+        <w:t xml:space="preserve"> performance was CatFace. It has both high recall and high precision</w:t>
+      </w:r>
+      <w:r>
+        <w:rPr>
+          <w:rFonts w:ascii="Bahnschrift SemiLight" w:hAnsi="Bahnschrift SemiLight"/>
+        </w:rPr>
+        <w:t xml:space="preserve"> as we can tell by the diagonal value divided by either the row sum or column sum.</w:t>
+      </w:r>
+    </w:p>
+    <w:p>
+      <w:pPr>
+        <w:rPr>
+          <w:rFonts w:ascii="Bahnschrift SemiLight" w:hAnsi="Bahnschrift SemiLight"/>
+        </w:rPr>
+      </w:pPr>
+      <w:r>
+        <w:rPr>
+          <w:rFonts w:ascii="Bahnschrift SemiLight" w:hAnsi="Bahnschrift SemiLight"/>
+        </w:rPr>
+        <w:t>The ‘worst’ performing class was DogNose which has a rather low recall value as well as gets misclassified a lot.</w:t>
+      </w:r>
+    </w:p>
+    <w:p>
+      <w:pPr>
+        <w:rPr>
+          <w:rFonts w:ascii="Bahnschrift SemiLight" w:hAnsi="Bahnschrift SemiLight"/>
+        </w:rPr>
+      </w:pPr>
+      <w:r>
+        <w:rPr>
+          <w:rFonts w:ascii="Bahnschrift SemiLight" w:hAnsi="Bahnschrift SemiLight"/>
+        </w:rPr>
+        <w:t>One important thing to note, ‘best’ and ‘worst’ depends on the definition, and for the above I used the general across the board metrics to define them as best or worst. For the purpose of the assessment ‘best’ would refer to the highest accuracy score ignoring all else.</w:t>
+      </w:r>
+    </w:p>
+    <w:p>
+      <w:pPr>
+        <w:rPr>
+          <w:rFonts w:ascii="Bahnschrift SemiLight" w:hAnsi="Bahnschrift SemiLight"/>
+        </w:rPr>
+      </w:pPr>
+      <w:r>
+        <w:rPr>
+          <w:rFonts w:ascii="Bahnschrift SemiLight" w:hAnsi="Bahnschrift SemiLight"/>
+        </w:rPr>
+        <w:t xml:space="preserve">The colouring displays the population of the </w:t>
+      </w:r>
+      <w:r>
+        <w:rPr>
+          <w:rFonts w:ascii="Bahnschrift SemiLight" w:hAnsi="Bahnschrift SemiLight"/>
+        </w:rPr>
+        <w:t>class;</w:t>
+      </w:r>
+      <w:r>
+        <w:rPr>
+          <w:rFonts w:ascii="Bahnschrift SemiLight" w:hAnsi="Bahnschrift SemiLight"/>
+        </w:rPr>
+        <w:t xml:space="preserve"> deeper darker coloured tiles have a higher population than lighter coloured tiles.</w:t>
+      </w:r>
+    </w:p>
+    <w:p>
+      <w:pPr>
+        <w:rPr>
+          <w:rFonts w:ascii="Bahnschrift SemiLight" w:hAnsi="Bahnschrift SemiLight"/>
+        </w:rPr>
+      </w:pPr>
+      <w:r>
+        <w:rPr>
+          <w:rFonts w:ascii="Bahnschrift SemiLight" w:hAnsi="Bahnschrift SemiLight"/>
+        </w:rPr>
+        <w:t>Accuracy can be calculated by summing up the diagonal tiles then divided by the total number of samples, which corresponds to the accuracy metric we generated above in the classification report.</w:t>
+      </w:r>
+    </w:p>
+    <w:p>
+      <w:pPr>
+        <w:rPr>
+          <w:rFonts w:ascii="Bahnschrift SemiLight" w:hAnsi="Bahnschrift SemiLight"/>
+        </w:rPr>
+      </w:pPr>
+      <w:r>
+        <w:rPr>
+          <w:rFonts w:ascii="Bahnschrift SemiLight" w:hAnsi="Bahnschrift SemiLight"/>
+        </w:rPr>
+        <w:t>Overall, other metrics remain good across the board, which put bluntly is a problem for this model simply because the goal is not to have good across the board metrics in all measures but rather to specialize and excel is just one metric, accuracy.</w:t>
+      </w:r>
+    </w:p>
+    <w:p>
+      <w:pPr>
+        <w:rPr>
+          <w:rFonts w:ascii="Bahnschrift SemiLight" w:hAnsi="Bahnschrift SemiLight"/>
+        </w:rPr>
+      </w:pPr>
+      <w:r>
+        <w:rPr>
+          <w:rFonts w:ascii="Bahnschrift SemiLight" w:hAnsi="Bahnschrift SemiLight"/>
+        </w:rPr>
+        <w:t>So, moving forward it is optimal for me to discard all other metrics and funnel the model into generating the highest accuracy metric I can possibly get it to have.</w:t>
+      </w:r>
+    </w:p>
+    <w:p>
+      <w:pPr>
+        <w:rPr>
+          <w:rFonts w:ascii="Bahnschrift SemiLight" w:hAnsi="Bahnschrift SemiLight"/>
+        </w:rPr>
+      </w:pPr>
+      <w:r>
+        <w:rPr>
+          <w:rFonts w:ascii="Bahnschrift SemiLight" w:hAnsi="Bahnschrift SemiLight"/>
+        </w:rPr>
+        <w:t xml:space="preserve">Another thing to mention, the score I received on Kaggle generally reflects the accuracy of my model to a good degree. However, it should be noted that different databases and image sets introduces variance always. The metrics the model scores on </w:t>
+      </w:r>
+      <w:r>
+        <w:rPr>
+          <w:rFonts w:ascii="Bahnschrift SemiLight" w:hAnsi="Bahnschrift SemiLight"/>
+        </w:rPr>
+        <w:t>this</w:t>
+      </w:r>
+      <w:r>
+        <w:rPr>
+          <w:rFonts w:ascii="Bahnschrift SemiLight" w:hAnsi="Bahnschrift SemiLight"/>
+        </w:rPr>
+        <w:t xml:space="preserve"> training image set may not always mean it will translate well into another image set. Generalisation techniques like horizontal flipping and slightly rotating the images helps but cannot </w:t>
+      </w:r>
+      <w:r>
+        <w:rPr>
+          <w:rFonts w:ascii="Bahnschrift SemiLight" w:hAnsi="Bahnschrift SemiLight"/>
+        </w:rPr>
+        <w:t xml:space="preserve">provide the guarantee that the model will do well in all </w:t>
+      </w:r>
+      <w:proofErr w:type="gramStart"/>
+      <w:r>
+        <w:rPr>
+          <w:rFonts w:ascii="Bahnschrift SemiLight" w:hAnsi="Bahnschrift SemiLight"/>
+        </w:rPr>
+        <w:t>image</w:t>
+      </w:r>
+      <w:proofErr w:type="gramEnd"/>
+      <w:r>
+        <w:rPr>
+          <w:rFonts w:ascii="Bahnschrift SemiLight" w:hAnsi="Bahnschrift SemiLight"/>
+        </w:rPr>
+        <w:t xml:space="preserve"> sets due to how fundamentally the machine learns.</w:t>
+      </w:r>
+    </w:p>
+    <w:p>
+      <w:pPr>
+        <w:rPr>
+          <w:rFonts w:ascii="Bahnschrift SemiLight" w:hAnsi="Bahnschrift SemiLight"/>
+        </w:rPr>
+      </w:pPr>
+      <w:r>
+        <w:rPr>
+          <w:rFonts w:ascii="Bahnschrift SemiLight" w:hAnsi="Bahnschrift SemiLight"/>
+        </w:rPr>
+        <w:t>Using the Kaggle submission as an example, perhaps there is a little variation between the test image set and the training image set which will cause a mismatch of metrics.</w:t>
+      </w:r>
+      <w:r>
+        <w:rPr>
+          <w:rFonts w:ascii="Bahnschrift SemiLight" w:hAnsi="Bahnschrift SemiLight"/>
+        </w:rPr>
+        <w:t xml:space="preserve"> This is simply a theory, the differences between the Kaggle image set and the training image set has not been investigated and so should be taken with a grain of salt.</w:t>
+      </w:r>
+    </w:p>
+    <w:p>
+      <w:pPr>
+        <w:rPr>
+          <w:rFonts w:ascii="Bahnschrift SemiLight" w:hAnsi="Bahnschrift SemiLight"/>
+        </w:rPr>
+      </w:pPr>
+      <w:r>
+        <w:rPr>
+          <w:rFonts w:ascii="Bahnschrift SemiLight" w:hAnsi="Bahnschrift SemiLight"/>
+        </w:rPr>
+        <w:br w:type="page"/>
+      </w:r>
     </w:p>
     <w:p>
       <w:pPr>
@@ -1912,6 +2774,7 @@
           <w:sz w:val="28"/>
           <w:szCs w:val="28"/>
         </w:rPr>
+        <w:lastRenderedPageBreak/>
         <w:t>Task 6:</w:t>
       </w:r>
     </w:p>

</xml_diff>

<commit_message>
Halfway on task 6 report
Saving before beginning large optimizations and edits
</commit_message>
<xml_diff>
--- a/Report.docx
+++ b/Report.docx
@@ -53,14 +53,12 @@
         </w:rPr>
         <w:t xml:space="preserve">Kaggle username: </w:t>
       </w:r>
-      <w:proofErr w:type="spellStart"/>
       <w:r>
         <w:rPr>
           <w:rFonts w:ascii="Bahnschrift SemiLight" w:hAnsi="Bahnschrift SemiLight"/>
         </w:rPr>
         <w:t>huyinsong</w:t>
       </w:r>
-      <w:proofErr w:type="spellEnd"/>
       <w:r>
         <w:rPr>
           <w:rFonts w:ascii="Bahnschrift SemiLight" w:hAnsi="Bahnschrift SemiLight"/>
@@ -186,21 +184,7 @@
         <w:rPr>
           <w:rFonts w:ascii="Bahnschrift SemiLight" w:hAnsi="Bahnschrift SemiLight"/>
         </w:rPr>
-        <w:t xml:space="preserve"> ‘</w:t>
-      </w:r>
-      <w:proofErr w:type="gramStart"/>
-      <w:r>
-        <w:rPr>
-          <w:rFonts w:ascii="Bahnschrift SemiLight" w:hAnsi="Bahnschrift SemiLight"/>
-        </w:rPr>
-        <w:t>image</w:t>
-      </w:r>
-      <w:proofErr w:type="gramEnd"/>
-      <w:r>
-        <w:rPr>
-          <w:rFonts w:ascii="Bahnschrift SemiLight" w:hAnsi="Bahnschrift SemiLight"/>
-        </w:rPr>
-        <w:t>_id’ is a 64-bit integer variable while ‘class’ is a string. This means I will need to encode the class feature into a numerical variable in order for the machine to feasibly use it.</w:t>
+        <w:t xml:space="preserve"> ‘image_id’ is a 64-bit integer variable while ‘class’ is a string. This means I will need to encode the class feature into a numerical variable in order for the machine to feasibly use it.</w:t>
       </w:r>
     </w:p>
     <w:p>
@@ -880,7 +864,7 @@
                     <pic:cNvPicPr/>
                   </pic:nvPicPr>
                   <pic:blipFill>
-                    <a:blip r:embed="rId4"/>
+                    <a:blip r:embed="rId5"/>
                     <a:stretch>
                       <a:fillRect/>
                     </a:stretch>
@@ -991,7 +975,7 @@
                     </pic:cNvPicPr>
                   </pic:nvPicPr>
                   <pic:blipFill>
-                    <a:blip r:embed="rId5">
+                    <a:blip r:embed="rId6">
                       <a:extLst>
                         <a:ext uri="{28A0092B-C50C-407E-A947-70E740481C1C}">
                           <a14:useLocalDpi xmlns:a14="http://schemas.microsoft.com/office/drawing/2010/main" val="0"/>
@@ -1232,6 +1216,19 @@
           <w:rFonts w:ascii="Bahnschrift SemiLight" w:hAnsi="Bahnschrift SemiLight"/>
         </w:rPr>
       </w:pPr>
+      <w:r>
+        <w:rPr>
+          <w:rFonts w:ascii="Bahnschrift SemiLight" w:hAnsi="Bahnschrift SemiLight"/>
+        </w:rPr>
+        <w:t>Update: I found a small leakage where I specified that I had removed the duplicates from the local memory database of the kernel, but later on in the code I had not. The effect is negligible for such a small number of images but should try to have it removed if I can.</w:t>
+      </w:r>
+    </w:p>
+    <w:p>
+      <w:pPr>
+        <w:rPr>
+          <w:rFonts w:ascii="Bahnschrift SemiLight" w:hAnsi="Bahnschrift SemiLight"/>
+        </w:rPr>
+      </w:pPr>
     </w:p>
     <w:p>
       <w:pPr>
@@ -1278,6 +1275,7 @@
         <w:rPr>
           <w:rFonts w:ascii="Bahnschrift SemiLight" w:hAnsi="Bahnschrift SemiLight"/>
         </w:rPr>
+        <w:lastRenderedPageBreak/>
         <w:t xml:space="preserve">To briefly describe the architecture and components; I pass it the 128 x 128 </w:t>
       </w:r>
       <w:r>
@@ -1320,28 +1318,7 @@
         <w:rPr>
           <w:rFonts w:ascii="Bahnschrift SemiLight" w:hAnsi="Bahnschrift SemiLight"/>
         </w:rPr>
-        <w:t xml:space="preserve"> Next it goes to the Activation </w:t>
-      </w:r>
-      <w:proofErr w:type="spellStart"/>
-      <w:r>
-        <w:rPr>
-          <w:rFonts w:ascii="Bahnschrift SemiLight" w:hAnsi="Bahnschrift SemiLight"/>
-        </w:rPr>
-        <w:t>ReLU</w:t>
-      </w:r>
-      <w:proofErr w:type="spellEnd"/>
-      <w:r>
-        <w:rPr>
-          <w:rFonts w:ascii="Bahnschrift SemiLight" w:hAnsi="Bahnschrift SemiLight"/>
-        </w:rPr>
-        <w:t xml:space="preserve"> function where CNN learns complex </w:t>
-      </w:r>
-      <w:r>
-        <w:rPr>
-          <w:rFonts w:ascii="Bahnschrift SemiLight" w:hAnsi="Bahnschrift SemiLight"/>
-        </w:rPr>
-        <w:lastRenderedPageBreak/>
-        <w:t>patterns of the image that couldn’t be captured with just the Convolutional layer.</w:t>
+        <w:t xml:space="preserve"> Next it goes to the Activation ReLU function where CNN learns complex patterns of the image that couldn’t be captured with just the Convolutional layer.</w:t>
       </w:r>
       <w:r>
         <w:rPr>
@@ -1384,21 +1361,7 @@
         <w:rPr>
           <w:rFonts w:ascii="Bahnschrift SemiLight" w:hAnsi="Bahnschrift SemiLight"/>
         </w:rPr>
-        <w:t xml:space="preserve"> target classes as I’ve described in task 1, with </w:t>
-      </w:r>
-      <w:proofErr w:type="spellStart"/>
-      <w:r>
-        <w:rPr>
-          <w:rFonts w:ascii="Bahnschrift SemiLight" w:hAnsi="Bahnschrift SemiLight"/>
-        </w:rPr>
-        <w:t>ReLU</w:t>
-      </w:r>
-      <w:proofErr w:type="spellEnd"/>
-      <w:r>
-        <w:rPr>
-          <w:rFonts w:ascii="Bahnschrift SemiLight" w:hAnsi="Bahnschrift SemiLight"/>
-        </w:rPr>
-        <w:t xml:space="preserve"> as the activation and prioritizes the index with the highest output score.</w:t>
+        <w:t xml:space="preserve"> target classes as I’ve described in task 1, with ReLU as the activation and prioritizes the index with the highest output score.</w:t>
       </w:r>
     </w:p>
     <w:p>
@@ -1624,27 +1587,27 @@
         <w:rPr>
           <w:rFonts w:ascii="Bahnschrift SemiLight" w:hAnsi="Bahnschrift SemiLight"/>
         </w:rPr>
-        <w:t xml:space="preserve"> These techniques should boost the generalisation of the model and help it perform more accurately when benchmarked on the test cases.</w:t>
-      </w:r>
-    </w:p>
-    <w:p>
-      <w:pPr>
-        <w:rPr>
-          <w:rFonts w:ascii="Bahnschrift SemiLight" w:hAnsi="Bahnschrift SemiLight"/>
-        </w:rPr>
-      </w:pPr>
-      <w:r>
-        <w:rPr>
-          <w:rFonts w:ascii="Bahnschrift SemiLight" w:hAnsi="Bahnschrift SemiLight"/>
-        </w:rPr>
-        <w:t xml:space="preserve">Given that the metric being measured in the Kaggle competition is accuracy, I believe I should refine my training strategy a little towards aiming for the highest </w:t>
+        <w:t xml:space="preserve"> These </w:t>
       </w:r>
       <w:r>
         <w:rPr>
           <w:rFonts w:ascii="Bahnschrift SemiLight" w:hAnsi="Bahnschrift SemiLight"/>
         </w:rPr>
         <w:lastRenderedPageBreak/>
-        <w:t>accuracy I could possibly get even at the cost of the other performance metrics and measures.</w:t>
+        <w:t>techniques should boost the generalisation of the model and help it perform more accurately when benchmarked on the test cases.</w:t>
+      </w:r>
+    </w:p>
+    <w:p>
+      <w:pPr>
+        <w:rPr>
+          <w:rFonts w:ascii="Bahnschrift SemiLight" w:hAnsi="Bahnschrift SemiLight"/>
+        </w:rPr>
+      </w:pPr>
+      <w:r>
+        <w:rPr>
+          <w:rFonts w:ascii="Bahnschrift SemiLight" w:hAnsi="Bahnschrift SemiLight"/>
+        </w:rPr>
+        <w:t>Given that the metric being measured in the Kaggle competition is accuracy, I believe I should refine my training strategy a little towards aiming for the highest accuracy I could possibly get even at the cost of the other performance metrics and measures.</w:t>
       </w:r>
     </w:p>
     <w:p>
@@ -1706,7 +1669,7 @@
                     <pic:cNvPicPr/>
                   </pic:nvPicPr>
                   <pic:blipFill>
-                    <a:blip r:embed="rId6"/>
+                    <a:blip r:embed="rId7"/>
                     <a:stretch>
                       <a:fillRect/>
                     </a:stretch>
@@ -1950,6 +1913,7 @@
         <w:rPr>
           <w:rFonts w:ascii="Bahnschrift SemiLight" w:hAnsi="Bahnschrift SemiLight"/>
         </w:rPr>
+        <w:lastRenderedPageBreak/>
         <w:t xml:space="preserve">I have generated a </w:t>
       </w:r>
       <w:r>
@@ -1993,14 +1957,7 @@
         <w:rPr>
           <w:rFonts w:ascii="Bahnschrift SemiLight" w:hAnsi="Bahnschrift SemiLight"/>
         </w:rPr>
-        <w:t xml:space="preserve">It is composed of 29,443 records with two columns/features. Feature 1 is ‘image_id’ that pairs the corresponding image in the image test folder to feature 2. Feature is </w:t>
-      </w:r>
-      <w:r>
-        <w:rPr>
-          <w:rFonts w:ascii="Bahnschrift SemiLight" w:hAnsi="Bahnschrift SemiLight"/>
-        </w:rPr>
-        <w:lastRenderedPageBreak/>
-        <w:t xml:space="preserve">‘class’ where it stores my model’s best guess at which class of the </w:t>
+        <w:t xml:space="preserve">It is composed of 29,443 records with two columns/features. Feature 1 is ‘image_id’ that pairs the corresponding image in the image test folder to feature 2. Feature is ‘class’ where it stores my model’s best guess at which class of the </w:t>
       </w:r>
       <w:r>
         <w:rPr>
@@ -2073,7 +2030,7 @@
                     <pic:cNvPicPr/>
                   </pic:nvPicPr>
                   <pic:blipFill>
-                    <a:blip r:embed="rId7"/>
+                    <a:blip r:embed="rId8"/>
                     <a:stretch>
                       <a:fillRect/>
                     </a:stretch>
@@ -2120,7 +2077,7 @@
                     <pic:cNvPicPr/>
                   </pic:nvPicPr>
                   <pic:blipFill>
-                    <a:blip r:embed="rId8"/>
+                    <a:blip r:embed="rId9"/>
                     <a:stretch>
                       <a:fillRect/>
                     </a:stretch>
@@ -2196,13 +2153,7 @@
         <w:rPr>
           <w:rFonts w:ascii="Bahnschrift SemiLight" w:hAnsi="Bahnschrift SemiLight"/>
         </w:rPr>
-        <w:t xml:space="preserve"> </w:t>
-      </w:r>
-      <w:r>
-        <w:rPr>
-          <w:rFonts w:ascii="Bahnschrift SemiLight" w:hAnsi="Bahnschrift SemiLight"/>
-        </w:rPr>
-        <w:t>I ran evaluation on 12,732 images within the training 80/20 split.</w:t>
+        <w:t xml:space="preserve"> I ran evaluation on 12,732 images within the training 80/20 split.</w:t>
       </w:r>
     </w:p>
     <w:p>
@@ -2215,6 +2166,7 @@
         <w:rPr>
           <w:noProof/>
         </w:rPr>
+        <w:lastRenderedPageBreak/>
         <w:drawing>
           <wp:inline distT="0" distB="0" distL="0" distR="0" wp14:anchorId="1F01067F" wp14:editId="2973AA0A">
             <wp:extent cx="2932629" cy="2232660"/>
@@ -2231,7 +2183,7 @@
                     <pic:cNvPicPr/>
                   </pic:nvPicPr>
                   <pic:blipFill>
-                    <a:blip r:embed="rId9"/>
+                    <a:blip r:embed="rId10"/>
                     <a:stretch>
                       <a:fillRect/>
                     </a:stretch>
@@ -2268,219 +2220,206 @@
         <w:rPr>
           <w:rFonts w:ascii="Bahnschrift SemiLight" w:hAnsi="Bahnschrift SemiLight"/>
         </w:rPr>
+        <w:t xml:space="preserve">The model managed to score a validation loss score of 0.7318, this value represents the measurement of the model’s prediction error using the loss function. </w:t>
+      </w:r>
+      <w:r>
+        <w:rPr>
+          <w:rFonts w:ascii="Bahnschrift SemiLight" w:hAnsi="Bahnschrift SemiLight"/>
+        </w:rPr>
+        <w:t>It is preferred to have this value as low as possible.</w:t>
+      </w:r>
+    </w:p>
+    <w:p>
+      <w:pPr>
+        <w:rPr>
+          <w:rFonts w:ascii="Bahnschrift SemiLight" w:hAnsi="Bahnschrift SemiLight"/>
+        </w:rPr>
+      </w:pPr>
+      <w:r>
+        <w:rPr>
+          <w:rFonts w:ascii="Bahnschrift SemiLight" w:hAnsi="Bahnschrift SemiLight"/>
+        </w:rPr>
+        <w:t xml:space="preserve">The measured accuracy comes out to </w:t>
+      </w:r>
+      <w:r>
+        <w:rPr>
+          <w:rFonts w:ascii="Bahnschrift SemiLight" w:hAnsi="Bahnschrift SemiLight"/>
+        </w:rPr>
+        <w:t>~</w:t>
+      </w:r>
+      <w:r>
+        <w:rPr>
+          <w:rFonts w:ascii="Bahnschrift SemiLight" w:hAnsi="Bahnschrift SemiLight"/>
+        </w:rPr>
+        <w:t>74.</w:t>
+      </w:r>
+      <w:r>
+        <w:rPr>
+          <w:rFonts w:ascii="Bahnschrift SemiLight" w:hAnsi="Bahnschrift SemiLight"/>
+        </w:rPr>
+        <w:t>82</w:t>
+      </w:r>
+      <w:r>
+        <w:rPr>
+          <w:rFonts w:ascii="Bahnschrift SemiLight" w:hAnsi="Bahnschrift SemiLight"/>
+        </w:rPr>
+        <w:t>% which is mediocre at best. The scores on the Kaggle leaderboards shows figures nearing 90% to 98% accuracy so my model is still far from scoring a good score.</w:t>
+      </w:r>
+      <w:r>
+        <w:rPr>
+          <w:rFonts w:ascii="Bahnschrift SemiLight" w:hAnsi="Bahnschrift SemiLight"/>
+        </w:rPr>
+        <w:t xml:space="preserve"> This metric measures the total portion of images correctly classified.</w:t>
+      </w:r>
+    </w:p>
+    <w:p>
+      <w:pPr>
+        <w:rPr>
+          <w:rFonts w:ascii="Bahnschrift SemiLight" w:hAnsi="Bahnschrift SemiLight"/>
+        </w:rPr>
+      </w:pPr>
+      <w:r>
+        <w:rPr>
+          <w:rFonts w:ascii="Bahnschrift SemiLight" w:hAnsi="Bahnschrift SemiLight"/>
+        </w:rPr>
+        <w:t>Precision came out to be 7</w:t>
+      </w:r>
+      <w:r>
+        <w:rPr>
+          <w:rFonts w:ascii="Bahnschrift SemiLight" w:hAnsi="Bahnschrift SemiLight"/>
+        </w:rPr>
+        <w:t>8.12</w:t>
+      </w:r>
+      <w:r>
+        <w:rPr>
+          <w:rFonts w:ascii="Bahnschrift SemiLight" w:hAnsi="Bahnschrift SemiLight"/>
+        </w:rPr>
+        <w:t xml:space="preserve">% which is again decent but is not what is the most relevant to the purpose of this project. </w:t>
+      </w:r>
+      <w:r>
+        <w:rPr>
+          <w:rFonts w:ascii="Bahnschrift SemiLight" w:hAnsi="Bahnschrift SemiLight"/>
+        </w:rPr>
+        <w:t xml:space="preserve">I believe it would be most beneficial if I could sacrifice this score for a much higher accuracy score. </w:t>
+      </w:r>
+      <w:r>
+        <w:rPr>
+          <w:rFonts w:ascii="Bahnschrift SemiLight" w:hAnsi="Bahnschrift SemiLight"/>
+        </w:rPr>
+        <w:t>To recap, the precision metric measures</w:t>
+      </w:r>
+      <w:r>
+        <w:rPr>
+          <w:rFonts w:ascii="Bahnschrift SemiLight" w:hAnsi="Bahnschrift SemiLight"/>
+        </w:rPr>
+        <w:t xml:space="preserve"> the proportion of correct predictions in a class, that actually were of that class.</w:t>
+      </w:r>
+    </w:p>
+    <w:p>
+      <w:pPr>
+        <w:rPr>
+          <w:rFonts w:ascii="Bahnschrift SemiLight" w:hAnsi="Bahnschrift SemiLight"/>
+        </w:rPr>
+      </w:pPr>
+      <w:r>
+        <w:rPr>
+          <w:rFonts w:ascii="Bahnschrift SemiLight" w:hAnsi="Bahnschrift SemiLight"/>
+        </w:rPr>
+        <w:t xml:space="preserve">Recall scored again a relatively good score at </w:t>
+      </w:r>
+      <w:r>
+        <w:rPr>
+          <w:rFonts w:ascii="Bahnschrift SemiLight" w:hAnsi="Bahnschrift SemiLight"/>
+        </w:rPr>
+        <w:t>74.</w:t>
+      </w:r>
+      <w:r>
+        <w:rPr>
+          <w:rFonts w:ascii="Bahnschrift SemiLight" w:hAnsi="Bahnschrift SemiLight"/>
+        </w:rPr>
+        <w:t>91</w:t>
+      </w:r>
+      <w:r>
+        <w:rPr>
+          <w:rFonts w:ascii="Bahnschrift SemiLight" w:hAnsi="Bahnschrift SemiLight"/>
+        </w:rPr>
+        <w:t>%;</w:t>
+      </w:r>
+      <w:r>
+        <w:rPr>
+          <w:rFonts w:ascii="Bahnschrift SemiLight" w:hAnsi="Bahnschrift SemiLight"/>
+        </w:rPr>
+        <w:t xml:space="preserve"> it measures the total portion of a class that was correctly identified.</w:t>
+      </w:r>
+      <w:r>
+        <w:rPr>
+          <w:rFonts w:ascii="Bahnschrift SemiLight" w:hAnsi="Bahnschrift SemiLight"/>
+        </w:rPr>
+        <w:t xml:space="preserve"> Again, this metric while scoring relatively well is not the goal of the </w:t>
+      </w:r>
+      <w:r>
+        <w:rPr>
+          <w:rFonts w:ascii="Bahnschrift SemiLight" w:hAnsi="Bahnschrift SemiLight"/>
+        </w:rPr>
+        <w:t>model and</w:t>
+      </w:r>
+      <w:r>
+        <w:rPr>
+          <w:rFonts w:ascii="Bahnschrift SemiLight" w:hAnsi="Bahnschrift SemiLight"/>
+        </w:rPr>
+        <w:t xml:space="preserve"> should be sacrificed for a higher accuracy metric if possible.</w:t>
+      </w:r>
+    </w:p>
+    <w:p>
+      <w:pPr>
+        <w:rPr>
+          <w:rFonts w:ascii="Bahnschrift SemiLight" w:hAnsi="Bahnschrift SemiLight"/>
+        </w:rPr>
+      </w:pPr>
+      <w:r>
+        <w:rPr>
+          <w:rFonts w:ascii="Bahnschrift SemiLight" w:hAnsi="Bahnschrift SemiLight"/>
+        </w:rPr>
+        <w:t>F1 scored 7</w:t>
+      </w:r>
+      <w:r>
+        <w:rPr>
+          <w:rFonts w:ascii="Bahnschrift SemiLight" w:hAnsi="Bahnschrift SemiLight"/>
+        </w:rPr>
+        <w:t>4.82</w:t>
+      </w:r>
+      <w:r>
+        <w:rPr>
+          <w:rFonts w:ascii="Bahnschrift SemiLight" w:hAnsi="Bahnschrift SemiLight"/>
+        </w:rPr>
+        <w:t>% which is again relatively good but not the goal, it combines recall and precision into a single metric which are both metrics useless for this project.</w:t>
+      </w:r>
+    </w:p>
+    <w:p>
+      <w:pPr>
+        <w:rPr>
+          <w:rFonts w:ascii="Bahnschrift SemiLight" w:hAnsi="Bahnschrift SemiLight"/>
+        </w:rPr>
+      </w:pPr>
+      <w:r>
+        <w:rPr>
+          <w:rFonts w:ascii="Bahnschrift SemiLight" w:hAnsi="Bahnschrift SemiLight"/>
+        </w:rPr>
+        <w:t>These metrics I took primarily of the weighted average as this variant of the metrics averages the class metrics while also accounting for the number of validation image cases in each class. This generates a slightly more fair metric when classes are imbalanced in representation (which applies to the classes present in this project).</w:t>
+      </w:r>
+    </w:p>
+    <w:p>
+      <w:pPr>
+        <w:rPr>
+          <w:rFonts w:ascii="Bahnschrift SemiLight" w:hAnsi="Bahnschrift SemiLight"/>
+        </w:rPr>
+      </w:pPr>
+      <w:r>
+        <w:rPr>
+          <w:rFonts w:ascii="Bahnschrift SemiLight" w:hAnsi="Bahnschrift SemiLight"/>
+          <w:noProof/>
+        </w:rPr>
         <w:lastRenderedPageBreak/>
-        <w:t xml:space="preserve">The model managed to score a validation loss score of 0.7318, this value represents the measurement of the model’s prediction error using the loss function. </w:t>
-      </w:r>
-      <w:r>
-        <w:rPr>
-          <w:rFonts w:ascii="Bahnschrift SemiLight" w:hAnsi="Bahnschrift SemiLight"/>
-        </w:rPr>
-        <w:t>It is preferred to have this value as low as possible.</w:t>
-      </w:r>
-    </w:p>
-    <w:p>
-      <w:pPr>
-        <w:rPr>
-          <w:rFonts w:ascii="Bahnschrift SemiLight" w:hAnsi="Bahnschrift SemiLight"/>
-        </w:rPr>
-      </w:pPr>
-      <w:r>
-        <w:rPr>
-          <w:rFonts w:ascii="Bahnschrift SemiLight" w:hAnsi="Bahnschrift SemiLight"/>
-        </w:rPr>
-        <w:t xml:space="preserve">The measured accuracy comes out to </w:t>
-      </w:r>
-      <w:r>
-        <w:rPr>
-          <w:rFonts w:ascii="Bahnschrift SemiLight" w:hAnsi="Bahnschrift SemiLight"/>
-        </w:rPr>
-        <w:t>~</w:t>
-      </w:r>
-      <w:r>
-        <w:rPr>
-          <w:rFonts w:ascii="Bahnschrift SemiLight" w:hAnsi="Bahnschrift SemiLight"/>
-        </w:rPr>
-        <w:t>74.</w:t>
-      </w:r>
-      <w:r>
-        <w:rPr>
-          <w:rFonts w:ascii="Bahnschrift SemiLight" w:hAnsi="Bahnschrift SemiLight"/>
-        </w:rPr>
-        <w:t>82</w:t>
-      </w:r>
-      <w:r>
-        <w:rPr>
-          <w:rFonts w:ascii="Bahnschrift SemiLight" w:hAnsi="Bahnschrift SemiLight"/>
-        </w:rPr>
-        <w:t>% which is mediocre at best. The scores on the Kaggle leaderboards shows figures nearing 90% to 98% accuracy so my model is still far from scoring a good score.</w:t>
-      </w:r>
-      <w:r>
-        <w:rPr>
-          <w:rFonts w:ascii="Bahnschrift SemiLight" w:hAnsi="Bahnschrift SemiLight"/>
-        </w:rPr>
-        <w:t xml:space="preserve"> This metric measures the total portion of images correctly classified.</w:t>
-      </w:r>
-    </w:p>
-    <w:p>
-      <w:pPr>
-        <w:rPr>
-          <w:rFonts w:ascii="Bahnschrift SemiLight" w:hAnsi="Bahnschrift SemiLight"/>
-        </w:rPr>
-      </w:pPr>
-      <w:r>
-        <w:rPr>
-          <w:rFonts w:ascii="Bahnschrift SemiLight" w:hAnsi="Bahnschrift SemiLight"/>
-        </w:rPr>
-        <w:t>Precision came out to be 7</w:t>
-      </w:r>
-      <w:r>
-        <w:rPr>
-          <w:rFonts w:ascii="Bahnschrift SemiLight" w:hAnsi="Bahnschrift SemiLight"/>
-        </w:rPr>
-        <w:t>8.12</w:t>
-      </w:r>
-      <w:r>
-        <w:rPr>
-          <w:rFonts w:ascii="Bahnschrift SemiLight" w:hAnsi="Bahnschrift SemiLight"/>
-        </w:rPr>
-        <w:t xml:space="preserve">% which is again decent but is not what is the most relevant to the purpose of this project. </w:t>
-      </w:r>
-      <w:r>
-        <w:rPr>
-          <w:rFonts w:ascii="Bahnschrift SemiLight" w:hAnsi="Bahnschrift SemiLight"/>
-        </w:rPr>
-        <w:t xml:space="preserve">I believe it would be most beneficial if I could sacrifice this score for a much higher accuracy score. </w:t>
-      </w:r>
-      <w:r>
-        <w:rPr>
-          <w:rFonts w:ascii="Bahnschrift SemiLight" w:hAnsi="Bahnschrift SemiLight"/>
-        </w:rPr>
-        <w:t>To recap, the precision metric measures</w:t>
-      </w:r>
-      <w:r>
-        <w:rPr>
-          <w:rFonts w:ascii="Bahnschrift SemiLight" w:hAnsi="Bahnschrift SemiLight"/>
-        </w:rPr>
-        <w:t xml:space="preserve"> the proportion of correct predictions in a class, that actually were of that class.</w:t>
-      </w:r>
-    </w:p>
-    <w:p>
-      <w:pPr>
-        <w:rPr>
-          <w:rFonts w:ascii="Bahnschrift SemiLight" w:hAnsi="Bahnschrift SemiLight"/>
-        </w:rPr>
-      </w:pPr>
-      <w:r>
-        <w:rPr>
-          <w:rFonts w:ascii="Bahnschrift SemiLight" w:hAnsi="Bahnschrift SemiLight"/>
-        </w:rPr>
-        <w:t xml:space="preserve">Recall scored again a relatively good score at </w:t>
-      </w:r>
-      <w:r>
-        <w:rPr>
-          <w:rFonts w:ascii="Bahnschrift SemiLight" w:hAnsi="Bahnschrift SemiLight"/>
-        </w:rPr>
-        <w:t>74.</w:t>
-      </w:r>
-      <w:r>
-        <w:rPr>
-          <w:rFonts w:ascii="Bahnschrift SemiLight" w:hAnsi="Bahnschrift SemiLight"/>
-        </w:rPr>
-        <w:t>91</w:t>
-      </w:r>
-      <w:r>
-        <w:rPr>
-          <w:rFonts w:ascii="Bahnschrift SemiLight" w:hAnsi="Bahnschrift SemiLight"/>
-        </w:rPr>
-        <w:t>%;</w:t>
-      </w:r>
-      <w:r>
-        <w:rPr>
-          <w:rFonts w:ascii="Bahnschrift SemiLight" w:hAnsi="Bahnschrift SemiLight"/>
-        </w:rPr>
-        <w:t xml:space="preserve"> it measures the total portion of a class that was correctly identified.</w:t>
-      </w:r>
-      <w:r>
-        <w:rPr>
-          <w:rFonts w:ascii="Bahnschrift SemiLight" w:hAnsi="Bahnschrift SemiLight"/>
-        </w:rPr>
-        <w:t xml:space="preserve"> Again, this metric while scoring relatively well is not the goal of the </w:t>
-      </w:r>
-      <w:r>
-        <w:rPr>
-          <w:rFonts w:ascii="Bahnschrift SemiLight" w:hAnsi="Bahnschrift SemiLight"/>
-        </w:rPr>
-        <w:t>model and</w:t>
-      </w:r>
-      <w:r>
-        <w:rPr>
-          <w:rFonts w:ascii="Bahnschrift SemiLight" w:hAnsi="Bahnschrift SemiLight"/>
-        </w:rPr>
-        <w:t xml:space="preserve"> should be sacrificed for a higher accuracy metric if possible.</w:t>
-      </w:r>
-    </w:p>
-    <w:p>
-      <w:pPr>
-        <w:rPr>
-          <w:rFonts w:ascii="Bahnschrift SemiLight" w:hAnsi="Bahnschrift SemiLight"/>
-        </w:rPr>
-      </w:pPr>
-      <w:r>
-        <w:rPr>
-          <w:rFonts w:ascii="Bahnschrift SemiLight" w:hAnsi="Bahnschrift SemiLight"/>
-        </w:rPr>
-        <w:t>F1 scored 7</w:t>
-      </w:r>
-      <w:r>
-        <w:rPr>
-          <w:rFonts w:ascii="Bahnschrift SemiLight" w:hAnsi="Bahnschrift SemiLight"/>
-        </w:rPr>
-        <w:t>4.82</w:t>
-      </w:r>
-      <w:r>
-        <w:rPr>
-          <w:rFonts w:ascii="Bahnschrift SemiLight" w:hAnsi="Bahnschrift SemiLight"/>
-        </w:rPr>
-        <w:t>% which is again relatively good but not the goal, it combines recall and precision into a single metric which are both metrics useless for this project.</w:t>
-      </w:r>
-    </w:p>
-    <w:p>
-      <w:pPr>
-        <w:rPr>
-          <w:rFonts w:ascii="Bahnschrift SemiLight" w:hAnsi="Bahnschrift SemiLight"/>
-        </w:rPr>
-      </w:pPr>
-      <w:r>
-        <w:rPr>
-          <w:rFonts w:ascii="Bahnschrift SemiLight" w:hAnsi="Bahnschrift SemiLight"/>
-        </w:rPr>
-        <w:t xml:space="preserve">These metrics I took primarily of the weighted average as this variant of the metrics averages the class metrics while also accounting for the number of validation image cases in each class. This generates a slightly </w:t>
-      </w:r>
-      <w:proofErr w:type="gramStart"/>
-      <w:r>
-        <w:rPr>
-          <w:rFonts w:ascii="Bahnschrift SemiLight" w:hAnsi="Bahnschrift SemiLight"/>
-        </w:rPr>
-        <w:t>more fair</w:t>
-      </w:r>
-      <w:proofErr w:type="gramEnd"/>
-      <w:r>
-        <w:rPr>
-          <w:rFonts w:ascii="Bahnschrift SemiLight" w:hAnsi="Bahnschrift SemiLight"/>
-        </w:rPr>
-        <w:t xml:space="preserve"> metric when classes are imbalanced in representation (which applies to the classes present in this project).</w:t>
-      </w:r>
-    </w:p>
-    <w:p>
-      <w:pPr>
-        <w:rPr>
-          <w:rFonts w:ascii="Bahnschrift SemiLight" w:hAnsi="Bahnschrift SemiLight"/>
-        </w:rPr>
-      </w:pPr>
-      <w:r>
-        <w:rPr>
-          <w:rFonts w:ascii="Bahnschrift SemiLight" w:hAnsi="Bahnschrift SemiLight"/>
-        </w:rPr>
         <w:drawing>
           <wp:inline distT="0" distB="0" distL="0" distR="0" wp14:anchorId="7EB10FF9" wp14:editId="58E80877">
             <wp:extent cx="3636844" cy="3185160"/>
@@ -2497,7 +2436,7 @@
                     <pic:cNvPicPr/>
                   </pic:nvPicPr>
                   <pic:blipFill>
-                    <a:blip r:embed="rId10"/>
+                    <a:blip r:embed="rId11"/>
                     <a:stretch>
                       <a:fillRect/>
                     </a:stretch>
@@ -2528,166 +2467,166 @@
         <w:rPr>
           <w:rFonts w:ascii="Bahnschrift SemiLight" w:hAnsi="Bahnschrift SemiLight"/>
         </w:rPr>
+        <w:t>This confusion matrix was also generated by the code for the mode.</w:t>
+      </w:r>
+    </w:p>
+    <w:p>
+      <w:pPr>
+        <w:rPr>
+          <w:rFonts w:ascii="Bahnschrift SemiLight" w:hAnsi="Bahnschrift SemiLight"/>
+        </w:rPr>
+      </w:pPr>
+      <w:r>
+        <w:rPr>
+          <w:rFonts w:ascii="Bahnschrift SemiLight" w:hAnsi="Bahnschrift SemiLight"/>
+        </w:rPr>
+        <w:t>A confusion matrix is useful because it can tell us the performance of each class individually portrayed in an easy to consume way.</w:t>
+      </w:r>
+    </w:p>
+    <w:p>
+      <w:pPr>
+        <w:rPr>
+          <w:rFonts w:ascii="Bahnschrift SemiLight" w:hAnsi="Bahnschrift SemiLight"/>
+        </w:rPr>
+      </w:pPr>
+      <w:r>
+        <w:rPr>
+          <w:rFonts w:ascii="Bahnschrift SemiLight" w:hAnsi="Bahnschrift SemiLight"/>
+        </w:rPr>
+        <w:t xml:space="preserve">The class with the </w:t>
+      </w:r>
+      <w:r>
+        <w:rPr>
+          <w:rFonts w:ascii="Bahnschrift SemiLight" w:hAnsi="Bahnschrift SemiLight"/>
+        </w:rPr>
+        <w:t>‘</w:t>
+      </w:r>
+      <w:r>
+        <w:rPr>
+          <w:rFonts w:ascii="Bahnschrift SemiLight" w:hAnsi="Bahnschrift SemiLight"/>
+        </w:rPr>
+        <w:t>best</w:t>
+      </w:r>
+      <w:r>
+        <w:rPr>
+          <w:rFonts w:ascii="Bahnschrift SemiLight" w:hAnsi="Bahnschrift SemiLight"/>
+        </w:rPr>
+        <w:t>’</w:t>
+      </w:r>
+      <w:r>
+        <w:rPr>
+          <w:rFonts w:ascii="Bahnschrift SemiLight" w:hAnsi="Bahnschrift SemiLight"/>
+        </w:rPr>
+        <w:t xml:space="preserve"> performance was CatFace. It has both high recall and high precision</w:t>
+      </w:r>
+      <w:r>
+        <w:rPr>
+          <w:rFonts w:ascii="Bahnschrift SemiLight" w:hAnsi="Bahnschrift SemiLight"/>
+        </w:rPr>
+        <w:t xml:space="preserve"> as we can tell by the diagonal value divided by either the row sum or column sum.</w:t>
+      </w:r>
+    </w:p>
+    <w:p>
+      <w:pPr>
+        <w:rPr>
+          <w:rFonts w:ascii="Bahnschrift SemiLight" w:hAnsi="Bahnschrift SemiLight"/>
+        </w:rPr>
+      </w:pPr>
+      <w:r>
+        <w:rPr>
+          <w:rFonts w:ascii="Bahnschrift SemiLight" w:hAnsi="Bahnschrift SemiLight"/>
+        </w:rPr>
+        <w:t>The ‘worst’ performing class was DogNose which has a rather low recall value as well as gets misclassified a lot.</w:t>
+      </w:r>
+    </w:p>
+    <w:p>
+      <w:pPr>
+        <w:rPr>
+          <w:rFonts w:ascii="Bahnschrift SemiLight" w:hAnsi="Bahnschrift SemiLight"/>
+        </w:rPr>
+      </w:pPr>
+      <w:r>
+        <w:rPr>
+          <w:rFonts w:ascii="Bahnschrift SemiLight" w:hAnsi="Bahnschrift SemiLight"/>
+        </w:rPr>
+        <w:t>One important thing to note, ‘best’ and ‘worst’ depends on the definition, and for the above I used the general across the board metrics to define them as best or worst. For the purpose of the assessment ‘best’ would refer to the highest accuracy score ignoring all else.</w:t>
+      </w:r>
+    </w:p>
+    <w:p>
+      <w:pPr>
+        <w:rPr>
+          <w:rFonts w:ascii="Bahnschrift SemiLight" w:hAnsi="Bahnschrift SemiLight"/>
+        </w:rPr>
+      </w:pPr>
+      <w:r>
+        <w:rPr>
+          <w:rFonts w:ascii="Bahnschrift SemiLight" w:hAnsi="Bahnschrift SemiLight"/>
+        </w:rPr>
+        <w:t xml:space="preserve">The colouring displays the population of the </w:t>
+      </w:r>
+      <w:r>
+        <w:rPr>
+          <w:rFonts w:ascii="Bahnschrift SemiLight" w:hAnsi="Bahnschrift SemiLight"/>
+        </w:rPr>
+        <w:t>class;</w:t>
+      </w:r>
+      <w:r>
+        <w:rPr>
+          <w:rFonts w:ascii="Bahnschrift SemiLight" w:hAnsi="Bahnschrift SemiLight"/>
+        </w:rPr>
+        <w:t xml:space="preserve"> deeper darker coloured tiles have a higher population than lighter coloured tiles.</w:t>
+      </w:r>
+    </w:p>
+    <w:p>
+      <w:pPr>
+        <w:rPr>
+          <w:rFonts w:ascii="Bahnschrift SemiLight" w:hAnsi="Bahnschrift SemiLight"/>
+        </w:rPr>
+      </w:pPr>
+      <w:r>
+        <w:rPr>
+          <w:rFonts w:ascii="Bahnschrift SemiLight" w:hAnsi="Bahnschrift SemiLight"/>
+        </w:rPr>
+        <w:t>Accuracy can be calculated by summing up the diagonal tiles then divided by the total number of samples, which corresponds to the accuracy metric we generated above in the classification report.</w:t>
+      </w:r>
+    </w:p>
+    <w:p>
+      <w:pPr>
+        <w:rPr>
+          <w:rFonts w:ascii="Bahnschrift SemiLight" w:hAnsi="Bahnschrift SemiLight"/>
+        </w:rPr>
+      </w:pPr>
+      <w:r>
+        <w:rPr>
+          <w:rFonts w:ascii="Bahnschrift SemiLight" w:hAnsi="Bahnschrift SemiLight"/>
+        </w:rPr>
+        <w:t>Overall, other metrics remain good across the board, which put bluntly is a problem for this model simply because the goal is not to have good across the board metrics in all measures but rather to specialize and excel is just one metric, accuracy.</w:t>
+      </w:r>
+    </w:p>
+    <w:p>
+      <w:pPr>
+        <w:rPr>
+          <w:rFonts w:ascii="Bahnschrift SemiLight" w:hAnsi="Bahnschrift SemiLight"/>
+        </w:rPr>
+      </w:pPr>
+      <w:r>
+        <w:rPr>
+          <w:rFonts w:ascii="Bahnschrift SemiLight" w:hAnsi="Bahnschrift SemiLight"/>
+        </w:rPr>
+        <w:t>So, moving forward it is optimal for me to discard all other metrics and funnel the model into generating the highest accuracy metric I can possibly get it to have.</w:t>
+      </w:r>
+    </w:p>
+    <w:p>
+      <w:pPr>
+        <w:rPr>
+          <w:rFonts w:ascii="Bahnschrift SemiLight" w:hAnsi="Bahnschrift SemiLight"/>
+        </w:rPr>
+      </w:pPr>
+      <w:r>
+        <w:rPr>
+          <w:rFonts w:ascii="Bahnschrift SemiLight" w:hAnsi="Bahnschrift SemiLight"/>
+        </w:rPr>
         <w:lastRenderedPageBreak/>
-        <w:t>This confusion matrix was also generated by the code for the mode.</w:t>
-      </w:r>
-    </w:p>
-    <w:p>
-      <w:pPr>
-        <w:rPr>
-          <w:rFonts w:ascii="Bahnschrift SemiLight" w:hAnsi="Bahnschrift SemiLight"/>
-        </w:rPr>
-      </w:pPr>
-      <w:r>
-        <w:rPr>
-          <w:rFonts w:ascii="Bahnschrift SemiLight" w:hAnsi="Bahnschrift SemiLight"/>
-        </w:rPr>
-        <w:t>A confusion matrix is useful because it can tell us the performance of each class individually portrayed in an easy to consume way.</w:t>
-      </w:r>
-    </w:p>
-    <w:p>
-      <w:pPr>
-        <w:rPr>
-          <w:rFonts w:ascii="Bahnschrift SemiLight" w:hAnsi="Bahnschrift SemiLight"/>
-        </w:rPr>
-      </w:pPr>
-      <w:r>
-        <w:rPr>
-          <w:rFonts w:ascii="Bahnschrift SemiLight" w:hAnsi="Bahnschrift SemiLight"/>
-        </w:rPr>
-        <w:t xml:space="preserve">The class with the </w:t>
-      </w:r>
-      <w:r>
-        <w:rPr>
-          <w:rFonts w:ascii="Bahnschrift SemiLight" w:hAnsi="Bahnschrift SemiLight"/>
-        </w:rPr>
-        <w:t>‘</w:t>
-      </w:r>
-      <w:r>
-        <w:rPr>
-          <w:rFonts w:ascii="Bahnschrift SemiLight" w:hAnsi="Bahnschrift SemiLight"/>
-        </w:rPr>
-        <w:t>best</w:t>
-      </w:r>
-      <w:r>
-        <w:rPr>
-          <w:rFonts w:ascii="Bahnschrift SemiLight" w:hAnsi="Bahnschrift SemiLight"/>
-        </w:rPr>
-        <w:t>’</w:t>
-      </w:r>
-      <w:r>
-        <w:rPr>
-          <w:rFonts w:ascii="Bahnschrift SemiLight" w:hAnsi="Bahnschrift SemiLight"/>
-        </w:rPr>
-        <w:t xml:space="preserve"> performance was CatFace. It has both high recall and high precision</w:t>
-      </w:r>
-      <w:r>
-        <w:rPr>
-          <w:rFonts w:ascii="Bahnschrift SemiLight" w:hAnsi="Bahnschrift SemiLight"/>
-        </w:rPr>
-        <w:t xml:space="preserve"> as we can tell by the diagonal value divided by either the row sum or column sum.</w:t>
-      </w:r>
-    </w:p>
-    <w:p>
-      <w:pPr>
-        <w:rPr>
-          <w:rFonts w:ascii="Bahnschrift SemiLight" w:hAnsi="Bahnschrift SemiLight"/>
-        </w:rPr>
-      </w:pPr>
-      <w:r>
-        <w:rPr>
-          <w:rFonts w:ascii="Bahnschrift SemiLight" w:hAnsi="Bahnschrift SemiLight"/>
-        </w:rPr>
-        <w:t>The ‘worst’ performing class was DogNose which has a rather low recall value as well as gets misclassified a lot.</w:t>
-      </w:r>
-    </w:p>
-    <w:p>
-      <w:pPr>
-        <w:rPr>
-          <w:rFonts w:ascii="Bahnschrift SemiLight" w:hAnsi="Bahnschrift SemiLight"/>
-        </w:rPr>
-      </w:pPr>
-      <w:r>
-        <w:rPr>
-          <w:rFonts w:ascii="Bahnschrift SemiLight" w:hAnsi="Bahnschrift SemiLight"/>
-        </w:rPr>
-        <w:t>One important thing to note, ‘best’ and ‘worst’ depends on the definition, and for the above I used the general across the board metrics to define them as best or worst. For the purpose of the assessment ‘best’ would refer to the highest accuracy score ignoring all else.</w:t>
-      </w:r>
-    </w:p>
-    <w:p>
-      <w:pPr>
-        <w:rPr>
-          <w:rFonts w:ascii="Bahnschrift SemiLight" w:hAnsi="Bahnschrift SemiLight"/>
-        </w:rPr>
-      </w:pPr>
-      <w:r>
-        <w:rPr>
-          <w:rFonts w:ascii="Bahnschrift SemiLight" w:hAnsi="Bahnschrift SemiLight"/>
-        </w:rPr>
-        <w:t xml:space="preserve">The colouring displays the population of the </w:t>
-      </w:r>
-      <w:r>
-        <w:rPr>
-          <w:rFonts w:ascii="Bahnschrift SemiLight" w:hAnsi="Bahnschrift SemiLight"/>
-        </w:rPr>
-        <w:t>class;</w:t>
-      </w:r>
-      <w:r>
-        <w:rPr>
-          <w:rFonts w:ascii="Bahnschrift SemiLight" w:hAnsi="Bahnschrift SemiLight"/>
-        </w:rPr>
-        <w:t xml:space="preserve"> deeper darker coloured tiles have a higher population than lighter coloured tiles.</w:t>
-      </w:r>
-    </w:p>
-    <w:p>
-      <w:pPr>
-        <w:rPr>
-          <w:rFonts w:ascii="Bahnschrift SemiLight" w:hAnsi="Bahnschrift SemiLight"/>
-        </w:rPr>
-      </w:pPr>
-      <w:r>
-        <w:rPr>
-          <w:rFonts w:ascii="Bahnschrift SemiLight" w:hAnsi="Bahnschrift SemiLight"/>
-        </w:rPr>
-        <w:t>Accuracy can be calculated by summing up the diagonal tiles then divided by the total number of samples, which corresponds to the accuracy metric we generated above in the classification report.</w:t>
-      </w:r>
-    </w:p>
-    <w:p>
-      <w:pPr>
-        <w:rPr>
-          <w:rFonts w:ascii="Bahnschrift SemiLight" w:hAnsi="Bahnschrift SemiLight"/>
-        </w:rPr>
-      </w:pPr>
-      <w:r>
-        <w:rPr>
-          <w:rFonts w:ascii="Bahnschrift SemiLight" w:hAnsi="Bahnschrift SemiLight"/>
-        </w:rPr>
-        <w:t>Overall, other metrics remain good across the board, which put bluntly is a problem for this model simply because the goal is not to have good across the board metrics in all measures but rather to specialize and excel is just one metric, accuracy.</w:t>
-      </w:r>
-    </w:p>
-    <w:p>
-      <w:pPr>
-        <w:rPr>
-          <w:rFonts w:ascii="Bahnschrift SemiLight" w:hAnsi="Bahnschrift SemiLight"/>
-        </w:rPr>
-      </w:pPr>
-      <w:r>
-        <w:rPr>
-          <w:rFonts w:ascii="Bahnschrift SemiLight" w:hAnsi="Bahnschrift SemiLight"/>
-        </w:rPr>
-        <w:t>So, moving forward it is optimal for me to discard all other metrics and funnel the model into generating the highest accuracy metric I can possibly get it to have.</w:t>
-      </w:r>
-    </w:p>
-    <w:p>
-      <w:pPr>
-        <w:rPr>
-          <w:rFonts w:ascii="Bahnschrift SemiLight" w:hAnsi="Bahnschrift SemiLight"/>
-        </w:rPr>
-      </w:pPr>
-      <w:r>
-        <w:rPr>
-          <w:rFonts w:ascii="Bahnschrift SemiLight" w:hAnsi="Bahnschrift SemiLight"/>
-        </w:rPr>
         <w:t xml:space="preserve">Another thing to mention, the score I received on Kaggle generally reflects the accuracy of my model to a good degree. However, it should be noted that different databases and image sets introduces variance always. The metrics the model scores on </w:t>
       </w:r>
       <w:r>
@@ -2708,14 +2647,12 @@
         </w:rPr>
         <w:t xml:space="preserve">provide the guarantee that the model will do well in all </w:t>
       </w:r>
-      <w:proofErr w:type="gramStart"/>
       <w:r>
         <w:rPr>
           <w:rFonts w:ascii="Bahnschrift SemiLight" w:hAnsi="Bahnschrift SemiLight"/>
         </w:rPr>
         <w:t>image</w:t>
       </w:r>
-      <w:proofErr w:type="gramEnd"/>
       <w:r>
         <w:rPr>
           <w:rFonts w:ascii="Bahnschrift SemiLight" w:hAnsi="Bahnschrift SemiLight"/>
@@ -2748,12 +2685,6 @@
           <w:rFonts w:ascii="Bahnschrift SemiLight" w:hAnsi="Bahnschrift SemiLight"/>
         </w:rPr>
       </w:pPr>
-      <w:r>
-        <w:rPr>
-          <w:rFonts w:ascii="Bahnschrift SemiLight" w:hAnsi="Bahnschrift SemiLight"/>
-        </w:rPr>
-        <w:br w:type="page"/>
-      </w:r>
     </w:p>
     <w:p>
       <w:pPr>
@@ -2774,16 +2705,501 @@
           <w:sz w:val="28"/>
           <w:szCs w:val="28"/>
         </w:rPr>
+        <w:t>Task 6:</w:t>
+      </w:r>
+    </w:p>
+    <w:p>
+      <w:pPr>
+        <w:rPr>
+          <w:rFonts w:ascii="Bahnschrift SemiLight" w:hAnsi="Bahnschrift SemiLight"/>
+        </w:rPr>
+      </w:pPr>
+      <w:r>
+        <w:rPr>
+          <w:rFonts w:ascii="Bahnschrift SemiLight" w:hAnsi="Bahnschrift SemiLight"/>
+        </w:rPr>
+        <w:t>From what I can gather from the above statistics and metrics:</w:t>
+      </w:r>
+    </w:p>
+    <w:p>
+      <w:pPr>
+        <w:pStyle w:val="ListParagraph"/>
+        <w:numPr>
+          <w:ilvl w:val="0"/>
+          <w:numId w:val="1"/>
+        </w:numPr>
+        <w:rPr>
+          <w:rFonts w:ascii="Bahnschrift SemiLight" w:hAnsi="Bahnschrift SemiLight"/>
+        </w:rPr>
+      </w:pPr>
+      <w:r>
+        <w:rPr>
+          <w:rFonts w:ascii="Bahnschrift SemiLight" w:hAnsi="Bahnschrift SemiLight"/>
+        </w:rPr>
+        <w:t>Validation accuracy – 74.91%</w:t>
+      </w:r>
+    </w:p>
+    <w:p>
+      <w:pPr>
+        <w:pStyle w:val="ListParagraph"/>
+        <w:numPr>
+          <w:ilvl w:val="0"/>
+          <w:numId w:val="1"/>
+        </w:numPr>
+        <w:rPr>
+          <w:rFonts w:ascii="Bahnschrift SemiLight" w:hAnsi="Bahnschrift SemiLight"/>
+        </w:rPr>
+      </w:pPr>
+      <w:r>
+        <w:rPr>
+          <w:rFonts w:ascii="Bahnschrift SemiLight" w:hAnsi="Bahnschrift SemiLight"/>
+        </w:rPr>
+        <w:t>Kaggle score – 68.42%</w:t>
+      </w:r>
+    </w:p>
+    <w:p>
+      <w:pPr>
+        <w:pStyle w:val="ListParagraph"/>
+        <w:numPr>
+          <w:ilvl w:val="0"/>
+          <w:numId w:val="1"/>
+        </w:numPr>
+        <w:rPr>
+          <w:rFonts w:ascii="Bahnschrift SemiLight" w:hAnsi="Bahnschrift SemiLight"/>
+        </w:rPr>
+      </w:pPr>
+      <w:r>
+        <w:rPr>
+          <w:rFonts w:ascii="Bahnschrift SemiLight" w:hAnsi="Bahnschrift SemiLight"/>
+        </w:rPr>
+        <w:t xml:space="preserve">Validation loss – </w:t>
+      </w:r>
+      <w:r>
+        <w:rPr>
+          <w:rFonts w:ascii="Bahnschrift SemiLight" w:hAnsi="Bahnschrift SemiLight"/>
+        </w:rPr>
+        <w:t>0.</w:t>
+      </w:r>
+      <w:r>
+        <w:rPr>
+          <w:rFonts w:ascii="Bahnschrift SemiLight" w:hAnsi="Bahnschrift SemiLight"/>
+        </w:rPr>
+        <w:t>7318</w:t>
+      </w:r>
+    </w:p>
+    <w:p>
+      <w:pPr>
+        <w:rPr>
+          <w:rFonts w:ascii="Bahnschrift SemiLight" w:hAnsi="Bahnschrift SemiLight"/>
+        </w:rPr>
+      </w:pPr>
+      <w:r>
+        <w:rPr>
+          <w:rFonts w:ascii="Bahnschrift SemiLight" w:hAnsi="Bahnschrift SemiLight"/>
+        </w:rPr>
+        <w:t>The numbers tells us that the model correctly classifies approximately ¾ images into their corresponding classes</w:t>
+      </w:r>
+      <w:r>
+        <w:rPr>
+          <w:rFonts w:ascii="Bahnschrift SemiLight" w:hAnsi="Bahnschrift SemiLight"/>
+        </w:rPr>
+        <w:t xml:space="preserve">. </w:t>
+      </w:r>
+      <w:r>
+        <w:rPr>
+          <w:rFonts w:ascii="Bahnschrift SemiLight" w:hAnsi="Bahnschrift SemiLight"/>
+        </w:rPr>
+        <w:t xml:space="preserve">This is a useful as a </w:t>
+      </w:r>
+      <w:r>
+        <w:rPr>
+          <w:rFonts w:ascii="Bahnschrift SemiLight" w:hAnsi="Bahnschrift SemiLight"/>
+        </w:rPr>
+        <w:t>baseline,</w:t>
+      </w:r>
+      <w:r>
+        <w:rPr>
+          <w:rFonts w:ascii="Bahnschrift SemiLight" w:hAnsi="Bahnschrift SemiLight"/>
+        </w:rPr>
+        <w:t xml:space="preserve"> but the 25.09% error rate is a little concerning, furthermore without optimizations it does not come close to the average score displayed by the Kaggle leaderboards.</w:t>
+      </w:r>
+      <w:r>
+        <w:rPr>
+          <w:rFonts w:ascii="Bahnschrift SemiLight" w:hAnsi="Bahnschrift SemiLight"/>
+        </w:rPr>
+        <w:t xml:space="preserve"> I would hope to come closer to a score around 95% if I can.</w:t>
+      </w:r>
+    </w:p>
+    <w:p>
+      <w:pPr>
+        <w:rPr>
+          <w:rFonts w:ascii="Bahnschrift SemiLight" w:hAnsi="Bahnschrift SemiLight"/>
+        </w:rPr>
+      </w:pPr>
+      <w:r>
+        <w:rPr>
+          <w:rFonts w:ascii="Bahnschrift SemiLight" w:hAnsi="Bahnschrift SemiLight"/>
+        </w:rPr>
+        <w:t>With the generated validation accuracy of 74.91% g</w:t>
+      </w:r>
+      <w:r>
+        <w:rPr>
+          <w:rFonts w:ascii="Bahnschrift SemiLight" w:hAnsi="Bahnschrift SemiLight"/>
+        </w:rPr>
+        <w:t>iven the 29,443 images in the test image set we can roughly expect 22,055 images to be correctly classified into their respective classes, it’s decent but far from impressive nor useful enough.</w:t>
+      </w:r>
+    </w:p>
+    <w:p>
+      <w:pPr>
+        <w:rPr>
+          <w:rFonts w:ascii="Bahnschrift SemiLight" w:hAnsi="Bahnschrift SemiLight"/>
+        </w:rPr>
+      </w:pPr>
+      <w:r>
+        <w:rPr>
+          <w:rFonts w:ascii="Bahnschrift SemiLight" w:hAnsi="Bahnschrift SemiLight"/>
+        </w:rPr>
+        <w:t>However, it has been shown that this is not the case. The Kaggle score of 68.42% proves this as they do not match</w:t>
+      </w:r>
+      <w:r>
+        <w:rPr>
+          <w:rFonts w:ascii="Bahnschrift SemiLight" w:hAnsi="Bahnschrift SemiLight"/>
+        </w:rPr>
+        <w:t>. I suspect the difference points at the model’s generalisation not being relatively perfected yet. Same model, same checkpoint, different image set, different score.</w:t>
+      </w:r>
+    </w:p>
+    <w:p>
+      <w:pPr>
+        <w:rPr>
+          <w:rFonts w:ascii="Bahnschrift SemiLight" w:hAnsi="Bahnschrift SemiLight"/>
+        </w:rPr>
+      </w:pPr>
+      <w:r>
+        <w:rPr>
+          <w:rFonts w:ascii="Bahnschrift SemiLight" w:hAnsi="Bahnschrift SemiLight"/>
+        </w:rPr>
+        <w:t xml:space="preserve">Lastly, the validation loss of 0.7318 </w:t>
+      </w:r>
+      <w:r>
+        <w:rPr>
+          <w:rFonts w:ascii="Bahnschrift SemiLight" w:hAnsi="Bahnschrift SemiLight"/>
+        </w:rPr>
+        <w:t>acts as the measure of the model’s prediction loss under our weighted cross-entropy objective</w:t>
+      </w:r>
+      <w:r>
+        <w:rPr>
+          <w:rFonts w:ascii="Bahnschrift SemiLight" w:hAnsi="Bahnschrift SemiLight"/>
+        </w:rPr>
+        <w:t xml:space="preserve"> (meaning it is with the class weights included).</w:t>
+      </w:r>
+      <w:r>
+        <w:rPr>
+          <w:rFonts w:ascii="Bahnschrift SemiLight" w:hAnsi="Bahnschrift SemiLight"/>
+        </w:rPr>
+        <w:t xml:space="preserve"> </w:t>
+      </w:r>
+      <w:r>
+        <w:rPr>
+          <w:rFonts w:ascii="Bahnschrift SemiLight" w:hAnsi="Bahnschrift SemiLight"/>
+        </w:rPr>
+        <w:t>I should aim to lower this score if possible.</w:t>
+      </w:r>
+    </w:p>
+    <w:p>
+      <w:pPr>
+        <w:rPr>
+          <w:rFonts w:ascii="Bahnschrift SemiLight" w:hAnsi="Bahnschrift SemiLight"/>
+        </w:rPr>
+      </w:pPr>
+    </w:p>
+    <w:p>
+      <w:pPr>
+        <w:rPr>
+          <w:rFonts w:ascii="Bahnschrift SemiLight" w:hAnsi="Bahnschrift SemiLight"/>
+        </w:rPr>
+      </w:pPr>
+    </w:p>
+    <w:p>
+      <w:pPr>
+        <w:rPr>
+          <w:rFonts w:ascii="Bahnschrift SemiLight" w:hAnsi="Bahnschrift SemiLight"/>
+        </w:rPr>
+      </w:pPr>
+    </w:p>
+    <w:p>
+      <w:pPr>
+        <w:rPr>
+          <w:rFonts w:ascii="Bahnschrift SemiLight" w:hAnsi="Bahnschrift SemiLight"/>
+        </w:rPr>
+      </w:pPr>
+      <w:r>
+        <w:rPr>
+          <w:noProof/>
+        </w:rPr>
         <w:lastRenderedPageBreak/>
-        <w:t>Task 6:</w:t>
-      </w:r>
-    </w:p>
-    <w:p>
-      <w:pPr>
-        <w:rPr>
-          <w:rFonts w:ascii="Bahnschrift SemiLight" w:hAnsi="Bahnschrift SemiLight"/>
-        </w:rPr>
-      </w:pPr>
+        <w:drawing>
+          <wp:inline distT="0" distB="0" distL="0" distR="0" wp14:anchorId="17A38D04" wp14:editId="331D5025">
+            <wp:extent cx="5731510" cy="1772920"/>
+            <wp:effectExtent l="0" t="0" r="2540" b="0"/>
+            <wp:docPr id="1257212162" name="Picture 1"/>
+            <wp:cNvGraphicFramePr>
+              <a:graphicFrameLocks xmlns:a="http://schemas.openxmlformats.org/drawingml/2006/main" noChangeAspect="1"/>
+            </wp:cNvGraphicFramePr>
+            <a:graphic xmlns:a="http://schemas.openxmlformats.org/drawingml/2006/main">
+              <a:graphicData uri="http://schemas.openxmlformats.org/drawingml/2006/picture">
+                <pic:pic xmlns:pic="http://schemas.openxmlformats.org/drawingml/2006/picture">
+                  <pic:nvPicPr>
+                    <pic:cNvPr id="1257212162" name=""/>
+                    <pic:cNvPicPr/>
+                  </pic:nvPicPr>
+                  <pic:blipFill>
+                    <a:blip r:embed="rId12"/>
+                    <a:stretch>
+                      <a:fillRect/>
+                    </a:stretch>
+                  </pic:blipFill>
+                  <pic:spPr>
+                    <a:xfrm>
+                      <a:off x="0" y="0"/>
+                      <a:ext cx="5731510" cy="1772920"/>
+                    </a:xfrm>
+                    <a:prstGeom prst="rect">
+                      <a:avLst/>
+                    </a:prstGeom>
+                  </pic:spPr>
+                </pic:pic>
+              </a:graphicData>
+            </a:graphic>
+          </wp:inline>
+        </w:drawing>
+      </w:r>
+    </w:p>
+    <w:p>
+      <w:pPr>
+        <w:rPr>
+          <w:rFonts w:ascii="Bahnschrift SemiLight" w:hAnsi="Bahnschrift SemiLight"/>
+        </w:rPr>
+      </w:pPr>
+      <w:r>
+        <w:rPr>
+          <w:rFonts w:ascii="Bahnschrift SemiLight" w:hAnsi="Bahnschrift SemiLight"/>
+        </w:rPr>
+        <w:t xml:space="preserve">The </w:t>
+      </w:r>
+      <w:r>
+        <w:rPr>
+          <w:rFonts w:ascii="Bahnschrift SemiLight" w:hAnsi="Bahnschrift SemiLight"/>
+        </w:rPr>
+        <w:t>individual class</w:t>
+      </w:r>
+      <w:r>
+        <w:rPr>
+          <w:rFonts w:ascii="Bahnschrift SemiLight" w:hAnsi="Bahnschrift SemiLight"/>
+        </w:rPr>
+        <w:t xml:space="preserve"> evaluation reveals variation in the CNN's classification performance</w:t>
+      </w:r>
+      <w:r>
+        <w:rPr>
+          <w:rFonts w:ascii="Bahnschrift SemiLight" w:hAnsi="Bahnschrift SemiLight"/>
+        </w:rPr>
+        <w:t xml:space="preserve"> for each class</w:t>
+      </w:r>
+      <w:r>
+        <w:rPr>
+          <w:rFonts w:ascii="Bahnschrift SemiLight" w:hAnsi="Bahnschrift SemiLight"/>
+        </w:rPr>
+        <w:t xml:space="preserve">. CatFace achieved the highest F1-score of 90.83%, </w:t>
+      </w:r>
+      <w:r>
+        <w:rPr>
+          <w:rFonts w:ascii="Bahnschrift SemiLight" w:hAnsi="Bahnschrift SemiLight"/>
+        </w:rPr>
+        <w:t xml:space="preserve">and a </w:t>
+      </w:r>
+      <w:r>
+        <w:rPr>
+          <w:rFonts w:ascii="Bahnschrift SemiLight" w:hAnsi="Bahnschrift SemiLight"/>
+        </w:rPr>
+        <w:t xml:space="preserve">precision of 94.13% and recall of 87.75%. This </w:t>
+      </w:r>
+      <w:r>
+        <w:rPr>
+          <w:rFonts w:ascii="Bahnschrift SemiLight" w:hAnsi="Bahnschrift SemiLight"/>
+        </w:rPr>
+        <w:t>suggests</w:t>
+      </w:r>
+      <w:r>
+        <w:rPr>
+          <w:rFonts w:ascii="Bahnschrift SemiLight" w:hAnsi="Bahnschrift SemiLight"/>
+        </w:rPr>
+        <w:t xml:space="preserve"> the model can distinguish cat-face images relatively reliably. In contrast, DogNose achieved the lowest F1-score of 56.68% and recall of 44.13%, making it the most difficult class according to these measures.</w:t>
+      </w:r>
+      <w:r>
+        <w:rPr>
+          <w:rFonts w:ascii="Bahnschrift SemiLight" w:hAnsi="Bahnschrift SemiLight"/>
+        </w:rPr>
+        <w:t xml:space="preserve"> </w:t>
+      </w:r>
+      <w:r>
+        <w:rPr>
+          <w:rFonts w:ascii="Bahnschrift SemiLight" w:hAnsi="Bahnschrift SemiLight"/>
+        </w:rPr>
+        <w:t>Checking the table and yes, it indeed has the lowest class accuracy of all 8 target classes.</w:t>
+      </w:r>
+    </w:p>
+    <w:p>
+      <w:pPr>
+        <w:rPr>
+          <w:rFonts w:ascii="Bahnschrift SemiLight" w:hAnsi="Bahnschrift SemiLight"/>
+        </w:rPr>
+      </w:pPr>
+      <w:r>
+        <w:rPr>
+          <w:rFonts w:ascii="Bahnschrift SemiLight" w:hAnsi="Bahnschrift SemiLight"/>
+        </w:rPr>
+        <w:t xml:space="preserve">CatNose also demonstrated relatively low recall at 55.00%. These </w:t>
+      </w:r>
+      <w:r>
+        <w:rPr>
+          <w:rFonts w:ascii="Bahnschrift SemiLight" w:hAnsi="Bahnschrift SemiLight"/>
+        </w:rPr>
+        <w:t>metrics</w:t>
+      </w:r>
+      <w:r>
+        <w:rPr>
+          <w:rFonts w:ascii="Bahnschrift SemiLight" w:hAnsi="Bahnschrift SemiLight"/>
+        </w:rPr>
+        <w:t xml:space="preserve"> indicate</w:t>
+      </w:r>
+      <w:r>
+        <w:rPr>
+          <w:rFonts w:ascii="Bahnschrift SemiLight" w:hAnsi="Bahnschrift SemiLight"/>
+        </w:rPr>
+        <w:t>s</w:t>
+      </w:r>
+      <w:r>
+        <w:rPr>
+          <w:rFonts w:ascii="Bahnschrift SemiLight" w:hAnsi="Bahnschrift SemiLight"/>
+        </w:rPr>
+        <w:t xml:space="preserve"> that a </w:t>
+      </w:r>
+      <w:r>
+        <w:rPr>
+          <w:rFonts w:ascii="Bahnschrift SemiLight" w:hAnsi="Bahnschrift SemiLight"/>
+        </w:rPr>
+        <w:t>large</w:t>
+      </w:r>
+      <w:r>
+        <w:rPr>
+          <w:rFonts w:ascii="Bahnschrift SemiLight" w:hAnsi="Bahnschrift SemiLight"/>
+        </w:rPr>
+        <w:t xml:space="preserve"> proportion of nose images are being assigned to other classes. Conversely, CatMouth and DogMouth achieved recall values of 89.99% and 92.06%, respectively, but had lower precision.</w:t>
+      </w:r>
+      <w:r>
+        <w:rPr>
+          <w:rFonts w:ascii="Bahnschrift SemiLight" w:hAnsi="Bahnschrift SemiLight"/>
+        </w:rPr>
+        <w:t xml:space="preserve"> </w:t>
+      </w:r>
+      <w:r>
+        <w:rPr>
+          <w:rFonts w:ascii="Bahnschrift SemiLight" w:hAnsi="Bahnschrift SemiLight"/>
+        </w:rPr>
+        <w:t>DogMouth</w:t>
+      </w:r>
+      <w:r>
+        <w:rPr>
+          <w:rFonts w:ascii="Bahnschrift SemiLight" w:hAnsi="Bahnschrift SemiLight"/>
+        </w:rPr>
+        <w:t>’s</w:t>
+      </w:r>
+      <w:r>
+        <w:rPr>
+          <w:rFonts w:ascii="Bahnschrift SemiLight" w:hAnsi="Bahnschrift SemiLight"/>
+        </w:rPr>
+        <w:t xml:space="preserve"> precision was 55.64%, suggesting that many predictions assigned to this class were incorrect.</w:t>
+      </w:r>
+    </w:p>
+    <w:p>
+      <w:pPr>
+        <w:rPr>
+          <w:rFonts w:ascii="Bahnschrift SemiLight" w:hAnsi="Bahnschrift SemiLight"/>
+        </w:rPr>
+      </w:pPr>
+      <w:r>
+        <w:rPr>
+          <w:rFonts w:ascii="Bahnschrift SemiLight" w:hAnsi="Bahnschrift SemiLight"/>
+        </w:rPr>
+        <w:t xml:space="preserve">As we can tell by the generated table, the model has an easier time correctly classifying certain images </w:t>
+      </w:r>
+      <w:r>
+        <w:rPr>
+          <w:rFonts w:ascii="Bahnschrift SemiLight" w:hAnsi="Bahnschrift SemiLight"/>
+        </w:rPr>
+        <w:t>than others across all 8 target classes.</w:t>
+      </w:r>
+      <w:r>
+        <w:rPr>
+          <w:rFonts w:ascii="Bahnschrift SemiLight" w:hAnsi="Bahnschrift SemiLight"/>
+        </w:rPr>
+        <w:t xml:space="preserve"> For example, DogMouth with a 92.06% class accuracy meets a high number of correct classifications, compared to DogNose with the lowest at 44.13% it has more than double the number of correct classifications.</w:t>
+      </w:r>
+      <w:r>
+        <w:rPr>
+          <w:rFonts w:ascii="Bahnschrift SemiLight" w:hAnsi="Bahnschrift SemiLight"/>
+        </w:rPr>
+        <w:t xml:space="preserve"> The model’s most difficult classifications were DogNose (44.13%) and CatNose (55.00%), the rest generally got ¾ classifications correct. As for why both difficult class were of Noses I have no current theory nor evidence.</w:t>
+      </w:r>
+    </w:p>
+    <w:p>
+      <w:pPr>
+        <w:rPr>
+          <w:rFonts w:ascii="Bahnschrift SemiLight" w:hAnsi="Bahnschrift SemiLight"/>
+        </w:rPr>
+      </w:pPr>
+      <w:r>
+        <w:rPr>
+          <w:rFonts w:ascii="Bahnschrift SemiLight" w:hAnsi="Bahnschrift SemiLight"/>
+        </w:rPr>
+        <w:t xml:space="preserve">As for why this is, I believe a further examination into </w:t>
+      </w:r>
+      <w:r>
+        <w:rPr>
+          <w:rFonts w:ascii="Bahnschrift SemiLight" w:hAnsi="Bahnschrift SemiLight"/>
+        </w:rPr>
+        <w:t xml:space="preserve">whether these </w:t>
+      </w:r>
+      <w:r>
+        <w:rPr>
+          <w:rFonts w:ascii="Bahnschrift SemiLight" w:hAnsi="Bahnschrift SemiLight"/>
+        </w:rPr>
+        <w:t>variances</w:t>
+      </w:r>
+      <w:r>
+        <w:rPr>
+          <w:rFonts w:ascii="Bahnschrift SemiLight" w:hAnsi="Bahnschrift SemiLight"/>
+        </w:rPr>
+        <w:t xml:space="preserve"> arise from visual similarity, ambiguous crops, image quality, or limitations in the learned features.</w:t>
+      </w:r>
+      <w:r>
+        <w:rPr>
+          <w:rFonts w:ascii="Bahnschrift SemiLight" w:hAnsi="Bahnschrift SemiLight"/>
+        </w:rPr>
+        <w:t xml:space="preserve"> The answer isn’t immediately obvious to me.</w:t>
+      </w:r>
+    </w:p>
+    <w:p>
+      <w:pPr>
+        <w:rPr>
+          <w:rFonts w:ascii="Bahnschrift SemiLight" w:hAnsi="Bahnschrift SemiLight"/>
+        </w:rPr>
+      </w:pPr>
+      <w:r>
+        <w:rPr>
+          <w:rFonts w:ascii="Bahnschrift SemiLight" w:hAnsi="Bahnschrift SemiLight"/>
+        </w:rPr>
+        <w:t>Side note, I had expected CatMouth or CatNose to have the highest class accuracy due to the presence of whiskers in a cat but was proven wrong.</w:t>
+      </w:r>
     </w:p>
     <w:p>
       <w:pPr>
@@ -2855,46 +3271,169 @@
           <w:rFonts w:ascii="Bahnschrift SemiLight" w:hAnsi="Bahnschrift SemiLight"/>
         </w:rPr>
       </w:pPr>
-    </w:p>
-    <w:p>
-      <w:pPr>
-        <w:rPr>
-          <w:rFonts w:ascii="Bahnschrift SemiLight" w:hAnsi="Bahnschrift SemiLight"/>
-        </w:rPr>
-      </w:pPr>
-    </w:p>
-    <w:p>
-      <w:pPr>
-        <w:rPr>
-          <w:rFonts w:ascii="Bahnschrift SemiLight" w:hAnsi="Bahnschrift SemiLight"/>
-        </w:rPr>
-      </w:pPr>
-    </w:p>
-    <w:p>
-      <w:pPr>
-        <w:rPr>
-          <w:rFonts w:ascii="Bahnschrift SemiLight" w:hAnsi="Bahnschrift SemiLight"/>
-        </w:rPr>
-      </w:pPr>
-    </w:p>
-    <w:p>
-      <w:pPr>
-        <w:rPr>
-          <w:rFonts w:ascii="Bahnschrift SemiLight" w:hAnsi="Bahnschrift SemiLight"/>
-        </w:rPr>
-      </w:pPr>
-    </w:p>
-    <w:p>
-      <w:pPr>
-        <w:rPr>
-          <w:rFonts w:ascii="Bahnschrift SemiLight" w:hAnsi="Bahnschrift SemiLight"/>
-        </w:rPr>
-      </w:pPr>
-      <w:r>
-        <w:rPr>
-          <w:rFonts w:ascii="Bahnschrift SemiLight" w:hAnsi="Bahnschrift SemiLight"/>
-        </w:rPr>
-        <w:t>S</w:t>
+      <w:r>
+        <w:rPr>
+          <w:rFonts w:ascii="Bahnschrift SemiLight" w:hAnsi="Bahnschrift SemiLight"/>
+        </w:rPr>
+        <w:t>Huyin Song (25331396)</w:t>
+      </w:r>
+      <w:r>
+        <w:rPr>
+          <w:rFonts w:ascii="Bahnschrift SemiLight" w:hAnsi="Bahnschrift SemiLight"/>
+        </w:rPr>
+        <w:tab/>
+        <w:t>ENGE707</w:t>
+      </w:r>
+      <w:r>
+        <w:rPr>
+          <w:rFonts w:ascii="Bahnschrift SemiLight" w:hAnsi="Bahnschrift SemiLight"/>
+        </w:rPr>
+        <w:tab/>
+      </w:r>
+      <w:r>
+        <w:rPr>
+          <w:rFonts w:ascii="Bahnschrift SemiLight" w:hAnsi="Bahnschrift SemiLight"/>
+        </w:rPr>
+        <w:tab/>
+        <w:t>Kaggle AI Competition Assessment</w:t>
+      </w:r>
+    </w:p>
+    <w:p>
+      <w:pPr>
+        <w:rPr>
+          <w:rFonts w:ascii="Bahnschrift SemiLight" w:hAnsi="Bahnschrift SemiLight"/>
+        </w:rPr>
+      </w:pPr>
+      <w:r>
+        <w:rPr>
+          <w:rFonts w:ascii="Bahnschrift SemiLight" w:hAnsi="Bahnschrift SemiLight"/>
+        </w:rPr>
+        <w:t xml:space="preserve">Kaggle username: </w:t>
+      </w:r>
+      <w:r>
+        <w:rPr>
+          <w:rFonts w:ascii="Bahnschrift SemiLight" w:hAnsi="Bahnschrift SemiLight"/>
+        </w:rPr>
+        <w:t>huyinsong</w:t>
+      </w:r>
+      <w:r>
+        <w:rPr>
+          <w:rFonts w:ascii="Bahnschrift SemiLight" w:hAnsi="Bahnschrift SemiLight"/>
+        </w:rPr>
+        <w:t xml:space="preserve"> (</w:t>
+      </w:r>
+      <w:r>
+        <w:rPr>
+          <w:rFonts w:ascii="Bahnschrift SemiLight" w:hAnsi="Bahnschrift SemiLight"/>
+        </w:rPr>
+        <w:t>Huyin Song</w:t>
+      </w:r>
+      <w:r>
+        <w:rPr>
+          <w:rFonts w:ascii="Bahnschrift SemiLight" w:hAnsi="Bahnschrift SemiLight"/>
+        </w:rPr>
+        <w:t>)</w:t>
+      </w:r>
+    </w:p>
+    <w:p>
+      <w:pPr>
+        <w:rPr>
+          <w:rFonts w:ascii="Bahnschrift SemiLight" w:hAnsi="Bahnschrift SemiLight"/>
+        </w:rPr>
+      </w:pPr>
+    </w:p>
+    <w:p>
+      <w:pPr>
+        <w:rPr>
+          <w:rFonts w:ascii="Bahnschrift SemiLight" w:hAnsi="Bahnschrift SemiLight"/>
+        </w:rPr>
+      </w:pPr>
+      <w:r>
+        <w:rPr>
+          <w:noProof/>
+        </w:rPr>
+        <w:drawing>
+          <wp:inline distT="0" distB="0" distL="0" distR="0" wp14:anchorId="6DA81C02" wp14:editId="7548519A">
+            <wp:extent cx="5731510" cy="2593975"/>
+            <wp:effectExtent l="0" t="0" r="2540" b="0"/>
+            <wp:docPr id="1198429974" name="Picture 1"/>
+            <wp:cNvGraphicFramePr>
+              <a:graphicFrameLocks xmlns:a="http://schemas.openxmlformats.org/drawingml/2006/main" noChangeAspect="1"/>
+            </wp:cNvGraphicFramePr>
+            <a:graphic xmlns:a="http://schemas.openxmlformats.org/drawingml/2006/main">
+              <a:graphicData uri="http://schemas.openxmlformats.org/drawingml/2006/picture">
+                <pic:pic xmlns:pic="http://schemas.openxmlformats.org/drawingml/2006/picture">
+                  <pic:nvPicPr>
+                    <pic:cNvPr id="1915329049" name=""/>
+                    <pic:cNvPicPr/>
+                  </pic:nvPicPr>
+                  <pic:blipFill>
+                    <a:blip r:embed="rId8"/>
+                    <a:stretch>
+                      <a:fillRect/>
+                    </a:stretch>
+                  </pic:blipFill>
+                  <pic:spPr>
+                    <a:xfrm>
+                      <a:off x="0" y="0"/>
+                      <a:ext cx="5731510" cy="2593975"/>
+                    </a:xfrm>
+                    <a:prstGeom prst="rect">
+                      <a:avLst/>
+                    </a:prstGeom>
+                  </pic:spPr>
+                </pic:pic>
+              </a:graphicData>
+            </a:graphic>
+          </wp:inline>
+        </w:drawing>
+      </w:r>
+    </w:p>
+    <w:p>
+      <w:pPr>
+        <w:rPr>
+          <w:rFonts w:ascii="Bahnschrift SemiLight" w:hAnsi="Bahnschrift SemiLight"/>
+        </w:rPr>
+      </w:pPr>
+      <w:r>
+        <w:rPr>
+          <w:noProof/>
+        </w:rPr>
+        <w:drawing>
+          <wp:inline distT="0" distB="0" distL="0" distR="0" wp14:anchorId="198B1018" wp14:editId="24ED7E2B">
+            <wp:extent cx="5731510" cy="351155"/>
+            <wp:effectExtent l="0" t="0" r="2540" b="0"/>
+            <wp:docPr id="1302580540" name="Picture 1"/>
+            <wp:cNvGraphicFramePr>
+              <a:graphicFrameLocks xmlns:a="http://schemas.openxmlformats.org/drawingml/2006/main" noChangeAspect="1"/>
+            </wp:cNvGraphicFramePr>
+            <a:graphic xmlns:a="http://schemas.openxmlformats.org/drawingml/2006/main">
+              <a:graphicData uri="http://schemas.openxmlformats.org/drawingml/2006/picture">
+                <pic:pic xmlns:pic="http://schemas.openxmlformats.org/drawingml/2006/picture">
+                  <pic:nvPicPr>
+                    <pic:cNvPr id="1662937982" name=""/>
+                    <pic:cNvPicPr/>
+                  </pic:nvPicPr>
+                  <pic:blipFill>
+                    <a:blip r:embed="rId9"/>
+                    <a:stretch>
+                      <a:fillRect/>
+                    </a:stretch>
+                  </pic:blipFill>
+                  <pic:spPr>
+                    <a:xfrm>
+                      <a:off x="0" y="0"/>
+                      <a:ext cx="5731510" cy="351155"/>
+                    </a:xfrm>
+                    <a:prstGeom prst="rect">
+                      <a:avLst/>
+                    </a:prstGeom>
+                  </pic:spPr>
+                </pic:pic>
+              </a:graphicData>
+            </a:graphic>
+          </wp:inline>
+        </w:drawing>
       </w:r>
     </w:p>
     <w:sectPr>
@@ -2905,6 +3444,127 @@
     </w:sectPr>
   </w:body>
 </w:document>
+</file>
+
+<file path=word/numbering.xml><?xml version="1.0" encoding="utf-8"?>
+<w:numbering xmlns:wpc="http://schemas.microsoft.com/office/word/2010/wordprocessingCanvas" xmlns:cx="http://schemas.microsoft.com/office/drawing/2014/chartex" xmlns:cx1="http://schemas.microsoft.com/office/drawing/2015/9/8/chartex" xmlns:cx2="http://schemas.microsoft.com/office/drawing/2015/10/21/chartex" xmlns:cx3="http://schemas.microsoft.com/office/drawing/2016/5/9/chartex" xmlns:cx4="http://schemas.microsoft.com/office/drawing/2016/5/10/chartex" xmlns:cx5="http://schemas.microsoft.com/office/drawing/2016/5/11/chartex" xmlns:cx6="http://schemas.microsoft.com/office/drawing/2016/5/12/chartex" xmlns:cx7="http://schemas.microsoft.com/office/drawing/2016/5/13/chartex" xmlns:cx8="http://schemas.microsoft.com/office/drawing/2016/5/14/chartex" xmlns:mc="http://schemas.openxmlformats.org/markup-compatibility/2006" xmlns:aink="http://schemas.microsoft.com/office/drawing/2016/ink" xmlns:am3d="http://schemas.microsoft.com/office/drawing/2017/model3d" xmlns:o="urn:schemas-microsoft-com:office:office" xmlns:oel="http://schemas.microsoft.com/office/2019/extlst" xmlns:r="http://schemas.openxmlformats.org/officeDocument/2006/relationships" xmlns:m="http://schemas.openxmlformats.org/officeDocument/2006/math" xmlns:v="urn:schemas-microsoft-com:vml" xmlns:wp14="http://schemas.microsoft.com/office/word/2010/wordprocessingDrawing" xmlns:wp="http://schemas.openxmlformats.org/drawingml/2006/wordprocessingDrawing" xmlns:w10="urn:schemas-microsoft-com:office:word" xmlns:w="http://schemas.openxmlformats.org/wordprocessingml/2006/main" xmlns:w14="http://schemas.microsoft.com/office/word/2010/wordml" xmlns:w15="http://schemas.microsoft.com/office/word/2012/wordml" xmlns:w16cex="http://schemas.microsoft.com/office/word/2018/wordml/cex" xmlns:w16cid="http://schemas.microsoft.com/office/word/2016/wordml/cid" xmlns:w16="http://schemas.microsoft.com/office/word/2018/wordml" xmlns:w16du="http://schemas.microsoft.com/office/word/2023/wordml/word16du" xmlns:w16sdtdh="http://schemas.microsoft.com/office/word/2020/wordml/sdtdatahash" xmlns:w16sdtfl="http://schemas.microsoft.com/office/word/2024/wordml/sdtformatlock" xmlns:w16se="http://schemas.microsoft.com/office/word/2015/wordml/symex" xmlns:wpg="http://schemas.microsoft.com/office/word/2010/wordprocessingGroup" xmlns:wpi="http://schemas.microsoft.com/office/word/2010/wordprocessingInk" xmlns:wne="http://schemas.microsoft.com/office/word/2006/wordml" xmlns:wps="http://schemas.microsoft.com/office/word/2010/wordprocessingShape" mc:Ignorable="w14 w15 w16se w16cid w16 w16cex w16sdtdh w16sdtfl w16du wp14">
+  <w:abstractNum w:abstractNumId="0" w15:restartNumberingAfterBreak="0">
+    <w:nsid w:val="65BB16A9"/>
+    <w:multiLevelType w:val="hybridMultilevel"/>
+    <w:tmpl w:val="31F29E26"/>
+    <w:lvl w:ilvl="0" w:tplc="14090001">
+      <w:start w:val="1"/>
+      <w:numFmt w:val="bullet"/>
+      <w:lvlText w:val=""/>
+      <w:lvlJc w:val="left"/>
+      <w:pPr>
+        <w:ind w:left="720" w:hanging="360"/>
+      </w:pPr>
+      <w:rPr>
+        <w:rFonts w:ascii="Symbol" w:hAnsi="Symbol" w:hint="default"/>
+      </w:rPr>
+    </w:lvl>
+    <w:lvl w:ilvl="1" w:tplc="14090003" w:tentative="1">
+      <w:start w:val="1"/>
+      <w:numFmt w:val="bullet"/>
+      <w:lvlText w:val="o"/>
+      <w:lvlJc w:val="left"/>
+      <w:pPr>
+        <w:ind w:left="1440" w:hanging="360"/>
+      </w:pPr>
+      <w:rPr>
+        <w:rFonts w:ascii="Courier New" w:hAnsi="Courier New" w:cs="Courier New" w:hint="default"/>
+      </w:rPr>
+    </w:lvl>
+    <w:lvl w:ilvl="2" w:tplc="14090005" w:tentative="1">
+      <w:start w:val="1"/>
+      <w:numFmt w:val="bullet"/>
+      <w:lvlText w:val=""/>
+      <w:lvlJc w:val="left"/>
+      <w:pPr>
+        <w:ind w:left="2160" w:hanging="360"/>
+      </w:pPr>
+      <w:rPr>
+        <w:rFonts w:ascii="Wingdings" w:hAnsi="Wingdings" w:hint="default"/>
+      </w:rPr>
+    </w:lvl>
+    <w:lvl w:ilvl="3" w:tplc="14090001" w:tentative="1">
+      <w:start w:val="1"/>
+      <w:numFmt w:val="bullet"/>
+      <w:lvlText w:val=""/>
+      <w:lvlJc w:val="left"/>
+      <w:pPr>
+        <w:ind w:left="2880" w:hanging="360"/>
+      </w:pPr>
+      <w:rPr>
+        <w:rFonts w:ascii="Symbol" w:hAnsi="Symbol" w:hint="default"/>
+      </w:rPr>
+    </w:lvl>
+    <w:lvl w:ilvl="4" w:tplc="14090003" w:tentative="1">
+      <w:start w:val="1"/>
+      <w:numFmt w:val="bullet"/>
+      <w:lvlText w:val="o"/>
+      <w:lvlJc w:val="left"/>
+      <w:pPr>
+        <w:ind w:left="3600" w:hanging="360"/>
+      </w:pPr>
+      <w:rPr>
+        <w:rFonts w:ascii="Courier New" w:hAnsi="Courier New" w:cs="Courier New" w:hint="default"/>
+      </w:rPr>
+    </w:lvl>
+    <w:lvl w:ilvl="5" w:tplc="14090005" w:tentative="1">
+      <w:start w:val="1"/>
+      <w:numFmt w:val="bullet"/>
+      <w:lvlText w:val=""/>
+      <w:lvlJc w:val="left"/>
+      <w:pPr>
+        <w:ind w:left="4320" w:hanging="360"/>
+      </w:pPr>
+      <w:rPr>
+        <w:rFonts w:ascii="Wingdings" w:hAnsi="Wingdings" w:hint="default"/>
+      </w:rPr>
+    </w:lvl>
+    <w:lvl w:ilvl="6" w:tplc="14090001" w:tentative="1">
+      <w:start w:val="1"/>
+      <w:numFmt w:val="bullet"/>
+      <w:lvlText w:val=""/>
+      <w:lvlJc w:val="left"/>
+      <w:pPr>
+        <w:ind w:left="5040" w:hanging="360"/>
+      </w:pPr>
+      <w:rPr>
+        <w:rFonts w:ascii="Symbol" w:hAnsi="Symbol" w:hint="default"/>
+      </w:rPr>
+    </w:lvl>
+    <w:lvl w:ilvl="7" w:tplc="14090003" w:tentative="1">
+      <w:start w:val="1"/>
+      <w:numFmt w:val="bullet"/>
+      <w:lvlText w:val="o"/>
+      <w:lvlJc w:val="left"/>
+      <w:pPr>
+        <w:ind w:left="5760" w:hanging="360"/>
+      </w:pPr>
+      <w:rPr>
+        <w:rFonts w:ascii="Courier New" w:hAnsi="Courier New" w:cs="Courier New" w:hint="default"/>
+      </w:rPr>
+    </w:lvl>
+    <w:lvl w:ilvl="8" w:tplc="14090005" w:tentative="1">
+      <w:start w:val="1"/>
+      <w:numFmt w:val="bullet"/>
+      <w:lvlText w:val=""/>
+      <w:lvlJc w:val="left"/>
+      <w:pPr>
+        <w:ind w:left="6480" w:hanging="360"/>
+      </w:pPr>
+      <w:rPr>
+        <w:rFonts w:ascii="Wingdings" w:hAnsi="Wingdings" w:hint="default"/>
+      </w:rPr>
+    </w:lvl>
+  </w:abstractNum>
+  <w:num w:numId="1" w16cid:durableId="1909878683">
+    <w:abstractNumId w:val="0"/>
+  </w:num>
+</w:numbering>
 </file>
 
 <file path=word/styles.xml><?xml version="1.0" encoding="utf-8"?>
@@ -3510,7 +4170,6 @@
   <w:style w:type="character" w:default="1" w:styleId="DefaultParagraphFont">
     <w:name w:val="Default Paragraph Font"/>
     <w:uiPriority w:val="1"/>
-    <w:semiHidden/>
     <w:unhideWhenUsed/>
   </w:style>
   <w:style w:type="table" w:default="1" w:styleId="TableNormal">

</xml_diff>

<commit_message>
Finished report + added v2 model, having issues committing, back commit
</commit_message>
<xml_diff>
--- a/Report.docx
+++ b/Report.docx
@@ -53,12 +53,14 @@
         </w:rPr>
         <w:t xml:space="preserve">Kaggle username: </w:t>
       </w:r>
+      <w:proofErr w:type="spellStart"/>
       <w:r>
         <w:rPr>
           <w:rFonts w:ascii="Bahnschrift SemiLight" w:hAnsi="Bahnschrift SemiLight"/>
         </w:rPr>
         <w:t>huyinsong</w:t>
       </w:r>
+      <w:proofErr w:type="spellEnd"/>
       <w:r>
         <w:rPr>
           <w:rFonts w:ascii="Bahnschrift SemiLight" w:hAnsi="Bahnschrift SemiLight"/>
@@ -184,7 +186,21 @@
         <w:rPr>
           <w:rFonts w:ascii="Bahnschrift SemiLight" w:hAnsi="Bahnschrift SemiLight"/>
         </w:rPr>
-        <w:t xml:space="preserve"> ‘image_id’ is a 64-bit integer variable while ‘class’ is a string. This means I will need to encode the class feature into a numerical variable in order for the machine to feasibly use it.</w:t>
+        <w:t xml:space="preserve"> ‘</w:t>
+      </w:r>
+      <w:proofErr w:type="gramStart"/>
+      <w:r>
+        <w:rPr>
+          <w:rFonts w:ascii="Bahnschrift SemiLight" w:hAnsi="Bahnschrift SemiLight"/>
+        </w:rPr>
+        <w:t>image</w:t>
+      </w:r>
+      <w:proofErr w:type="gramEnd"/>
+      <w:r>
+        <w:rPr>
+          <w:rFonts w:ascii="Bahnschrift SemiLight" w:hAnsi="Bahnschrift SemiLight"/>
+        </w:rPr>
+        <w:t>_id’ is a 64-bit integer variable while ‘class’ is a string. This means I will need to encode the class feature into a numerical variable in order for the machine to feasibly use it.</w:t>
       </w:r>
     </w:p>
     <w:p>
@@ -1318,7 +1334,21 @@
         <w:rPr>
           <w:rFonts w:ascii="Bahnschrift SemiLight" w:hAnsi="Bahnschrift SemiLight"/>
         </w:rPr>
-        <w:t xml:space="preserve"> Next it goes to the Activation ReLU function where CNN learns complex patterns of the image that couldn’t be captured with just the Convolutional layer.</w:t>
+        <w:t xml:space="preserve"> Next it goes to the Activation </w:t>
+      </w:r>
+      <w:proofErr w:type="spellStart"/>
+      <w:r>
+        <w:rPr>
+          <w:rFonts w:ascii="Bahnschrift SemiLight" w:hAnsi="Bahnschrift SemiLight"/>
+        </w:rPr>
+        <w:t>ReLU</w:t>
+      </w:r>
+      <w:proofErr w:type="spellEnd"/>
+      <w:r>
+        <w:rPr>
+          <w:rFonts w:ascii="Bahnschrift SemiLight" w:hAnsi="Bahnschrift SemiLight"/>
+        </w:rPr>
+        <w:t xml:space="preserve"> function where CNN learns complex patterns of the image that couldn’t be captured with just the Convolutional layer.</w:t>
       </w:r>
       <w:r>
         <w:rPr>
@@ -1361,7 +1391,21 @@
         <w:rPr>
           <w:rFonts w:ascii="Bahnschrift SemiLight" w:hAnsi="Bahnschrift SemiLight"/>
         </w:rPr>
-        <w:t xml:space="preserve"> target classes as I’ve described in task 1, with ReLU as the activation and prioritizes the index with the highest output score.</w:t>
+        <w:t xml:space="preserve"> target classes as I’ve described in task 1, with </w:t>
+      </w:r>
+      <w:proofErr w:type="spellStart"/>
+      <w:r>
+        <w:rPr>
+          <w:rFonts w:ascii="Bahnschrift SemiLight" w:hAnsi="Bahnschrift SemiLight"/>
+        </w:rPr>
+        <w:t>ReLU</w:t>
+      </w:r>
+      <w:proofErr w:type="spellEnd"/>
+      <w:r>
+        <w:rPr>
+          <w:rFonts w:ascii="Bahnschrift SemiLight" w:hAnsi="Bahnschrift SemiLight"/>
+        </w:rPr>
+        <w:t xml:space="preserve"> as the activation and prioritizes the index with the highest output score.</w:t>
       </w:r>
     </w:p>
     <w:p>
@@ -2405,7 +2449,21 @@
         <w:rPr>
           <w:rFonts w:ascii="Bahnschrift SemiLight" w:hAnsi="Bahnschrift SemiLight"/>
         </w:rPr>
-        <w:t>These metrics I took primarily of the weighted average as this variant of the metrics averages the class metrics while also accounting for the number of validation image cases in each class. This generates a slightly more fair metric when classes are imbalanced in representation (which applies to the classes present in this project).</w:t>
+        <w:t xml:space="preserve">These metrics I took primarily of the weighted average as this variant of the metrics averages the class metrics while also accounting for the number of validation image cases in each class. This generates a slightly </w:t>
+      </w:r>
+      <w:proofErr w:type="gramStart"/>
+      <w:r>
+        <w:rPr>
+          <w:rFonts w:ascii="Bahnschrift SemiLight" w:hAnsi="Bahnschrift SemiLight"/>
+        </w:rPr>
+        <w:t>more fair</w:t>
+      </w:r>
+      <w:proofErr w:type="gramEnd"/>
+      <w:r>
+        <w:rPr>
+          <w:rFonts w:ascii="Bahnschrift SemiLight" w:hAnsi="Bahnschrift SemiLight"/>
+        </w:rPr>
+        <w:t xml:space="preserve"> metric when classes are imbalanced in representation (which applies to the classes present in this project).</w:t>
       </w:r>
     </w:p>
     <w:p>
@@ -2467,32 +2525,6 @@
         <w:rPr>
           <w:rFonts w:ascii="Bahnschrift SemiLight" w:hAnsi="Bahnschrift SemiLight"/>
         </w:rPr>
-        <w:t>This confusion matrix was also generated by the code for the mode.</w:t>
-      </w:r>
-    </w:p>
-    <w:p>
-      <w:pPr>
-        <w:rPr>
-          <w:rFonts w:ascii="Bahnschrift SemiLight" w:hAnsi="Bahnschrift SemiLight"/>
-        </w:rPr>
-      </w:pPr>
-      <w:r>
-        <w:rPr>
-          <w:rFonts w:ascii="Bahnschrift SemiLight" w:hAnsi="Bahnschrift SemiLight"/>
-        </w:rPr>
-        <w:t>A confusion matrix is useful because it can tell us the performance of each class individually portrayed in an easy to consume way.</w:t>
-      </w:r>
-    </w:p>
-    <w:p>
-      <w:pPr>
-        <w:rPr>
-          <w:rFonts w:ascii="Bahnschrift SemiLight" w:hAnsi="Bahnschrift SemiLight"/>
-        </w:rPr>
-      </w:pPr>
-      <w:r>
-        <w:rPr>
-          <w:rFonts w:ascii="Bahnschrift SemiLight" w:hAnsi="Bahnschrift SemiLight"/>
-        </w:rPr>
         <w:t xml:space="preserve">The class with the </w:t>
       </w:r>
       <w:r>
@@ -2549,32 +2581,19 @@
         <w:rPr>
           <w:rFonts w:ascii="Bahnschrift SemiLight" w:hAnsi="Bahnschrift SemiLight"/>
         </w:rPr>
-        <w:t>One important thing to note, ‘best’ and ‘worst’ depends on the definition, and for the above I used the general across the board metrics to define them as best or worst. For the purpose of the assessment ‘best’ would refer to the highest accuracy score ignoring all else.</w:t>
-      </w:r>
-    </w:p>
-    <w:p>
-      <w:pPr>
-        <w:rPr>
-          <w:rFonts w:ascii="Bahnschrift SemiLight" w:hAnsi="Bahnschrift SemiLight"/>
-        </w:rPr>
-      </w:pPr>
-      <w:r>
-        <w:rPr>
-          <w:rFonts w:ascii="Bahnschrift SemiLight" w:hAnsi="Bahnschrift SemiLight"/>
-        </w:rPr>
-        <w:t xml:space="preserve">The colouring displays the population of the </w:t>
-      </w:r>
-      <w:r>
-        <w:rPr>
-          <w:rFonts w:ascii="Bahnschrift SemiLight" w:hAnsi="Bahnschrift SemiLight"/>
-        </w:rPr>
-        <w:t>class;</w:t>
-      </w:r>
-      <w:r>
-        <w:rPr>
-          <w:rFonts w:ascii="Bahnschrift SemiLight" w:hAnsi="Bahnschrift SemiLight"/>
-        </w:rPr>
-        <w:t xml:space="preserve"> deeper darker coloured tiles have a higher population than lighter coloured tiles.</w:t>
+        <w:t>However,</w:t>
+      </w:r>
+      <w:r>
+        <w:rPr>
+          <w:rFonts w:ascii="Bahnschrift SemiLight" w:hAnsi="Bahnschrift SemiLight"/>
+        </w:rPr>
+        <w:t xml:space="preserve"> ‘best’ and ‘worst’ depends on the definition, and for the above I used the general across the board metrics to define them as best or worst.</w:t>
+      </w:r>
+      <w:r>
+        <w:rPr>
+          <w:rFonts w:ascii="Bahnschrift SemiLight" w:hAnsi="Bahnschrift SemiLight"/>
+        </w:rPr>
+        <w:t xml:space="preserve"> For this project, ‘best’ would mean highest accuracy, so we can ignore the above.</w:t>
       </w:r>
     </w:p>
     <w:p>
@@ -2626,50 +2645,52 @@
         <w:rPr>
           <w:rFonts w:ascii="Bahnschrift SemiLight" w:hAnsi="Bahnschrift SemiLight"/>
         </w:rPr>
+        <w:t xml:space="preserve">Another thing to mention, the score I received on Kaggle generally reflects the accuracy of my model to a good degree. However, it should be noted that different databases and image sets introduces variance always. The metrics the model scores on </w:t>
+      </w:r>
+      <w:r>
+        <w:rPr>
+          <w:rFonts w:ascii="Bahnschrift SemiLight" w:hAnsi="Bahnschrift SemiLight"/>
+        </w:rPr>
+        <w:t>this</w:t>
+      </w:r>
+      <w:r>
+        <w:rPr>
+          <w:rFonts w:ascii="Bahnschrift SemiLight" w:hAnsi="Bahnschrift SemiLight"/>
+        </w:rPr>
+        <w:t xml:space="preserve"> training image set may not always mean it will translate well into another image set. Generalisation techniques like horizontal flipping and slightly rotating the images helps but cannot </w:t>
+      </w:r>
+      <w:r>
+        <w:rPr>
+          <w:rFonts w:ascii="Bahnschrift SemiLight" w:hAnsi="Bahnschrift SemiLight"/>
+        </w:rPr>
+        <w:t xml:space="preserve">provide the guarantee that the model will do well in all </w:t>
+      </w:r>
+      <w:proofErr w:type="gramStart"/>
+      <w:r>
+        <w:rPr>
+          <w:rFonts w:ascii="Bahnschrift SemiLight" w:hAnsi="Bahnschrift SemiLight"/>
+        </w:rPr>
+        <w:t>image</w:t>
+      </w:r>
+      <w:proofErr w:type="gramEnd"/>
+      <w:r>
+        <w:rPr>
+          <w:rFonts w:ascii="Bahnschrift SemiLight" w:hAnsi="Bahnschrift SemiLight"/>
+        </w:rPr>
+        <w:t xml:space="preserve"> sets due to how fundamentally the machine learns.</w:t>
+      </w:r>
+    </w:p>
+    <w:p>
+      <w:pPr>
+        <w:rPr>
+          <w:rFonts w:ascii="Bahnschrift SemiLight" w:hAnsi="Bahnschrift SemiLight"/>
+        </w:rPr>
+      </w:pPr>
+      <w:r>
+        <w:rPr>
+          <w:rFonts w:ascii="Bahnschrift SemiLight" w:hAnsi="Bahnschrift SemiLight"/>
+        </w:rPr>
         <w:lastRenderedPageBreak/>
-        <w:t xml:space="preserve">Another thing to mention, the score I received on Kaggle generally reflects the accuracy of my model to a good degree. However, it should be noted that different databases and image sets introduces variance always. The metrics the model scores on </w:t>
-      </w:r>
-      <w:r>
-        <w:rPr>
-          <w:rFonts w:ascii="Bahnschrift SemiLight" w:hAnsi="Bahnschrift SemiLight"/>
-        </w:rPr>
-        <w:t>this</w:t>
-      </w:r>
-      <w:r>
-        <w:rPr>
-          <w:rFonts w:ascii="Bahnschrift SemiLight" w:hAnsi="Bahnschrift SemiLight"/>
-        </w:rPr>
-        <w:t xml:space="preserve"> training image set may not always mean it will translate well into another image set. Generalisation techniques like horizontal flipping and slightly rotating the images helps but cannot </w:t>
-      </w:r>
-      <w:r>
-        <w:rPr>
-          <w:rFonts w:ascii="Bahnschrift SemiLight" w:hAnsi="Bahnschrift SemiLight"/>
-        </w:rPr>
-        <w:t xml:space="preserve">provide the guarantee that the model will do well in all </w:t>
-      </w:r>
-      <w:r>
-        <w:rPr>
-          <w:rFonts w:ascii="Bahnschrift SemiLight" w:hAnsi="Bahnschrift SemiLight"/>
-        </w:rPr>
-        <w:t>image</w:t>
-      </w:r>
-      <w:r>
-        <w:rPr>
-          <w:rFonts w:ascii="Bahnschrift SemiLight" w:hAnsi="Bahnschrift SemiLight"/>
-        </w:rPr>
-        <w:t xml:space="preserve"> sets due to how fundamentally the machine learns.</w:t>
-      </w:r>
-    </w:p>
-    <w:p>
-      <w:pPr>
-        <w:rPr>
-          <w:rFonts w:ascii="Bahnschrift SemiLight" w:hAnsi="Bahnschrift SemiLight"/>
-        </w:rPr>
-      </w:pPr>
-      <w:r>
-        <w:rPr>
-          <w:rFonts w:ascii="Bahnschrift SemiLight" w:hAnsi="Bahnschrift SemiLight"/>
-        </w:rPr>
         <w:t>Using the Kaggle submission as an example, perhaps there is a little variation between the test image set and the training image set which will cause a mismatch of metrics.</w:t>
       </w:r>
       <w:r>
@@ -2840,13 +2861,7 @@
         <w:rPr>
           <w:rFonts w:ascii="Bahnschrift SemiLight" w:hAnsi="Bahnschrift SemiLight"/>
         </w:rPr>
-        <w:t>With the generated validation accuracy of 74.91% g</w:t>
-      </w:r>
-      <w:r>
-        <w:rPr>
-          <w:rFonts w:ascii="Bahnschrift SemiLight" w:hAnsi="Bahnschrift SemiLight"/>
-        </w:rPr>
-        <w:t>iven the 29,443 images in the test image set we can roughly expect 22,055 images to be correctly classified into their respective classes, it’s decent but far from impressive nor useful enough.</w:t>
+        <w:t>With the generated validation accuracy of 74.91% given the 29,443 images in the test image set we can roughly expect 22,055 images to be correctly classified into their respective classes, it’s decent but far from impressive nor useful enough.</w:t>
       </w:r>
     </w:p>
     <w:p>
@@ -3148,44 +3163,40 @@
         <w:rPr>
           <w:rFonts w:ascii="Bahnschrift SemiLight" w:hAnsi="Bahnschrift SemiLight"/>
         </w:rPr>
-        <w:t xml:space="preserve"> The model’s most difficult classifications were DogNose (44.13%) and CatNose (55.00%), the rest generally got ¾ classifications correct. As for why both difficult class were of Noses I have no current theory nor evidence.</w:t>
-      </w:r>
-    </w:p>
-    <w:p>
-      <w:pPr>
-        <w:rPr>
-          <w:rFonts w:ascii="Bahnschrift SemiLight" w:hAnsi="Bahnschrift SemiLight"/>
-        </w:rPr>
-      </w:pPr>
-      <w:r>
-        <w:rPr>
-          <w:rFonts w:ascii="Bahnschrift SemiLight" w:hAnsi="Bahnschrift SemiLight"/>
-        </w:rPr>
-        <w:t xml:space="preserve">As for why this is, I believe a further examination into </w:t>
-      </w:r>
-      <w:r>
-        <w:rPr>
-          <w:rFonts w:ascii="Bahnschrift SemiLight" w:hAnsi="Bahnschrift SemiLight"/>
-        </w:rPr>
-        <w:t xml:space="preserve">whether these </w:t>
-      </w:r>
-      <w:r>
-        <w:rPr>
-          <w:rFonts w:ascii="Bahnschrift SemiLight" w:hAnsi="Bahnschrift SemiLight"/>
-        </w:rPr>
-        <w:t>variances</w:t>
-      </w:r>
-      <w:r>
-        <w:rPr>
-          <w:rFonts w:ascii="Bahnschrift SemiLight" w:hAnsi="Bahnschrift SemiLight"/>
-        </w:rPr>
-        <w:t xml:space="preserve"> arise from visual similarity, ambiguous crops, image quality, or limitations in the learned features.</w:t>
-      </w:r>
-      <w:r>
-        <w:rPr>
-          <w:rFonts w:ascii="Bahnschrift SemiLight" w:hAnsi="Bahnschrift SemiLight"/>
-        </w:rPr>
-        <w:t xml:space="preserve"> The answer isn’t immediately obvious to me.</w:t>
+        <w:t xml:space="preserve"> The model’s most difficult classifications were DogNose (44.13%) and CatNose (55.00%), the rest generally got ¾ classifications correct. As for why both difficult class were of </w:t>
+      </w:r>
+      <w:proofErr w:type="gramStart"/>
+      <w:r>
+        <w:rPr>
+          <w:rFonts w:ascii="Bahnschrift SemiLight" w:hAnsi="Bahnschrift SemiLight"/>
+        </w:rPr>
+        <w:t>Noses</w:t>
+      </w:r>
+      <w:proofErr w:type="gramEnd"/>
+      <w:r>
+        <w:rPr>
+          <w:rFonts w:ascii="Bahnschrift SemiLight" w:hAnsi="Bahnschrift SemiLight"/>
+        </w:rPr>
+        <w:t xml:space="preserve"> I have no current theory nor evidence.</w:t>
+      </w:r>
+    </w:p>
+    <w:p>
+      <w:pPr>
+        <w:rPr>
+          <w:rFonts w:ascii="Bahnschrift SemiLight" w:hAnsi="Bahnschrift SemiLight"/>
+        </w:rPr>
+      </w:pPr>
+      <w:r>
+        <w:rPr>
+          <w:rFonts w:ascii="Bahnschrift SemiLight" w:hAnsi="Bahnschrift SemiLight"/>
+        </w:rPr>
+        <w:t xml:space="preserve">As for limitations on the performance of the model, </w:t>
+      </w:r>
+      <w:r>
+        <w:rPr>
+          <w:rFonts w:ascii="Bahnschrift SemiLight" w:hAnsi="Bahnschrift SemiLight"/>
+        </w:rPr>
+        <w:t>I believe it to be the mix of all factors. For example, a not large enough image size, or a not as powerful optimizer, perhaps the generalisation wasn’t as effective as I had thought?</w:t>
       </w:r>
     </w:p>
     <w:p>
@@ -3207,6 +3218,365 @@
           <w:rFonts w:ascii="Bahnschrift SemiLight" w:hAnsi="Bahnschrift SemiLight"/>
         </w:rPr>
       </w:pPr>
+    </w:p>
+    <w:p>
+      <w:pPr>
+        <w:rPr>
+          <w:rFonts w:ascii="Bahnschrift SemiLight" w:hAnsi="Bahnschrift SemiLight"/>
+        </w:rPr>
+      </w:pPr>
+    </w:p>
+    <w:p>
+      <w:pPr>
+        <w:rPr>
+          <w:rFonts w:ascii="Bahnschrift SemiLight" w:hAnsi="Bahnschrift SemiLight"/>
+        </w:rPr>
+      </w:pPr>
+    </w:p>
+    <w:p>
+      <w:pPr>
+        <w:rPr>
+          <w:rFonts w:ascii="Bahnschrift SemiLight" w:hAnsi="Bahnschrift SemiLight"/>
+        </w:rPr>
+      </w:pPr>
+      <w:r>
+        <w:rPr>
+          <w:rFonts w:ascii="Bahnschrift SemiLight" w:hAnsi="Bahnschrift SemiLight"/>
+        </w:rPr>
+        <w:lastRenderedPageBreak/>
+        <w:t>To these issues I propose to change and optimize nearly every arbitrary model decision I have chosen so far using this custom CNN with ADAM as a benchmark.</w:t>
+      </w:r>
+    </w:p>
+    <w:p>
+      <w:pPr>
+        <w:rPr>
+          <w:rFonts w:ascii="Bahnschrift SemiLight" w:hAnsi="Bahnschrift SemiLight"/>
+        </w:rPr>
+      </w:pPr>
+      <w:r>
+        <w:rPr>
+          <w:rFonts w:ascii="Bahnschrift SemiLight" w:hAnsi="Bahnschrift SemiLight"/>
+        </w:rPr>
+        <w:t>For example, custom CNNs like these are flexible because they can apply to whatever you need, but they don’t specialize in one area as I need. A heavier fine tuned model would suit a specific need better, so perhaps one that has been pretrained on what I need.</w:t>
+      </w:r>
+    </w:p>
+    <w:p>
+      <w:pPr>
+        <w:rPr>
+          <w:rFonts w:ascii="Bahnschrift SemiLight" w:hAnsi="Bahnschrift SemiLight"/>
+        </w:rPr>
+      </w:pPr>
+      <w:r>
+        <w:rPr>
+          <w:rFonts w:ascii="Bahnschrift SemiLight" w:hAnsi="Bahnschrift SemiLight"/>
+        </w:rPr>
+        <w:t>As for inputs certain features on pets can sometimes be a little unclear, perhaps a larger image size could convey finer details than my 128px could.</w:t>
+      </w:r>
+    </w:p>
+    <w:p>
+      <w:pPr>
+        <w:rPr>
+          <w:rFonts w:ascii="Bahnschrift SemiLight" w:hAnsi="Bahnschrift SemiLight"/>
+        </w:rPr>
+      </w:pPr>
+      <w:r>
+        <w:rPr>
+          <w:rFonts w:ascii="Bahnschrift SemiLight" w:hAnsi="Bahnschrift SemiLight"/>
+        </w:rPr>
+        <w:t>Again, a pretrained optimizer would potentially perform better as they would excel in exactly what I need.</w:t>
+      </w:r>
+    </w:p>
+    <w:p>
+      <w:pPr>
+        <w:rPr>
+          <w:rFonts w:ascii="Bahnschrift SemiLight" w:hAnsi="Bahnschrift SemiLight"/>
+        </w:rPr>
+      </w:pPr>
+      <w:r>
+        <w:rPr>
+          <w:rFonts w:ascii="Bahnschrift SemiLight" w:hAnsi="Bahnschrift SemiLight"/>
+        </w:rPr>
+        <w:t>Augmentations could be stronger and ‘weirder’. Crops, flips, colour changes, and more could generalize the model much more than a simple flip and rotate could.</w:t>
+      </w:r>
+    </w:p>
+    <w:p>
+      <w:pPr>
+        <w:rPr>
+          <w:rFonts w:ascii="Bahnschrift SemiLight" w:hAnsi="Bahnschrift SemiLight"/>
+        </w:rPr>
+      </w:pPr>
+      <w:r>
+        <w:rPr>
+          <w:rFonts w:ascii="Bahnschrift SemiLight" w:hAnsi="Bahnschrift SemiLight"/>
+        </w:rPr>
+        <w:t>More epochs would be a simple way of generating a slightly better result with the same model, I could perhaps raise the number a little.</w:t>
+      </w:r>
+    </w:p>
+    <w:p>
+      <w:pPr>
+        <w:rPr>
+          <w:rFonts w:ascii="Bahnschrift SemiLight" w:hAnsi="Bahnschrift SemiLight"/>
+        </w:rPr>
+      </w:pPr>
+    </w:p>
+    <w:p>
+      <w:pPr>
+        <w:rPr>
+          <w:rFonts w:ascii="Bahnschrift SemiLight" w:hAnsi="Bahnschrift SemiLight"/>
+        </w:rPr>
+      </w:pPr>
+      <w:r>
+        <w:rPr>
+          <w:rFonts w:ascii="Bahnschrift SemiLight" w:hAnsi="Bahnschrift SemiLight"/>
+        </w:rPr>
+        <w:t xml:space="preserve">To these considerations I have decided to go with a more pretrained model that is finer tuned towards what I need exactly. </w:t>
+      </w:r>
+    </w:p>
+    <w:p>
+      <w:pPr>
+        <w:rPr>
+          <w:rFonts w:ascii="Bahnschrift SemiLight" w:hAnsi="Bahnschrift SemiLight"/>
+        </w:rPr>
+      </w:pPr>
+      <w:r>
+        <w:rPr>
+          <w:rFonts w:ascii="Bahnschrift SemiLight" w:hAnsi="Bahnschrift SemiLight"/>
+        </w:rPr>
+        <w:t>I went with a ‘</w:t>
+      </w:r>
+      <w:proofErr w:type="spellStart"/>
+      <w:r>
+        <w:rPr>
+          <w:rFonts w:ascii="Bahnschrift SemiLight" w:hAnsi="Bahnschrift SemiLight"/>
+        </w:rPr>
+        <w:t>ConvNeXt</w:t>
+      </w:r>
+      <w:proofErr w:type="spellEnd"/>
+      <w:r>
+        <w:rPr>
+          <w:rFonts w:ascii="Bahnschrift SemiLight" w:hAnsi="Bahnschrift SemiLight"/>
+        </w:rPr>
+        <w:t>’ model that was pretrained on already pretrained images (allowed by project rules) and resized images to 160</w:t>
+      </w:r>
+      <w:r>
+        <w:rPr>
+          <w:rFonts w:ascii="Bahnschrift SemiLight" w:hAnsi="Bahnschrift SemiLight"/>
+        </w:rPr>
+        <w:t xml:space="preserve"> x 160</w:t>
+      </w:r>
+      <w:r>
+        <w:rPr>
+          <w:rFonts w:ascii="Bahnschrift SemiLight" w:hAnsi="Bahnschrift SemiLight"/>
+        </w:rPr>
+        <w:t xml:space="preserve">px. </w:t>
+      </w:r>
+      <w:r>
+        <w:rPr>
+          <w:rFonts w:ascii="Bahnschrift SemiLight" w:hAnsi="Bahnschrift SemiLight"/>
+        </w:rPr>
+        <w:t>Next,</w:t>
+      </w:r>
+      <w:r>
+        <w:rPr>
+          <w:rFonts w:ascii="Bahnschrift SemiLight" w:hAnsi="Bahnschrift SemiLight"/>
+        </w:rPr>
+        <w:t xml:space="preserve"> I used a </w:t>
+      </w:r>
+      <w:proofErr w:type="spellStart"/>
+      <w:r>
+        <w:rPr>
+          <w:rFonts w:ascii="Bahnschrift SemiLight" w:hAnsi="Bahnschrift SemiLight"/>
+        </w:rPr>
+        <w:t>AdamW</w:t>
+      </w:r>
+      <w:proofErr w:type="spellEnd"/>
+      <w:r>
+        <w:rPr>
+          <w:rFonts w:ascii="Bahnschrift SemiLight" w:hAnsi="Bahnschrift SemiLight"/>
+        </w:rPr>
+        <w:t xml:space="preserve"> optimizer with a weight decay of 0.05 hoping it would generate a better result.</w:t>
+      </w:r>
+    </w:p>
+    <w:p>
+      <w:pPr>
+        <w:rPr>
+          <w:rFonts w:ascii="Bahnschrift SemiLight" w:hAnsi="Bahnschrift SemiLight"/>
+        </w:rPr>
+      </w:pPr>
+      <w:r>
+        <w:rPr>
+          <w:rFonts w:ascii="Bahnschrift SemiLight" w:hAnsi="Bahnschrift SemiLight"/>
+        </w:rPr>
+        <w:t>As for augmentations; crop has been added as well as flips as usual and a little colour changing</w:t>
+      </w:r>
+      <w:r>
+        <w:rPr>
+          <w:rFonts w:ascii="Bahnschrift SemiLight" w:hAnsi="Bahnschrift SemiLight"/>
+        </w:rPr>
+        <w:t xml:space="preserve"> in random.</w:t>
+      </w:r>
+    </w:p>
+    <w:p>
+      <w:pPr>
+        <w:rPr>
+          <w:rFonts w:ascii="Bahnschrift SemiLight" w:hAnsi="Bahnschrift SemiLight"/>
+        </w:rPr>
+      </w:pPr>
+      <w:r>
+        <w:rPr>
+          <w:rFonts w:ascii="Bahnschrift SemiLight" w:hAnsi="Bahnschrift SemiLight"/>
+        </w:rPr>
+        <w:t>The number of epochs has also been increased from 10 to 15 passes, which on my RTX 3070 took roughly 32 minutes</w:t>
+      </w:r>
+      <w:r>
+        <w:rPr>
+          <w:rFonts w:ascii="Bahnschrift SemiLight" w:hAnsi="Bahnschrift SemiLight"/>
+        </w:rPr>
+        <w:t xml:space="preserve"> but will provide slightly better checkpoints</w:t>
+      </w:r>
+      <w:r>
+        <w:rPr>
+          <w:rFonts w:ascii="Bahnschrift SemiLight" w:hAnsi="Bahnschrift SemiLight"/>
+        </w:rPr>
+        <w:t xml:space="preserve"> for accuracy.</w:t>
+      </w:r>
+    </w:p>
+    <w:p>
+      <w:pPr>
+        <w:rPr>
+          <w:rFonts w:ascii="Bahnschrift SemiLight" w:hAnsi="Bahnschrift SemiLight"/>
+        </w:rPr>
+      </w:pPr>
+      <w:r>
+        <w:rPr>
+          <w:rFonts w:ascii="Bahnschrift SemiLight" w:hAnsi="Bahnschrift SemiLight"/>
+        </w:rPr>
+        <w:t xml:space="preserve">The 80/20 split can </w:t>
+      </w:r>
+      <w:r>
+        <w:rPr>
+          <w:rFonts w:ascii="Bahnschrift SemiLight" w:hAnsi="Bahnschrift SemiLight"/>
+        </w:rPr>
+        <w:t>stay;</w:t>
+      </w:r>
+      <w:r>
+        <w:rPr>
+          <w:rFonts w:ascii="Bahnschrift SemiLight" w:hAnsi="Bahnschrift SemiLight"/>
+        </w:rPr>
+        <w:t xml:space="preserve"> it makes sense for the application</w:t>
+      </w:r>
+      <w:r>
+        <w:rPr>
+          <w:rFonts w:ascii="Bahnschrift SemiLight" w:hAnsi="Bahnschrift SemiLight"/>
+        </w:rPr>
+        <w:t xml:space="preserve"> as we’re focusing on as much data as we can without messing up validation.</w:t>
+      </w:r>
+    </w:p>
+    <w:p>
+      <w:pPr>
+        <w:rPr>
+          <w:rFonts w:ascii="Bahnschrift SemiLight" w:hAnsi="Bahnschrift SemiLight"/>
+        </w:rPr>
+      </w:pPr>
+      <w:r>
+        <w:rPr>
+          <w:noProof/>
+        </w:rPr>
+        <w:drawing>
+          <wp:inline distT="0" distB="0" distL="0" distR="0" wp14:anchorId="71619D07" wp14:editId="05E9368C">
+            <wp:extent cx="5731510" cy="1410335"/>
+            <wp:effectExtent l="0" t="0" r="2540" b="0"/>
+            <wp:docPr id="781195053" name="Picture 1"/>
+            <wp:cNvGraphicFramePr>
+              <a:graphicFrameLocks xmlns:a="http://schemas.openxmlformats.org/drawingml/2006/main" noChangeAspect="1"/>
+            </wp:cNvGraphicFramePr>
+            <a:graphic xmlns:a="http://schemas.openxmlformats.org/drawingml/2006/main">
+              <a:graphicData uri="http://schemas.openxmlformats.org/drawingml/2006/picture">
+                <pic:pic xmlns:pic="http://schemas.openxmlformats.org/drawingml/2006/picture">
+                  <pic:nvPicPr>
+                    <pic:cNvPr id="781195053" name=""/>
+                    <pic:cNvPicPr/>
+                  </pic:nvPicPr>
+                  <pic:blipFill>
+                    <a:blip r:embed="rId13"/>
+                    <a:stretch>
+                      <a:fillRect/>
+                    </a:stretch>
+                  </pic:blipFill>
+                  <pic:spPr>
+                    <a:xfrm>
+                      <a:off x="0" y="0"/>
+                      <a:ext cx="5731510" cy="1410335"/>
+                    </a:xfrm>
+                    <a:prstGeom prst="rect">
+                      <a:avLst/>
+                    </a:prstGeom>
+                  </pic:spPr>
+                </pic:pic>
+              </a:graphicData>
+            </a:graphic>
+          </wp:inline>
+        </w:drawing>
+      </w:r>
+    </w:p>
+    <w:p>
+      <w:pPr>
+        <w:rPr>
+          <w:rFonts w:ascii="Bahnschrift SemiLight" w:hAnsi="Bahnschrift SemiLight"/>
+        </w:rPr>
+      </w:pPr>
+      <w:r>
+        <w:rPr>
+          <w:rFonts w:ascii="Bahnschrift SemiLight" w:hAnsi="Bahnschrift SemiLight"/>
+        </w:rPr>
+        <w:lastRenderedPageBreak/>
+        <w:t>As the result my model has benchmarked a relatively high Kaggle competition score, I attribute this advantage to the pre-trained architecture and optimizer.</w:t>
+      </w:r>
+    </w:p>
+    <w:p>
+      <w:pPr>
+        <w:rPr>
+          <w:rFonts w:ascii="Bahnschrift SemiLight" w:hAnsi="Bahnschrift SemiLight"/>
+        </w:rPr>
+      </w:pPr>
+    </w:p>
+    <w:p>
+      <w:pPr>
+        <w:rPr>
+          <w:rFonts w:ascii="Bahnschrift SemiLight" w:hAnsi="Bahnschrift SemiLight"/>
+        </w:rPr>
+      </w:pPr>
+      <w:r>
+        <w:rPr>
+          <w:rFonts w:ascii="Bahnschrift SemiLight" w:hAnsi="Bahnschrift SemiLight"/>
+        </w:rPr>
+        <w:t>The strengths of this new v2 model is how it can benefit from previously pre-trained patterns and visual features, it’s like having more data</w:t>
+      </w:r>
+      <w:r>
+        <w:rPr>
+          <w:rFonts w:ascii="Bahnschrift SemiLight" w:hAnsi="Bahnschrift SemiLight"/>
+        </w:rPr>
+        <w:t xml:space="preserve"> to learn from.</w:t>
+      </w:r>
+      <w:r>
+        <w:rPr>
+          <w:rFonts w:ascii="Bahnschrift SemiLight" w:hAnsi="Bahnschrift SemiLight"/>
+        </w:rPr>
+        <w:t xml:space="preserve"> The higher image quality as well as stronger augmentations enables a higher generalization enabling a good transition from training and evaluation to application.</w:t>
+      </w:r>
+    </w:p>
+    <w:p>
+      <w:pPr>
+        <w:rPr>
+          <w:rFonts w:ascii="Bahnschrift SemiLight" w:hAnsi="Bahnschrift SemiLight"/>
+        </w:rPr>
+      </w:pPr>
+      <w:r>
+        <w:rPr>
+          <w:rFonts w:ascii="Bahnschrift SemiLight" w:hAnsi="Bahnschrift SemiLight"/>
+        </w:rPr>
+        <w:t xml:space="preserve">As for weaknesses, the v2 model definitely eats more resources and memory. Sometimes random cropping and colour adjustments may also change useful features which can hurt performance. </w:t>
+      </w:r>
     </w:p>
     <w:p>
       <w:pPr>
@@ -3310,12 +3680,14 @@
         </w:rPr>
         <w:t xml:space="preserve">Kaggle username: </w:t>
       </w:r>
+      <w:proofErr w:type="spellStart"/>
       <w:r>
         <w:rPr>
           <w:rFonts w:ascii="Bahnschrift SemiLight" w:hAnsi="Bahnschrift SemiLight"/>
         </w:rPr>
         <w:t>huyinsong</w:t>
       </w:r>
+      <w:proofErr w:type="spellEnd"/>
       <w:r>
         <w:rPr>
           <w:rFonts w:ascii="Bahnschrift SemiLight" w:hAnsi="Bahnschrift SemiLight"/>
@@ -4170,6 +4542,7 @@
   <w:style w:type="character" w:default="1" w:styleId="DefaultParagraphFont">
     <w:name w:val="Default Paragraph Font"/>
     <w:uiPriority w:val="1"/>
+    <w:semiHidden/>
     <w:unhideWhenUsed/>
   </w:style>
   <w:style w:type="table" w:default="1" w:styleId="TableNormal">

</xml_diff>